<commit_message>
fix(tcc): titulação do autor na folha de rosto
Estava um chute ('Bacharel em Sistemas de Informação'). Passa a 'Especialista
em Finanças, Controladoria e Auditoria': a norma pede a titulação no singular e,
entre as do autor, a especialização é a mais alta.

Co-Authored-By: Claude Opus 5 (1M context) <noreply@anthropic.com>
</commit_message>
<xml_diff>
--- a/entregaveis/TCC_Ricardo_Calheiros_MBA_USP_Esalq.docx
+++ b/entregaveis/TCC_Ricardo_Calheiros_MBA_USP_Esalq.docx
@@ -65,13 +65,13 @@
         <w:t xml:space="preserve"> </w:t>
       </w:r>
       <w:r>
-        <w:t xml:space="preserve">Bacharel em Sistemas de Informação. E-mail autor</w:t>
-      </w:r>
-      <w:r>
-        <w:t xml:space="preserve"> </w:t>
-      </w:r>
-      <w:r>
-        <w:t xml:space="preserve">correspondente: rickinrj@gmail.com</w:t>
+        <w:t xml:space="preserve">Especialista em Finanças, Controladoria e Auditoria.</w:t>
+      </w:r>
+      <w:r>
+        <w:t xml:space="preserve"> </w:t>
+      </w:r>
+      <w:r>
+        <w:t xml:space="preserve">E-mail autor correspondente: rickinrj@gmail.com</w:t>
       </w:r>
     </w:p>
     <w:p>

</xml_diff>

<commit_message>
fix(tcc): logo do programa no cabeçalho do Word
O pandoc copia o XML do cabeçalho do template mas perde a imagem: resta o
<w:drawing> do conector reto — a linha horizontal —, sem nenhum r:embed. Minha
checagem procurava só por "drawing" e por isso dava OK; o autor viu a falta ao
abrir o arquivo.

O logo é reinserido com python-docx, que refaz o relacionamento com a mídia,
num tab alinhado à direita da margem, como o anexo da página 61 mostra. Sai em
2,18 x 0,90 cm, na proporção original.

A checagem passa a exigir blip com embed, não a mera presença de um objeto
gráfico — o falso positivo que deixou o defeito passar.

Co-Authored-By: Claude Opus 5 (1M context) <noreply@anthropic.com>
</commit_message>
<xml_diff>
--- a/entregaveis/TCC_Ricardo_Calheiros_MBA_USP_Esalq.docx
+++ b/entregaveis/TCC_Ricardo_Calheiros_MBA_USP_Esalq.docx
@@ -52052,6 +52052,9 @@
   <w:p>
     <w:pPr>
       <w:pStyle w:val="SemEspaamento"/>
+      <w:tabs>
+        <w:tab w:pos="9072" w:val="right"/>
+      </w:tabs>
       <w:ind w:right="3968"/>
       <w:rPr>
         <w:sz w:val="16"/>
@@ -52109,6 +52112,41 @@
       </w:rPr>
     </w:r>
     <w:r/>
+    <w:r>
+      <w:tab/>
+      <w:drawing>
+        <wp:inline xmlns:a="http://schemas.openxmlformats.org/drawingml/2006/main" xmlns:pic="http://schemas.openxmlformats.org/drawingml/2006/picture">
+          <wp:extent cx="783194" cy="324000"/>
+          <wp:docPr id="844941521" name="Picture 844941521"/>
+          <wp:cNvGraphicFramePr>
+            <a:graphicFrameLocks noChangeAspect="1"/>
+          </wp:cNvGraphicFramePr>
+          <a:graphic>
+            <a:graphicData uri="http://schemas.openxmlformats.org/drawingml/2006/picture">
+              <pic:pic>
+                <pic:nvPicPr>
+                  <pic:cNvPr id="0" name="image.png"/>
+                  <pic:cNvPicPr/>
+                </pic:nvPicPr>
+                <pic:blipFill>
+                  <a:blip r:embed="rId1"/>
+                  <a:stretch>
+                    <a:fillRect/>
+                  </a:stretch>
+                </pic:blipFill>
+                <pic:spPr>
+                  <a:xfrm>
+                    <a:off x="0" y="0"/>
+                    <a:ext cx="783194" cy="324000"/>
+                  </a:xfrm>
+                  <a:prstGeom prst="rect"/>
+                </pic:spPr>
+              </pic:pic>
+            </a:graphicData>
+          </a:graphic>
+        </wp:inline>
+      </w:drawing>
+    </w:r>
   </w:p>
   <w:p>
     <w:pPr>

</xml_diff>

<commit_message>
chore(tcc): Word regerado com as quebras de página e o logo do template
26/26 itens dos anexos conformes.

Co-Authored-By: Claude Opus 5 (1M context) <noreply@anthropic.com>
</commit_message>
<xml_diff>
--- a/entregaveis/TCC_Ricardo_Calheiros_MBA_USP_Esalq.docx
+++ b/entregaveis/TCC_Ricardo_Calheiros_MBA_USP_Esalq.docx
@@ -171,6 +171,7 @@
         <w:jc w:val="both"/>
       </w:pPr>
       <w:r>
+        <w:br w:type="page"/>
         <w:rPr>
           <w:rFonts w:ascii="Arial" w:hAnsi="Arial"/>
           <w:b/>
@@ -584,6 +585,7 @@
         <w:jc w:val="both"/>
       </w:pPr>
       <w:r>
+        <w:br w:type="page"/>
         <w:rPr>
           <w:rFonts w:ascii="Arial" w:hAnsi="Arial"/>
           <w:b/>
@@ -52052,9 +52054,6 @@
   <w:p>
     <w:pPr>
       <w:pStyle w:val="SemEspaamento"/>
-      <w:tabs>
-        <w:tab w:pos="9072" w:val="right"/>
-      </w:tabs>
       <w:ind w:right="3968"/>
       <w:rPr>
         <w:sz w:val="16"/>
@@ -52063,89 +52062,130 @@
     </w:pPr>
     <w:r>
       <w:rPr>
-        <w:rFonts w:ascii="Arial" w:hAnsi="Arial"/>
         <w:noProof/>
-        <w:sz w:val="16"/>
       </w:rPr>
-      <w:t>Trabalho de Conclusão de Curso apresentado para obtenção do título de especialista em Data Science e Analytics – 2026</w:t>
+      <w:drawing>
+        <wp:anchor distT="0" distB="0" distL="114300" distR="114300" simplePos="0" relativeHeight="251676672" behindDoc="0" locked="0" layoutInCell="1" allowOverlap="1" wp14:anchorId="15F5FC70" wp14:editId="18E219A0">
+          <wp:simplePos x="0" y="0"/>
+          <wp:positionH relativeFrom="margin">
+            <wp:posOffset>5029200</wp:posOffset>
+          </wp:positionH>
+          <wp:positionV relativeFrom="paragraph">
+            <wp:posOffset>-10160</wp:posOffset>
+          </wp:positionV>
+          <wp:extent cx="723900" cy="298450"/>
+          <wp:effectExtent l="0" t="0" r="0" b="6350"/>
+          <wp:wrapThrough wrapText="bothSides">
+            <wp:wrapPolygon edited="0">
+              <wp:start x="0" y="0"/>
+              <wp:lineTo x="0" y="20681"/>
+              <wp:lineTo x="21032" y="20681"/>
+              <wp:lineTo x="21032" y="0"/>
+              <wp:lineTo x="0" y="0"/>
+            </wp:wrapPolygon>
+          </wp:wrapThrough>
+          <wp:docPr id="1803984902" name="Imagem 1803984902" descr="Desenho com traços pretos em fundo branco&#10;&#10;Descrição gerada automaticamente com confiança média"/>
+          <wp:cNvGraphicFramePr>
+            <a:graphicFrameLocks xmlns:a="http://schemas.openxmlformats.org/drawingml/2006/main" noChangeAspect="1"/>
+          </wp:cNvGraphicFramePr>
+          <a:graphic xmlns:a="http://schemas.openxmlformats.org/drawingml/2006/main">
+            <a:graphicData uri="http://schemas.openxmlformats.org/drawingml/2006/picture">
+              <pic:pic xmlns:pic="http://schemas.openxmlformats.org/drawingml/2006/picture">
+                <pic:nvPicPr>
+                  <pic:cNvPr id="1667734149" name="Imagem 3" descr="Desenho com traços pretos em fundo branco&#10;&#10;Descrição gerada automaticamente com confiança média"/>
+                  <pic:cNvPicPr>
+                    <a:picLocks noChangeAspect="1" noChangeArrowheads="1"/>
+                  </pic:cNvPicPr>
+                </pic:nvPicPr>
+                <pic:blipFill>
+                  <a:blip r:embed="rId1">
+                    <a:extLst>
+                      <a:ext uri="{28A0092B-C50C-407E-A947-70E740481C1C}">
+                        <a14:useLocalDpi xmlns:a14="http://schemas.microsoft.com/office/drawing/2010/main" val="0"/>
+                      </a:ext>
+                    </a:extLst>
+                  </a:blip>
+                  <a:srcRect/>
+                  <a:stretch>
+                    <a:fillRect/>
+                  </a:stretch>
+                </pic:blipFill>
+                <pic:spPr bwMode="auto">
+                  <a:xfrm>
+                    <a:off x="0" y="0"/>
+                    <a:ext cx="723900" cy="298450"/>
+                  </a:xfrm>
+                  <a:prstGeom prst="rect">
+                    <a:avLst/>
+                  </a:prstGeom>
+                  <a:noFill/>
+                  <a:ln>
+                    <a:noFill/>
+                  </a:ln>
+                </pic:spPr>
+              </pic:pic>
+            </a:graphicData>
+          </a:graphic>
+          <wp14:sizeRelH relativeFrom="page">
+            <wp14:pctWidth>0</wp14:pctWidth>
+          </wp14:sizeRelH>
+          <wp14:sizeRelV relativeFrom="page">
+            <wp14:pctHeight>0</wp14:pctHeight>
+          </wp14:sizeRelV>
+        </wp:anchor>
+      </w:drawing>
     </w:r>
     <w:r>
       <w:rPr>
         <w:sz w:val="16"/>
         <w:szCs w:val="17"/>
       </w:rPr>
+      <w:t>Trabalho</w:t>
     </w:r>
     <w:r>
       <w:rPr>
         <w:sz w:val="16"/>
         <w:szCs w:val="17"/>
       </w:rPr>
+      <w:t xml:space="preserve"> </w:t>
     </w:r>
     <w:r>
       <w:rPr>
         <w:sz w:val="16"/>
         <w:szCs w:val="17"/>
       </w:rPr>
+      <w:t xml:space="preserve">de Conclusão de Curso </w:t>
     </w:r>
     <w:r>
       <w:rPr>
         <w:sz w:val="16"/>
         <w:szCs w:val="17"/>
       </w:rPr>
+      <w:t>apresentad</w:t>
     </w:r>
     <w:r>
       <w:rPr>
         <w:sz w:val="16"/>
         <w:szCs w:val="17"/>
       </w:rPr>
+      <w:t>o</w:t>
     </w:r>
     <w:r>
       <w:rPr>
         <w:sz w:val="16"/>
         <w:szCs w:val="17"/>
       </w:rPr>
+      <w:t xml:space="preserve"> para obtenção do título de especialista em</w:t>
     </w:r>
     <w:r>
       <w:rPr>
         <w:sz w:val="16"/>
         <w:szCs w:val="17"/>
       </w:rPr>
+      <w:t xml:space="preserve"> Data Science e Analytics – 2026</w:t>
     </w:r>
-    <w:r/>
     <w:r>
-      <w:tab/>
-      <w:drawing>
-        <wp:inline xmlns:a="http://schemas.openxmlformats.org/drawingml/2006/main" xmlns:pic="http://schemas.openxmlformats.org/drawingml/2006/picture">
-          <wp:extent cx="783194" cy="324000"/>
-          <wp:docPr id="844941521" name="Picture 844941521"/>
-          <wp:cNvGraphicFramePr>
-            <a:graphicFrameLocks noChangeAspect="1"/>
-          </wp:cNvGraphicFramePr>
-          <a:graphic>
-            <a:graphicData uri="http://schemas.openxmlformats.org/drawingml/2006/picture">
-              <pic:pic>
-                <pic:nvPicPr>
-                  <pic:cNvPr id="0" name="image.png"/>
-                  <pic:cNvPicPr/>
-                </pic:nvPicPr>
-                <pic:blipFill>
-                  <a:blip r:embed="rId1"/>
-                  <a:stretch>
-                    <a:fillRect/>
-                  </a:stretch>
-                </pic:blipFill>
-                <pic:spPr>
-                  <a:xfrm>
-                    <a:off x="0" y="0"/>
-                    <a:ext cx="783194" cy="324000"/>
-                  </a:xfrm>
-                  <a:prstGeom prst="rect"/>
-                </pic:spPr>
-              </pic:pic>
-            </a:graphicData>
-          </a:graphic>
-        </wp:inline>
-      </w:drawing>
+      <w:t xml:space="preserve"> </w:t>
     </w:r>
   </w:p>
   <w:p>

</xml_diff>

<commit_message>
data(resultados): entregáveis com a referência das apostilas (05/10/2026)
Norma 27/27, Word 49 páginas, fósseis 0, números sem fonte 0, citações definidas.

Co-Authored-By: Claude Opus 5.5 (1M context) <noreply@anthropic.com>
Claude-Session: https://claude.ai/code/session_01ATPBca6o9jxRv5wGBtSSkf
</commit_message>
<xml_diff>
--- a/entregaveis/TCC_Ricardo_Calheiros_MBA_USP_Esalq.docx
+++ b/entregaveis/TCC_Ricardo_Calheiros_MBA_USP_Esalq.docx
@@ -44487,21 +44487,21 @@
           <w:rFonts w:ascii="Arial" w:hAnsi="Arial"/>
           <w:sz w:val="22"/>
         </w:rPr>
-        <w:t xml:space="preserve">Tabela 14. Escolha de hiperparâmetros e validação cruzada do XGBoost (Alencar, 2024)</w:t>
-      </w:r>
-      <w:r>
-        <w:rPr>
-          <w:rFonts w:ascii="Arial" w:hAnsi="Arial"/>
-          <w:sz w:val="22"/>
-        </w:rPr>
-        <w:t xml:space="preserve"> </w:t>
-      </w:r>
-      <w:r>
-        <w:rPr>
-          <w:rFonts w:ascii="Arial" w:hAnsi="Arial"/>
-          <w:sz w:val="22"/>
-        </w:rPr>
-        <w:t xml:space="preserve">(Géron, 2021)</w:t>
+        <w:t xml:space="preserve">Tabela 14. Escolha de hiperparâmetros e validação cruzada do XGBoost</w:t>
+      </w:r>
+      <w:r>
+        <w:rPr>
+          <w:rFonts w:ascii="Arial" w:hAnsi="Arial"/>
+          <w:sz w:val="22"/>
+        </w:rPr>
+        <w:t xml:space="preserve"> </w:t>
+      </w:r>
+      <w:r>
+        <w:rPr>
+          <w:rFonts w:ascii="Arial" w:hAnsi="Arial"/>
+          <w:sz w:val="22"/>
+        </w:rPr>
+        <w:t xml:space="preserve">(Alencar, 2026a, 2026b, 2026c; Géron, 2021)</w:t>
       </w:r>
       <w:r>
         <w:rPr>
@@ -44669,7 +44669,7 @@
         <w:tblW w:type="auto" w:w="0"/>
         <w:tblLayout w:type="fixed"/>
         <w:tblLook w:firstRow="1" w:lastRow="0" w:firstColumn="0" w:lastColumn="0" w:noHBand="0" w:noVBand="0" w:val="0020"/>
-        <w:tblCaption w:val="Tabela 14. Escolha de hiperparâmetros e validação cruzada do XGBoost (Alencar, 2024) (Géron, 2021). Painel A: seis configurações comparadas numa partição de validação dentro do treino — o conjunto de teste permanece intocado. Painel B: validação cruzada k-fold (k=5) no treino completo, com média e desvio-padrão entre folds. População completa: 6.159.418 observações de treino e 1.539.855 de teste; nenhuma amostragem."/>
+        <w:tblCaption w:val="Tabela 14. Escolha de hiperparâmetros e validação cruzada do XGBoost (Alencar, 2026a, 2026b, 2026c; Géron, 2021). Painel A: seis configurações comparadas numa partição de validação dentro do treino — o conjunto de teste permanece intocado. Painel B: validação cruzada k-fold (k=5) no treino completo, com média e desvio-padrão entre folds. População completa: 6.159.418 observações de treino e 1.539.855 de teste; nenhuma amostragem."/>
         <w:tblBorders>
           <w:top w:val="nil"/>
           <w:left w:val="nil"/>
@@ -57421,7 +57421,7 @@
       </w:r>
     </w:p>
     <w:bookmarkEnd w:id="130"/>
-    <w:bookmarkStart w:id="177" w:name="referências"/>
+    <w:bookmarkStart w:id="180" w:name="referências"/>
     <w:p>
       <w:pPr>
         <w:pStyle w:val="Heading1"/>
@@ -57438,8 +57438,8 @@
         <w:t xml:space="preserve">Referências</w:t>
       </w:r>
     </w:p>
-    <w:bookmarkStart w:id="176" w:name="refs"/>
-    <w:bookmarkStart w:id="131" w:name="ref-almeida2019"/>
+    <w:bookmarkStart w:id="179" w:name="refs"/>
+    <w:bookmarkStart w:id="131" w:name="ref-alencar2026a"/>
     <w:p>
       <w:pPr>
         <w:pStyle w:val="Bibliography"/>
@@ -57452,7 +57452,7 @@
           <w:rFonts w:ascii="Arial" w:hAnsi="Arial"/>
           <w:sz w:val="22"/>
         </w:rPr>
-        <w:t xml:space="preserve">ALMEIDA, Silvio Luiz de.</w:t>
+        <w:t xml:space="preserve">ALENCAR, Valquíria.</w:t>
       </w:r>
       <w:r>
         <w:rPr>
@@ -57468,46 +57468,57 @@
           <w:bCs/>
           <w:sz w:val="22"/>
         </w:rPr>
-        <w:t xml:space="preserve">Racismo Estrutural</w:t>
-      </w:r>
-      <w:r>
-        <w:rPr>
-          <w:rFonts w:ascii="Arial" w:hAnsi="Arial"/>
-          <w:sz w:val="22"/>
-        </w:rPr>
-        <w:t xml:space="preserve">. S</w:t>
-      </w:r>
-      <w:r>
-        <w:rPr>
-          <w:rFonts w:ascii="Arial" w:hAnsi="Arial"/>
-          <w:sz w:val="22"/>
-        </w:rPr>
-        <w:t xml:space="preserve">ã</w:t>
-      </w:r>
-      <w:r>
-        <w:rPr>
-          <w:rFonts w:ascii="Arial" w:hAnsi="Arial"/>
-          <w:sz w:val="22"/>
-        </w:rPr>
-        <w:t xml:space="preserve">o Paulo: Janda</w:t>
-      </w:r>
-      <w:r>
-        <w:rPr>
-          <w:rFonts w:ascii="Arial" w:hAnsi="Arial"/>
-          <w:sz w:val="22"/>
-        </w:rPr>
-        <w:t xml:space="preserve">í</w:t>
-      </w:r>
-      <w:r>
-        <w:rPr>
-          <w:rFonts w:ascii="Arial" w:hAnsi="Arial"/>
-          <w:sz w:val="22"/>
-        </w:rPr>
-        <w:t xml:space="preserve">ra, 2019.</w:t>
+        <w:t xml:space="preserve">Árvores, Redes e Ensembles</w:t>
+      </w:r>
+      <w:r>
+        <w:rPr>
+          <w:rFonts w:ascii="Arial" w:hAnsi="Arial"/>
+          <w:b/>
+          <w:bCs/>
+          <w:sz w:val="22"/>
+        </w:rPr>
+        <w:t xml:space="preserve"> </w:t>
+      </w:r>
+      <w:r>
+        <w:rPr>
+          <w:rFonts w:ascii="Arial" w:hAnsi="Arial"/>
+          <w:b/>
+          <w:bCs/>
+          <w:sz w:val="22"/>
+        </w:rPr>
+        <w:t xml:space="preserve">I</w:t>
+      </w:r>
+      <w:r>
+        <w:rPr>
+          <w:rFonts w:ascii="Arial" w:hAnsi="Arial"/>
+          <w:sz w:val="22"/>
+        </w:rPr>
+        <w:t xml:space="preserve">. Apostila do MBA em Data Science e Analytics. Piracicaba: Escola Superior de Agricultura</w:t>
+      </w:r>
+      <w:r>
+        <w:rPr>
+          <w:rFonts w:ascii="Arial" w:hAnsi="Arial"/>
+          <w:sz w:val="22"/>
+        </w:rPr>
+        <w:t xml:space="preserve"> </w:t>
+      </w:r>
+      <w:r>
+        <w:rPr>
+          <w:rFonts w:ascii="Arial" w:hAnsi="Arial"/>
+          <w:sz w:val="22"/>
+        </w:rPr>
+        <w:t xml:space="preserve">“Luiz de Queiroz”</w:t>
+      </w:r>
+      <w:r>
+        <w:rPr>
+          <w:rFonts w:ascii="Arial" w:hAnsi="Arial"/>
+          <w:sz w:val="22"/>
+        </w:rPr>
+        <w:t>, Universidade de São Paulo, 2026a.</w:t>
       </w:r>
     </w:p>
     <w:bookmarkEnd w:id="131"/>
-    <w:bookmarkStart w:id="132" w:name="ref-angrist2009"/>
+    <w:bookmarkStart w:id="132" w:name="ref-alencar2026b"/>
     <w:p>
       <w:pPr>
         <w:pStyle w:val="Bibliography"/>
@@ -57520,7 +57531,7 @@
           <w:rFonts w:ascii="Arial" w:hAnsi="Arial"/>
           <w:sz w:val="22"/>
         </w:rPr>
-        <w:t xml:space="preserve">ANGRIST, Joshua D.; PISCHKE, Jörn-Steffen.</w:t>
+        <w:t xml:space="preserve">ALENCAR, Valquíria.</w:t>
       </w:r>
       <w:r>
         <w:rPr>
@@ -57536,18 +57547,57 @@
           <w:bCs/>
           <w:sz w:val="22"/>
         </w:rPr>
-        <w:t xml:space="preserve">Mostly Harmless Econometrics: An Empiricist’s Companion</w:t>
-      </w:r>
-      <w:r>
-        <w:rPr>
-          <w:rFonts w:ascii="Arial" w:hAnsi="Arial"/>
-          <w:sz w:val="22"/>
-        </w:rPr>
-        <w:t xml:space="preserve">. Princeton: Princeton University Press, 2009.</w:t>
+        <w:t xml:space="preserve">Árvores, Redes e Ensembles</w:t>
+      </w:r>
+      <w:r>
+        <w:rPr>
+          <w:rFonts w:ascii="Arial" w:hAnsi="Arial"/>
+          <w:b/>
+          <w:bCs/>
+          <w:sz w:val="22"/>
+        </w:rPr>
+        <w:t xml:space="preserve"> </w:t>
+      </w:r>
+      <w:r>
+        <w:rPr>
+          <w:rFonts w:ascii="Arial" w:hAnsi="Arial"/>
+          <w:b/>
+          <w:bCs/>
+          <w:sz w:val="22"/>
+        </w:rPr>
+        <w:t xml:space="preserve">II</w:t>
+      </w:r>
+      <w:r>
+        <w:rPr>
+          <w:rFonts w:ascii="Arial" w:hAnsi="Arial"/>
+          <w:sz w:val="22"/>
+        </w:rPr>
+        <w:t xml:space="preserve">. Apostila do MBA em Data Science e Analytics. Piracicaba: Escola Superior de Agricultura</w:t>
+      </w:r>
+      <w:r>
+        <w:rPr>
+          <w:rFonts w:ascii="Arial" w:hAnsi="Arial"/>
+          <w:sz w:val="22"/>
+        </w:rPr>
+        <w:t xml:space="preserve"> </w:t>
+      </w:r>
+      <w:r>
+        <w:rPr>
+          <w:rFonts w:ascii="Arial" w:hAnsi="Arial"/>
+          <w:sz w:val="22"/>
+        </w:rPr>
+        <w:t xml:space="preserve">“Luiz de Queiroz”</w:t>
+      </w:r>
+      <w:r>
+        <w:rPr>
+          <w:rFonts w:ascii="Arial" w:hAnsi="Arial"/>
+          <w:sz w:val="22"/>
+        </w:rPr>
+        <w:t>, Universidade de São Paulo, 2026b.</w:t>
       </w:r>
     </w:p>
     <w:bookmarkEnd w:id="132"/>
-    <w:bookmarkStart w:id="133" w:name="ref-arrow1973"/>
+    <w:bookmarkStart w:id="133" w:name="ref-alencar2026c"/>
     <w:p>
       <w:pPr>
         <w:pStyle w:val="Bibliography"/>
@@ -57560,30 +57610,7 @@
           <w:rFonts w:ascii="Arial" w:hAnsi="Arial"/>
           <w:sz w:val="22"/>
         </w:rPr>
-        <w:t xml:space="preserve">ARROW, Kenneth J. The Theory of Discrimination.</w:t>
-      </w:r>
-      <w:r>
-        <w:rPr>
-          <w:rFonts w:ascii="Arial" w:hAnsi="Arial"/>
-          <w:sz w:val="22"/>
-        </w:rPr>
-        <w:t xml:space="preserve"> </w:t>
-      </w:r>
-      <w:r>
-        <w:rPr>
-          <w:rFonts w:ascii="Arial" w:hAnsi="Arial"/>
-          <w:i/>
-          <w:iCs/>
-          <w:sz w:val="22"/>
-        </w:rPr>
-        <w:t xml:space="preserve">In</w:t>
-      </w:r>
-      <w:r>
-        <w:rPr>
-          <w:rFonts w:ascii="Arial" w:hAnsi="Arial"/>
-          <w:sz w:val="22"/>
-        </w:rPr>
-        <w:t xml:space="preserve">: ASHENFELTER, Orley; REES, Albert (Orgs.).</w:t>
+        <w:t xml:space="preserve">ALENCAR, Valquíria.</w:t>
       </w:r>
       <w:r>
         <w:rPr>
@@ -57599,18 +57626,57 @@
           <w:bCs/>
           <w:sz w:val="22"/>
         </w:rPr>
-        <w:t xml:space="preserve">Discrimination in Labor Markets</w:t>
-      </w:r>
-      <w:r>
-        <w:rPr>
-          <w:rFonts w:ascii="Arial" w:hAnsi="Arial"/>
-          <w:sz w:val="22"/>
-        </w:rPr>
-        <w:t xml:space="preserve">. Princeton, NJ: Princeton University Press, 1973. p. 3–33.</w:t>
+        <w:t xml:space="preserve">Árvores, Redes e Ensembles</w:t>
+      </w:r>
+      <w:r>
+        <w:rPr>
+          <w:rFonts w:ascii="Arial" w:hAnsi="Arial"/>
+          <w:b/>
+          <w:bCs/>
+          <w:sz w:val="22"/>
+        </w:rPr>
+        <w:t xml:space="preserve"> </w:t>
+      </w:r>
+      <w:r>
+        <w:rPr>
+          <w:rFonts w:ascii="Arial" w:hAnsi="Arial"/>
+          <w:b/>
+          <w:bCs/>
+          <w:sz w:val="22"/>
+        </w:rPr>
+        <w:t xml:space="preserve">III</w:t>
+      </w:r>
+      <w:r>
+        <w:rPr>
+          <w:rFonts w:ascii="Arial" w:hAnsi="Arial"/>
+          <w:sz w:val="22"/>
+        </w:rPr>
+        <w:t xml:space="preserve">. Apostila do MBA em Data Science e Analytics. Piracicaba: Escola Superior de Agricultura</w:t>
+      </w:r>
+      <w:r>
+        <w:rPr>
+          <w:rFonts w:ascii="Arial" w:hAnsi="Arial"/>
+          <w:sz w:val="22"/>
+        </w:rPr>
+        <w:t xml:space="preserve"> </w:t>
+      </w:r>
+      <w:r>
+        <w:rPr>
+          <w:rFonts w:ascii="Arial" w:hAnsi="Arial"/>
+          <w:sz w:val="22"/>
+        </w:rPr>
+        <w:t xml:space="preserve">“Luiz de Queiroz”</w:t>
+      </w:r>
+      <w:r>
+        <w:rPr>
+          <w:rFonts w:ascii="Arial" w:hAnsi="Arial"/>
+          <w:sz w:val="22"/>
+        </w:rPr>
+        <w:t>, Universidade de São Paulo, 2026c.</w:t>
       </w:r>
     </w:p>
     <w:bookmarkEnd w:id="133"/>
-    <w:bookmarkStart w:id="134" w:name="ref-becker1957"/>
+    <w:bookmarkStart w:id="134" w:name="ref-almeida2019"/>
     <w:p>
       <w:pPr>
         <w:pStyle w:val="Bibliography"/>
@@ -57623,7 +57689,7 @@
           <w:rFonts w:ascii="Arial" w:hAnsi="Arial"/>
           <w:sz w:val="22"/>
         </w:rPr>
-        <w:t xml:space="preserve">BECKER, Gary S.</w:t>
+        <w:t xml:space="preserve">ALMEIDA, Silvio Luiz de.</w:t>
       </w:r>
       <w:r>
         <w:rPr>
@@ -57639,18 +57705,46 @@
           <w:bCs/>
           <w:sz w:val="22"/>
         </w:rPr>
-        <w:t xml:space="preserve">The Economics of Discrimination</w:t>
-      </w:r>
-      <w:r>
-        <w:rPr>
-          <w:rFonts w:ascii="Arial" w:hAnsi="Arial"/>
-          <w:sz w:val="22"/>
-        </w:rPr>
-        <w:t xml:space="preserve">. Chicago: University of Chicago Press, 1957.</w:t>
+        <w:t xml:space="preserve">Racismo Estrutural</w:t>
+      </w:r>
+      <w:r>
+        <w:rPr>
+          <w:rFonts w:ascii="Arial" w:hAnsi="Arial"/>
+          <w:sz w:val="22"/>
+        </w:rPr>
+        <w:t xml:space="preserve">. S</w:t>
+      </w:r>
+      <w:r>
+        <w:rPr>
+          <w:rFonts w:ascii="Arial" w:hAnsi="Arial"/>
+          <w:sz w:val="22"/>
+        </w:rPr>
+        <w:t xml:space="preserve">ã</w:t>
+      </w:r>
+      <w:r>
+        <w:rPr>
+          <w:rFonts w:ascii="Arial" w:hAnsi="Arial"/>
+          <w:sz w:val="22"/>
+        </w:rPr>
+        <w:t xml:space="preserve">o Paulo: Janda</w:t>
+      </w:r>
+      <w:r>
+        <w:rPr>
+          <w:rFonts w:ascii="Arial" w:hAnsi="Arial"/>
+          <w:sz w:val="22"/>
+        </w:rPr>
+        <w:t xml:space="preserve">í</w:t>
+      </w:r>
+      <w:r>
+        <w:rPr>
+          <w:rFonts w:ascii="Arial" w:hAnsi="Arial"/>
+          <w:sz w:val="22"/>
+        </w:rPr>
+        <w:t xml:space="preserve">ra, 2019.</w:t>
       </w:r>
     </w:p>
     <w:bookmarkEnd w:id="134"/>
-    <w:bookmarkStart w:id="135" w:name="ref-bickel2008"/>
+    <w:bookmarkStart w:id="135" w:name="ref-angrist2009"/>
     <w:p>
       <w:pPr>
         <w:pStyle w:val="Bibliography"/>
@@ -57663,85 +57757,7 @@
           <w:rFonts w:ascii="Arial" w:hAnsi="Arial"/>
           <w:sz w:val="22"/>
         </w:rPr>
-        <w:t xml:space="preserve">BICKEL, Peter J.; SAKOV, Anat. On the Choice of</w:t>
-      </w:r>
-      <w:r>
-        <w:rPr>
-          <w:rFonts w:ascii="Arial" w:hAnsi="Arial"/>
-          <w:sz w:val="22"/>
-        </w:rPr>
-        <w:t xml:space="preserve"> </w:t>
-      </w:r>
-      <m:oMath>
-        <m:r>
-          <m:t>m</m:t>
-        </m:r>
-      </m:oMath>
-      <w:r>
-        <w:rPr>
-          <w:rFonts w:ascii="Arial" w:hAnsi="Arial"/>
-          <w:sz w:val="22"/>
-        </w:rPr>
-        <w:t xml:space="preserve"> </w:t>
-      </w:r>
-      <w:r>
-        <w:rPr>
-          <w:rFonts w:ascii="Arial" w:hAnsi="Arial"/>
-          <w:sz w:val="22"/>
-        </w:rPr>
-        <w:t xml:space="preserve">in the</w:t>
-      </w:r>
-      <w:r>
-        <w:rPr>
-          <w:rFonts w:ascii="Arial" w:hAnsi="Arial"/>
-          <w:sz w:val="22"/>
-        </w:rPr>
-        <w:t xml:space="preserve"> </w:t>
-      </w:r>
-      <m:oMath>
-        <m:r>
-          <m:t>m</m:t>
-        </m:r>
-      </m:oMath>
-      <w:r>
-        <w:rPr>
-          <w:rFonts w:ascii="Arial" w:hAnsi="Arial"/>
-          <w:sz w:val="22"/>
-        </w:rPr>
-        <w:t xml:space="preserve"> </w:t>
-      </w:r>
-      <w:r>
-        <w:rPr>
-          <w:rFonts w:ascii="Arial" w:hAnsi="Arial"/>
-          <w:sz w:val="22"/>
-        </w:rPr>
-        <w:t xml:space="preserve">out of</w:t>
-      </w:r>
-      <w:r>
-        <w:rPr>
-          <w:rFonts w:ascii="Arial" w:hAnsi="Arial"/>
-          <w:sz w:val="22"/>
-        </w:rPr>
-        <w:t xml:space="preserve"> </w:t>
-      </w:r>
-      <m:oMath>
-        <m:r>
-          <m:t>n</m:t>
-        </m:r>
-      </m:oMath>
-      <w:r>
-        <w:rPr>
-          <w:rFonts w:ascii="Arial" w:hAnsi="Arial"/>
-          <w:sz w:val="22"/>
-        </w:rPr>
-        <w:t xml:space="preserve"> </w:t>
-      </w:r>
-      <w:r>
-        <w:rPr>
-          <w:rFonts w:ascii="Arial" w:hAnsi="Arial"/>
-          <w:sz w:val="22"/>
-        </w:rPr>
-        <w:t xml:space="preserve">Bootstrap and Confidence Bounds for Extrema.</w:t>
+        <w:t xml:space="preserve">ANGRIST, Joshua D.; PISCHKE, Jörn-Steffen.</w:t>
       </w:r>
       <w:r>
         <w:rPr>
@@ -57757,18 +57773,18 @@
           <w:bCs/>
           <w:sz w:val="22"/>
         </w:rPr>
-        <w:t xml:space="preserve">Statistica Sinica</w:t>
-      </w:r>
-      <w:r>
-        <w:rPr>
-          <w:rFonts w:ascii="Arial" w:hAnsi="Arial"/>
-          <w:sz w:val="22"/>
-        </w:rPr>
-        <w:t xml:space="preserve">, v. 18, n. 3, p. 967–985, 2008.</w:t>
+        <w:t xml:space="preserve">Mostly Harmless Econometrics: An Empiricist’s Companion</w:t>
+      </w:r>
+      <w:r>
+        <w:rPr>
+          <w:rFonts w:ascii="Arial" w:hAnsi="Arial"/>
+          <w:sz w:val="22"/>
+        </w:rPr>
+        <w:t xml:space="preserve">. Princeton: Princeton University Press, 2009.</w:t>
       </w:r>
     </w:p>
     <w:bookmarkEnd w:id="135"/>
-    <w:bookmarkStart w:id="136" w:name="ref-blinder1973"/>
+    <w:bookmarkStart w:id="136" w:name="ref-arrow1973"/>
     <w:p>
       <w:pPr>
         <w:pStyle w:val="Bibliography"/>
@@ -57781,7 +57797,30 @@
           <w:rFonts w:ascii="Arial" w:hAnsi="Arial"/>
           <w:sz w:val="22"/>
         </w:rPr>
-        <w:t xml:space="preserve">BLINDER, Alan S. Wage Discrimination: Reduced Form and Structural Estimates.</w:t>
+        <w:t xml:space="preserve">ARROW, Kenneth J. The Theory of Discrimination.</w:t>
+      </w:r>
+      <w:r>
+        <w:rPr>
+          <w:rFonts w:ascii="Arial" w:hAnsi="Arial"/>
+          <w:sz w:val="22"/>
+        </w:rPr>
+        <w:t xml:space="preserve"> </w:t>
+      </w:r>
+      <w:r>
+        <w:rPr>
+          <w:rFonts w:ascii="Arial" w:hAnsi="Arial"/>
+          <w:i/>
+          <w:iCs/>
+          <w:sz w:val="22"/>
+        </w:rPr>
+        <w:t xml:space="preserve">In</w:t>
+      </w:r>
+      <w:r>
+        <w:rPr>
+          <w:rFonts w:ascii="Arial" w:hAnsi="Arial"/>
+          <w:sz w:val="22"/>
+        </w:rPr>
+        <w:t xml:space="preserve">: ASHENFELTER, Orley; REES, Albert (Orgs.).</w:t>
       </w:r>
       <w:r>
         <w:rPr>
@@ -57797,18 +57836,18 @@
           <w:bCs/>
           <w:sz w:val="22"/>
         </w:rPr>
-        <w:t xml:space="preserve">Journal of Human Resources</w:t>
-      </w:r>
-      <w:r>
-        <w:rPr>
-          <w:rFonts w:ascii="Arial" w:hAnsi="Arial"/>
-          <w:sz w:val="22"/>
-        </w:rPr>
-        <w:t xml:space="preserve">, v. 8, n. 4, p. 436–455, 1973.</w:t>
+        <w:t xml:space="preserve">Discrimination in Labor Markets</w:t>
+      </w:r>
+      <w:r>
+        <w:rPr>
+          <w:rFonts w:ascii="Arial" w:hAnsi="Arial"/>
+          <w:sz w:val="22"/>
+        </w:rPr>
+        <w:t xml:space="preserve">. Princeton, NJ: Princeton University Press, 1973. p. 3–33.</w:t>
       </w:r>
     </w:p>
     <w:bookmarkEnd w:id="136"/>
-    <w:bookmarkStart w:id="137" w:name="ref-brasil1995lei9029"/>
+    <w:bookmarkStart w:id="137" w:name="ref-becker1957"/>
     <w:p>
       <w:pPr>
         <w:pStyle w:val="Bibliography"/>
@@ -57821,7 +57860,7 @@
           <w:rFonts w:ascii="Arial" w:hAnsi="Arial"/>
           <w:sz w:val="22"/>
         </w:rPr>
-        <w:t xml:space="preserve">BRASIL.</w:t>
+        <w:t xml:space="preserve">BECKER, Gary S.</w:t>
       </w:r>
       <w:r>
         <w:rPr>
@@ -57837,18 +57876,18 @@
           <w:bCs/>
           <w:sz w:val="22"/>
         </w:rPr>
-        <w:t xml:space="preserve">Lei n. 9.029, de 13 de abril de 1995. Proíbe a exigência de atestados de gravidez e esterilização, e outras práticas discriminatórias, para efeitos admissionais ou de permanência da relação jurídica de trabalho</w:t>
-      </w:r>
-      <w:r>
-        <w:rPr>
-          <w:rFonts w:ascii="Arial" w:hAnsi="Arial"/>
-          <w:sz w:val="22"/>
-        </w:rPr>
-        <w:t xml:space="preserve">. Diário Oficial da União, Brasília, DF, 1995.</w:t>
+        <w:t xml:space="preserve">The Economics of Discrimination</w:t>
+      </w:r>
+      <w:r>
+        <w:rPr>
+          <w:rFonts w:ascii="Arial" w:hAnsi="Arial"/>
+          <w:sz w:val="22"/>
+        </w:rPr>
+        <w:t xml:space="preserve">. Chicago: University of Chicago Press, 1957.</w:t>
       </w:r>
     </w:p>
     <w:bookmarkEnd w:id="137"/>
-    <w:bookmarkStart w:id="138" w:name="ref-brasil2010lei12288"/>
+    <w:bookmarkStart w:id="138" w:name="ref-bickel2008"/>
     <w:p>
       <w:pPr>
         <w:pStyle w:val="Bibliography"/>
@@ -57861,7 +57900,85 @@
           <w:rFonts w:ascii="Arial" w:hAnsi="Arial"/>
           <w:sz w:val="22"/>
         </w:rPr>
-        <w:t xml:space="preserve">BRASIL.</w:t>
+        <w:t xml:space="preserve">BICKEL, Peter J.; SAKOV, Anat. On the Choice of</w:t>
+      </w:r>
+      <w:r>
+        <w:rPr>
+          <w:rFonts w:ascii="Arial" w:hAnsi="Arial"/>
+          <w:sz w:val="22"/>
+        </w:rPr>
+        <w:t xml:space="preserve"> </w:t>
+      </w:r>
+      <m:oMath>
+        <m:r>
+          <m:t>m</m:t>
+        </m:r>
+      </m:oMath>
+      <w:r>
+        <w:rPr>
+          <w:rFonts w:ascii="Arial" w:hAnsi="Arial"/>
+          <w:sz w:val="22"/>
+        </w:rPr>
+        <w:t xml:space="preserve"> </w:t>
+      </w:r>
+      <w:r>
+        <w:rPr>
+          <w:rFonts w:ascii="Arial" w:hAnsi="Arial"/>
+          <w:sz w:val="22"/>
+        </w:rPr>
+        <w:t xml:space="preserve">in the</w:t>
+      </w:r>
+      <w:r>
+        <w:rPr>
+          <w:rFonts w:ascii="Arial" w:hAnsi="Arial"/>
+          <w:sz w:val="22"/>
+        </w:rPr>
+        <w:t xml:space="preserve"> </w:t>
+      </w:r>
+      <m:oMath>
+        <m:r>
+          <m:t>m</m:t>
+        </m:r>
+      </m:oMath>
+      <w:r>
+        <w:rPr>
+          <w:rFonts w:ascii="Arial" w:hAnsi="Arial"/>
+          <w:sz w:val="22"/>
+        </w:rPr>
+        <w:t xml:space="preserve"> </w:t>
+      </w:r>
+      <w:r>
+        <w:rPr>
+          <w:rFonts w:ascii="Arial" w:hAnsi="Arial"/>
+          <w:sz w:val="22"/>
+        </w:rPr>
+        <w:t xml:space="preserve">out of</w:t>
+      </w:r>
+      <w:r>
+        <w:rPr>
+          <w:rFonts w:ascii="Arial" w:hAnsi="Arial"/>
+          <w:sz w:val="22"/>
+        </w:rPr>
+        <w:t xml:space="preserve"> </w:t>
+      </w:r>
+      <m:oMath>
+        <m:r>
+          <m:t>n</m:t>
+        </m:r>
+      </m:oMath>
+      <w:r>
+        <w:rPr>
+          <w:rFonts w:ascii="Arial" w:hAnsi="Arial"/>
+          <w:sz w:val="22"/>
+        </w:rPr>
+        <w:t xml:space="preserve"> </w:t>
+      </w:r>
+      <w:r>
+        <w:rPr>
+          <w:rFonts w:ascii="Arial" w:hAnsi="Arial"/>
+          <w:sz w:val="22"/>
+        </w:rPr>
+        <w:t xml:space="preserve">Bootstrap and Confidence Bounds for Extrema.</w:t>
       </w:r>
       <w:r>
         <w:rPr>
@@ -57877,18 +57994,18 @@
           <w:bCs/>
           <w:sz w:val="22"/>
         </w:rPr>
-        <w:t xml:space="preserve">Lei n. 12.288, de 20 de julho de 2010. Institui o Estatuto da Igualdade Racial</w:t>
-      </w:r>
-      <w:r>
-        <w:rPr>
-          <w:rFonts w:ascii="Arial" w:hAnsi="Arial"/>
-          <w:sz w:val="22"/>
-        </w:rPr>
-        <w:t xml:space="preserve">. Diário Oficial da União, Brasília, DF, 2010.</w:t>
+        <w:t xml:space="preserve">Statistica Sinica</w:t>
+      </w:r>
+      <w:r>
+        <w:rPr>
+          <w:rFonts w:ascii="Arial" w:hAnsi="Arial"/>
+          <w:sz w:val="22"/>
+        </w:rPr>
+        <w:t xml:space="preserve">, v. 18, n. 3, p. 967–985, 2008.</w:t>
       </w:r>
     </w:p>
     <w:bookmarkEnd w:id="138"/>
-    <w:bookmarkStart w:id="139" w:name="ref-brasil2012lei12711"/>
+    <w:bookmarkStart w:id="139" w:name="ref-blinder1973"/>
     <w:p>
       <w:pPr>
         <w:pStyle w:val="Bibliography"/>
@@ -57901,7 +58018,7 @@
           <w:rFonts w:ascii="Arial" w:hAnsi="Arial"/>
           <w:sz w:val="22"/>
         </w:rPr>
-        <w:t xml:space="preserve">BRASIL.</w:t>
+        <w:t xml:space="preserve">BLINDER, Alan S. Wage Discrimination: Reduced Form and Structural Estimates.</w:t>
       </w:r>
       <w:r>
         <w:rPr>
@@ -57917,18 +58034,18 @@
           <w:bCs/>
           <w:sz w:val="22"/>
         </w:rPr>
-        <w:t xml:space="preserve">Lei n. 12.711, de 29 de agosto de 2012. Dispõe sobre o ingresso nas universidades federais e nas instituições federais de ensino técnico de nível médio</w:t>
-      </w:r>
-      <w:r>
-        <w:rPr>
-          <w:rFonts w:ascii="Arial" w:hAnsi="Arial"/>
-          <w:sz w:val="22"/>
-        </w:rPr>
-        <w:t xml:space="preserve">. Diário Oficial da União, Brasília, DF, 2012.</w:t>
+        <w:t xml:space="preserve">Journal of Human Resources</w:t>
+      </w:r>
+      <w:r>
+        <w:rPr>
+          <w:rFonts w:ascii="Arial" w:hAnsi="Arial"/>
+          <w:sz w:val="22"/>
+        </w:rPr>
+        <w:t xml:space="preserve">, v. 8, n. 4, p. 436–455, 1973.</w:t>
       </w:r>
     </w:p>
     <w:bookmarkEnd w:id="139"/>
-    <w:bookmarkStart w:id="140" w:name="ref-brasil2014lei12990"/>
+    <w:bookmarkStart w:id="140" w:name="ref-brasil1995lei9029"/>
     <w:p>
       <w:pPr>
         <w:pStyle w:val="Bibliography"/>
@@ -57957,18 +58074,18 @@
           <w:bCs/>
           <w:sz w:val="22"/>
         </w:rPr>
-        <w:t xml:space="preserve">Lei n. 12.990, de 9 de junho de 2014. Reserva aos negros 20% das vagas oferecidas nos concursos públicos para provimento de cargos efetivos e empregos públicos no âmbito da administração pública federal, das autarquias, das fundações públicas, das empresas públicas e das sociedades de economia mista controladas pela União</w:t>
-      </w:r>
-      <w:r>
-        <w:rPr>
-          <w:rFonts w:ascii="Arial" w:hAnsi="Arial"/>
-          <w:sz w:val="22"/>
-        </w:rPr>
-        <w:t xml:space="preserve">. Diário Oficial da União, Brasília, DF, 2014.</w:t>
+        <w:t xml:space="preserve">Lei n. 9.029, de 13 de abril de 1995. Proíbe a exigência de atestados de gravidez e esterilização, e outras práticas discriminatórias, para efeitos admissionais ou de permanência da relação jurídica de trabalho</w:t>
+      </w:r>
+      <w:r>
+        <w:rPr>
+          <w:rFonts w:ascii="Arial" w:hAnsi="Arial"/>
+          <w:sz w:val="22"/>
+        </w:rPr>
+        <w:t xml:space="preserve">. Diário Oficial da União, Brasília, DF, 1995.</w:t>
       </w:r>
     </w:p>
     <w:bookmarkEnd w:id="140"/>
-    <w:bookmarkStart w:id="141" w:name="ref-brasil2023decreto11443"/>
+    <w:bookmarkStart w:id="141" w:name="ref-brasil2010lei12288"/>
     <w:p>
       <w:pPr>
         <w:pStyle w:val="Bibliography"/>
@@ -57997,18 +58114,18 @@
           <w:bCs/>
           <w:sz w:val="22"/>
         </w:rPr>
-        <w:t xml:space="preserve">Decreto n. 11.443, de 21 de março de 2023. Dispõe sobre o preenchimento por pessoas negras de percentual mínimo de cargos em comissão e funções de confiança no âmbito da administração pública federal</w:t>
-      </w:r>
-      <w:r>
-        <w:rPr>
-          <w:rFonts w:ascii="Arial" w:hAnsi="Arial"/>
-          <w:sz w:val="22"/>
-        </w:rPr>
-        <w:t xml:space="preserve">. Diário Oficial da União, Brasília, DF, b2023.</w:t>
+        <w:t xml:space="preserve">Lei n. 12.288, de 20 de julho de 2010. Institui o Estatuto da Igualdade Racial</w:t>
+      </w:r>
+      <w:r>
+        <w:rPr>
+          <w:rFonts w:ascii="Arial" w:hAnsi="Arial"/>
+          <w:sz w:val="22"/>
+        </w:rPr>
+        <w:t xml:space="preserve">. Diário Oficial da União, Brasília, DF, 2010.</w:t>
       </w:r>
     </w:p>
     <w:bookmarkEnd w:id="141"/>
-    <w:bookmarkStart w:id="142" w:name="ref-brasil2023lei14611"/>
+    <w:bookmarkStart w:id="142" w:name="ref-brasil2012lei12711"/>
     <w:p>
       <w:pPr>
         <w:pStyle w:val="Bibliography"/>
@@ -58037,18 +58154,18 @@
           <w:bCs/>
           <w:sz w:val="22"/>
         </w:rPr>
-        <w:t xml:space="preserve">Lei n. 14.611, de 3 de julho de 2023. Dispõe sobre a igualdade salarial e de critérios remuneratórios entre mulheres e homens</w:t>
-      </w:r>
-      <w:r>
-        <w:rPr>
-          <w:rFonts w:ascii="Arial" w:hAnsi="Arial"/>
-          <w:sz w:val="22"/>
-        </w:rPr>
-        <w:t xml:space="preserve">. Diário Oficial da União, Brasília, DF, c2023.</w:t>
+        <w:t xml:space="preserve">Lei n. 12.711, de 29 de agosto de 2012. Dispõe sobre o ingresso nas universidades federais e nas instituições federais de ensino técnico de nível médio</w:t>
+      </w:r>
+      <w:r>
+        <w:rPr>
+          <w:rFonts w:ascii="Arial" w:hAnsi="Arial"/>
+          <w:sz w:val="22"/>
+        </w:rPr>
+        <w:t xml:space="preserve">. Diário Oficial da União, Brasília, DF, 2012.</w:t>
       </w:r>
     </w:p>
     <w:bookmarkEnd w:id="142"/>
-    <w:bookmarkStart w:id="143" w:name="ref-brasil2023lei14723"/>
+    <w:bookmarkStart w:id="143" w:name="ref-brasil2014lei12990"/>
     <w:p>
       <w:pPr>
         <w:pStyle w:val="Bibliography"/>
@@ -58077,18 +58194,18 @@
           <w:bCs/>
           <w:sz w:val="22"/>
         </w:rPr>
-        <w:t xml:space="preserve">Lei n. 14.723, de 13 de novembro de 2023. Altera a Lei n. 12.711, de 29 de agosto de 2012, para dispor sobre o programa especial para o acesso às instituições federais de educação superior e de ensino técnico de nível médio</w:t>
-      </w:r>
-      <w:r>
-        <w:rPr>
-          <w:rFonts w:ascii="Arial" w:hAnsi="Arial"/>
-          <w:sz w:val="22"/>
-        </w:rPr>
-        <w:t xml:space="preserve">. Diário Oficial da União, Brasília, DF, a2023.</w:t>
+        <w:t xml:space="preserve">Lei n. 12.990, de 9 de junho de 2014. Reserva aos negros 20% das vagas oferecidas nos concursos públicos para provimento de cargos efetivos e empregos públicos no âmbito da administração pública federal, das autarquias, das fundações públicas, das empresas públicas e das sociedades de economia mista controladas pela União</w:t>
+      </w:r>
+      <w:r>
+        <w:rPr>
+          <w:rFonts w:ascii="Arial" w:hAnsi="Arial"/>
+          <w:sz w:val="22"/>
+        </w:rPr>
+        <w:t xml:space="preserve">. Diário Oficial da União, Brasília, DF, 2014.</w:t>
       </w:r>
     </w:p>
     <w:bookmarkEnd w:id="143"/>
-    <w:bookmarkStart w:id="144" w:name="ref-brasil2025lei15142"/>
+    <w:bookmarkStart w:id="144" w:name="ref-brasil2023decreto11443"/>
     <w:p>
       <w:pPr>
         <w:pStyle w:val="Bibliography"/>
@@ -58117,18 +58234,18 @@
           <w:bCs/>
           <w:sz w:val="22"/>
         </w:rPr>
-        <w:t xml:space="preserve">Lei n. 15.142, de 3 de junho de 2025. Dispõe sobre a reserva às pessoas pretas e pardas, indígenas e quilombolas de vagas oferecidas em concursos públicos e em processos seletivos simplificados no âmbito da administração pública federal</w:t>
-      </w:r>
-      <w:r>
-        <w:rPr>
-          <w:rFonts w:ascii="Arial" w:hAnsi="Arial"/>
-          <w:sz w:val="22"/>
-        </w:rPr>
-        <w:t xml:space="preserve">. Diário Oficial da União, Brasília, DF, 2025.</w:t>
+        <w:t xml:space="preserve">Decreto n. 11.443, de 21 de março de 2023. Dispõe sobre o preenchimento por pessoas negras de percentual mínimo de cargos em comissão e funções de confiança no âmbito da administração pública federal</w:t>
+      </w:r>
+      <w:r>
+        <w:rPr>
+          <w:rFonts w:ascii="Arial" w:hAnsi="Arial"/>
+          <w:sz w:val="22"/>
+        </w:rPr>
+        <w:t>. Diário Oficial da União, Brasília, DF, 2023b.</w:t>
       </w:r>
     </w:p>
     <w:bookmarkEnd w:id="144"/>
-    <w:bookmarkStart w:id="145" w:name="ref-breiman2001"/>
+    <w:bookmarkStart w:id="145" w:name="ref-brasil2023lei14611"/>
     <w:p>
       <w:pPr>
         <w:pStyle w:val="Bibliography"/>
@@ -58141,7 +58258,7 @@
           <w:rFonts w:ascii="Arial" w:hAnsi="Arial"/>
           <w:sz w:val="22"/>
         </w:rPr>
-        <w:t xml:space="preserve">BREIMAN, Leo. Random Forests.</w:t>
+        <w:t xml:space="preserve">BRASIL.</w:t>
       </w:r>
       <w:r>
         <w:rPr>
@@ -58157,18 +58274,18 @@
           <w:bCs/>
           <w:sz w:val="22"/>
         </w:rPr>
-        <w:t xml:space="preserve">Machine Learning</w:t>
-      </w:r>
-      <w:r>
-        <w:rPr>
-          <w:rFonts w:ascii="Arial" w:hAnsi="Arial"/>
-          <w:sz w:val="22"/>
-        </w:rPr>
-        <w:t xml:space="preserve">, v. 45, n. 1, p. 5–32, 2001.</w:t>
+        <w:t xml:space="preserve">Lei n. 14.611, de 3 de julho de 2023. Dispõe sobre a igualdade salarial e de critérios remuneratórios entre mulheres e homens</w:t>
+      </w:r>
+      <w:r>
+        <w:rPr>
+          <w:rFonts w:ascii="Arial" w:hAnsi="Arial"/>
+          <w:sz w:val="22"/>
+        </w:rPr>
+        <w:t>. Diário Oficial da União, Brasília, DF, 2023c.</w:t>
       </w:r>
     </w:p>
     <w:bookmarkEnd w:id="145"/>
-    <w:bookmarkStart w:id="146" w:name="ref-cameron2008"/>
+    <w:bookmarkStart w:id="146" w:name="ref-brasil2023lei14723"/>
     <w:p>
       <w:pPr>
         <w:pStyle w:val="Bibliography"/>
@@ -58181,7 +58298,7 @@
           <w:rFonts w:ascii="Arial" w:hAnsi="Arial"/>
           <w:sz w:val="22"/>
         </w:rPr>
-        <w:t xml:space="preserve">CAMERON, A. Colin; GELBACH, Jonah B.; MILLER, Douglas L. Bootstrap-Based Improvements for Inference with Clustered Errors.</w:t>
+        <w:t xml:space="preserve">BRASIL.</w:t>
       </w:r>
       <w:r>
         <w:rPr>
@@ -58197,18 +58314,18 @@
           <w:bCs/>
           <w:sz w:val="22"/>
         </w:rPr>
-        <w:t xml:space="preserve">The Review of Economics and Statistics</w:t>
-      </w:r>
-      <w:r>
-        <w:rPr>
-          <w:rFonts w:ascii="Arial" w:hAnsi="Arial"/>
-          <w:sz w:val="22"/>
-        </w:rPr>
-        <w:t xml:space="preserve">, v. 90, n. 3, p. 414–427, 2008.</w:t>
+        <w:t xml:space="preserve">Lei n. 14.723, de 13 de novembro de 2023. Altera a Lei n. 12.711, de 29 de agosto de 2012, para dispor sobre o programa especial para o acesso às instituições federais de educação superior e de ensino técnico de nível médio</w:t>
+      </w:r>
+      <w:r>
+        <w:rPr>
+          <w:rFonts w:ascii="Arial" w:hAnsi="Arial"/>
+          <w:sz w:val="22"/>
+        </w:rPr>
+        <w:t>. Diário Oficial da União, Brasília, DF, 2023a.</w:t>
       </w:r>
     </w:p>
     <w:bookmarkEnd w:id="146"/>
-    <w:bookmarkStart w:id="148" w:name="ref-chen2016"/>
+    <w:bookmarkStart w:id="147" w:name="ref-brasil2025lei15142"/>
     <w:p>
       <w:pPr>
         <w:pStyle w:val="Bibliography"/>
@@ -58221,6 +58338,126 @@
           <w:rFonts w:ascii="Arial" w:hAnsi="Arial"/>
           <w:sz w:val="22"/>
         </w:rPr>
+        <w:t xml:space="preserve">BRASIL.</w:t>
+      </w:r>
+      <w:r>
+        <w:rPr>
+          <w:rFonts w:ascii="Arial" w:hAnsi="Arial"/>
+          <w:sz w:val="22"/>
+        </w:rPr>
+        <w:t xml:space="preserve"> </w:t>
+      </w:r>
+      <w:r>
+        <w:rPr>
+          <w:rFonts w:ascii="Arial" w:hAnsi="Arial"/>
+          <w:b/>
+          <w:bCs/>
+          <w:sz w:val="22"/>
+        </w:rPr>
+        <w:t xml:space="preserve">Lei n. 15.142, de 3 de junho de 2025. Dispõe sobre a reserva às pessoas pretas e pardas, indígenas e quilombolas de vagas oferecidas em concursos públicos e em processos seletivos simplificados no âmbito da administração pública federal</w:t>
+      </w:r>
+      <w:r>
+        <w:rPr>
+          <w:rFonts w:ascii="Arial" w:hAnsi="Arial"/>
+          <w:sz w:val="22"/>
+        </w:rPr>
+        <w:t xml:space="preserve">. Diário Oficial da União, Brasília, DF, 2025.</w:t>
+      </w:r>
+    </w:p>
+    <w:bookmarkEnd w:id="147"/>
+    <w:bookmarkStart w:id="148" w:name="ref-breiman2001"/>
+    <w:p>
+      <w:pPr>
+        <w:pStyle w:val="Bibliography"/>
+        <w:spacing w:line="240" w:lineRule="auto" w:before="0" w:after="120"/>
+        <w:ind w:firstLine="0" w:left="0"/>
+        <w:jc w:val="left"/>
+      </w:pPr>
+      <w:r>
+        <w:rPr>
+          <w:rFonts w:ascii="Arial" w:hAnsi="Arial"/>
+          <w:sz w:val="22"/>
+        </w:rPr>
+        <w:t xml:space="preserve">BREIMAN, Leo. Random Forests.</w:t>
+      </w:r>
+      <w:r>
+        <w:rPr>
+          <w:rFonts w:ascii="Arial" w:hAnsi="Arial"/>
+          <w:sz w:val="22"/>
+        </w:rPr>
+        <w:t xml:space="preserve"> </w:t>
+      </w:r>
+      <w:r>
+        <w:rPr>
+          <w:rFonts w:ascii="Arial" w:hAnsi="Arial"/>
+          <w:b/>
+          <w:bCs/>
+          <w:sz w:val="22"/>
+        </w:rPr>
+        <w:t xml:space="preserve">Machine Learning</w:t>
+      </w:r>
+      <w:r>
+        <w:rPr>
+          <w:rFonts w:ascii="Arial" w:hAnsi="Arial"/>
+          <w:sz w:val="22"/>
+        </w:rPr>
+        <w:t xml:space="preserve">, v. 45, n. 1, p. 5–32, 2001.</w:t>
+      </w:r>
+    </w:p>
+    <w:bookmarkEnd w:id="148"/>
+    <w:bookmarkStart w:id="149" w:name="ref-cameron2008"/>
+    <w:p>
+      <w:pPr>
+        <w:pStyle w:val="Bibliography"/>
+        <w:spacing w:line="240" w:lineRule="auto" w:before="0" w:after="120"/>
+        <w:ind w:firstLine="0" w:left="0"/>
+        <w:jc w:val="left"/>
+      </w:pPr>
+      <w:r>
+        <w:rPr>
+          <w:rFonts w:ascii="Arial" w:hAnsi="Arial"/>
+          <w:sz w:val="22"/>
+        </w:rPr>
+        <w:t xml:space="preserve">CAMERON, A. Colin; GELBACH, Jonah B.; MILLER, Douglas L. Bootstrap-Based Improvements for Inference with Clustered Errors.</w:t>
+      </w:r>
+      <w:r>
+        <w:rPr>
+          <w:rFonts w:ascii="Arial" w:hAnsi="Arial"/>
+          <w:sz w:val="22"/>
+        </w:rPr>
+        <w:t xml:space="preserve"> </w:t>
+      </w:r>
+      <w:r>
+        <w:rPr>
+          <w:rFonts w:ascii="Arial" w:hAnsi="Arial"/>
+          <w:b/>
+          <w:bCs/>
+          <w:sz w:val="22"/>
+        </w:rPr>
+        <w:t xml:space="preserve">The Review of Economics and Statistics</w:t>
+      </w:r>
+      <w:r>
+        <w:rPr>
+          <w:rFonts w:ascii="Arial" w:hAnsi="Arial"/>
+          <w:sz w:val="22"/>
+        </w:rPr>
+        <w:t xml:space="preserve">, v. 90, n. 3, p. 414–427, 2008.</w:t>
+      </w:r>
+    </w:p>
+    <w:bookmarkEnd w:id="149"/>
+    <w:bookmarkStart w:id="151" w:name="ref-chen2016"/>
+    <w:p>
+      <w:pPr>
+        <w:pStyle w:val="Bibliography"/>
+        <w:spacing w:line="240" w:lineRule="auto" w:before="0" w:after="120"/>
+        <w:ind w:firstLine="0" w:left="0"/>
+        <w:jc w:val="left"/>
+      </w:pPr>
+      <w:r>
+        <w:rPr>
+          <w:rFonts w:ascii="Arial" w:hAnsi="Arial"/>
+          <w:sz w:val="22"/>
+        </w:rPr>
         <w:t xml:space="preserve">CHEN, Tianqi; GUESTRIN, Carlos.</w:t>
       </w:r>
       <w:r>
@@ -58230,7 +58467,7 @@
         </w:rPr>
         <w:t xml:space="preserve"> </w:t>
       </w:r>
-      <w:hyperlink r:id="rId147">
+      <w:hyperlink r:id="rId150">
         <w:r>
           <w:rPr>
             <w:rStyle w:val="Hyperlink"/>
@@ -58298,8 +58535,8 @@
         <w:t xml:space="preserve">. San Francisco: ACM, 2016. p. 785–794.</w:t>
       </w:r>
     </w:p>
-    <w:bookmarkEnd w:id="148"/>
-    <w:bookmarkStart w:id="149" w:name="ref-crenshaw1989"/>
+    <w:bookmarkEnd w:id="151"/>
+    <w:bookmarkStart w:id="152" w:name="ref-crenshaw1989"/>
     <w:p>
       <w:pPr>
         <w:pStyle w:val="Bibliography"/>
@@ -58338,8 +58575,8 @@
         <w:t xml:space="preserve">, v. 1989, n. 1, p. 139–167, 1989.</w:t>
       </w:r>
     </w:p>
-    <w:bookmarkEnd w:id="149"/>
-    <w:bookmarkStart w:id="150" w:name="ref-duan1983"/>
+    <w:bookmarkEnd w:id="152"/>
+    <w:bookmarkStart w:id="153" w:name="ref-duan1983"/>
     <w:p>
       <w:pPr>
         <w:pStyle w:val="Bibliography"/>
@@ -58378,8 +58615,8 @@
         <w:t xml:space="preserve">, v. 78, n. 383, p. 605–610, 1983.</w:t>
       </w:r>
     </w:p>
-    <w:bookmarkEnd w:id="150"/>
-    <w:bookmarkStart w:id="151" w:name="ref-favero2024"/>
+    <w:bookmarkEnd w:id="153"/>
+    <w:bookmarkStart w:id="154" w:name="ref-favero2024"/>
     <w:p>
       <w:pPr>
         <w:pStyle w:val="Bibliography"/>
@@ -58418,8 +58655,8 @@
         <w:t xml:space="preserve">. 2. ed. Rio de Janeiro: GEN LTC, 2024.</w:t>
       </w:r>
     </w:p>
-    <w:bookmarkEnd w:id="151"/>
-    <w:bookmarkStart w:id="152" w:name="ref-firpo2018"/>
+    <w:bookmarkEnd w:id="154"/>
+    <w:bookmarkStart w:id="155" w:name="ref-firpo2018"/>
     <w:p>
       <w:pPr>
         <w:pStyle w:val="Bibliography"/>
@@ -58458,8 +58695,8 @@
         <w:t xml:space="preserve">, v. 6, n. 2, p. 28, 2018.</w:t>
       </w:r>
     </w:p>
-    <w:bookmarkEnd w:id="152"/>
-    <w:bookmarkStart w:id="153" w:name="ref-frank2013"/>
+    <w:bookmarkEnd w:id="155"/>
+    <w:bookmarkStart w:id="156" w:name="ref-frank2013"/>
     <w:p>
       <w:pPr>
         <w:pStyle w:val="Bibliography"/>
@@ -58521,8 +58758,8 @@
         <w:t xml:space="preserve">, v. 35, n. 4, p. 437–460, 2013.</w:t>
       </w:r>
     </w:p>
-    <w:bookmarkEnd w:id="153"/>
-    <w:bookmarkStart w:id="154" w:name="ref-geron2021"/>
+    <w:bookmarkEnd w:id="156"/>
+    <w:bookmarkStart w:id="157" w:name="ref-geron2021"/>
     <w:p>
       <w:pPr>
         <w:pStyle w:val="Bibliography"/>
@@ -58561,8 +58798,8 @@
         <w:t xml:space="preserve">. Tradução: Cibelle Ravaglia. 2. ed. Rio de Janeiro: Alta Books, 2021.</w:t>
       </w:r>
     </w:p>
-    <w:bookmarkEnd w:id="154"/>
-    <w:bookmarkStart w:id="155" w:name="ref-granovetter1973"/>
+    <w:bookmarkEnd w:id="157"/>
+    <w:bookmarkStart w:id="158" w:name="ref-granovetter1973"/>
     <w:p>
       <w:pPr>
         <w:pStyle w:val="Bibliography"/>
@@ -58601,8 +58838,8 @@
         <w:t xml:space="preserve">, v. 78, n. 6, p. 1360–1380, 1973.</w:t>
       </w:r>
     </w:p>
-    <w:bookmarkEnd w:id="155"/>
-    <w:bookmarkStart w:id="156" w:name="ref-hasenbalg1979"/>
+    <w:bookmarkEnd w:id="158"/>
+    <w:bookmarkStart w:id="159" w:name="ref-hasenbalg1979"/>
     <w:p>
       <w:pPr>
         <w:pStyle w:val="Bibliography"/>
@@ -58641,8 +58878,8 @@
         <w:t xml:space="preserve">. Rio de Janeiro: Graal, 1979.</w:t>
       </w:r>
     </w:p>
-    <w:bookmarkEnd w:id="156"/>
-    <w:bookmarkStart w:id="157" w:name="ref-henriques2001"/>
+    <w:bookmarkEnd w:id="159"/>
+    <w:bookmarkStart w:id="160" w:name="ref-henriques2001"/>
     <w:p>
       <w:pPr>
         <w:pStyle w:val="Bibliography"/>
@@ -58681,8 +58918,8 @@
         <w:t xml:space="preserve">, n. 807, 2001.</w:t>
       </w:r>
     </w:p>
-    <w:bookmarkEnd w:id="157"/>
-    <w:bookmarkStart w:id="158" w:name="ref-ibge_pof_2019"/>
+    <w:bookmarkEnd w:id="160"/>
+    <w:bookmarkStart w:id="161" w:name="ref-ibge_pof_2019"/>
     <w:p>
       <w:pPr>
         <w:pStyle w:val="Bibliography"/>
@@ -58721,8 +58958,8 @@
         <w:t xml:space="preserve">. Rio de Janeiro: Instituto Brasileiro de Geografia e Estatística, 2019.</w:t>
       </w:r>
     </w:p>
-    <w:bookmarkEnd w:id="158"/>
-    <w:bookmarkStart w:id="159" w:name="ref-ibge_pnad_2023"/>
+    <w:bookmarkEnd w:id="161"/>
+    <w:bookmarkStart w:id="162" w:name="ref-ibge_pnad_2023"/>
     <w:p>
       <w:pPr>
         <w:pStyle w:val="Bibliography"/>
@@ -58761,8 +58998,8 @@
         <w:t xml:space="preserve">. Rio de Janeiro: Instituto Brasileiro de Geografia e Estatística, 2023.</w:t>
       </w:r>
     </w:p>
-    <w:bookmarkEnd w:id="159"/>
-    <w:bookmarkStart w:id="160" w:name="ref-ibge_rendimentos_2025"/>
+    <w:bookmarkEnd w:id="162"/>
+    <w:bookmarkStart w:id="163" w:name="ref-ibge_rendimentos_2025"/>
     <w:p>
       <w:pPr>
         <w:pStyle w:val="Bibliography"/>
@@ -58801,8 +59038,8 @@
         <w:t xml:space="preserve">. Rio de Janeiro: Instituto Brasileiro de Geografia e Estatística, 2025.</w:t>
       </w:r>
     </w:p>
-    <w:bookmarkEnd w:id="160"/>
-    <w:bookmarkStart w:id="161" w:name="ref-koenker1978"/>
+    <w:bookmarkEnd w:id="163"/>
+    <w:bookmarkStart w:id="164" w:name="ref-koenker1978"/>
     <w:p>
       <w:pPr>
         <w:pStyle w:val="Bibliography"/>
@@ -58841,8 +59078,8 @@
         <w:t xml:space="preserve">, v. 46, n. 1, p. 33–50, 1978.</w:t>
       </w:r>
     </w:p>
-    <w:bookmarkEnd w:id="161"/>
-    <w:bookmarkStart w:id="162" w:name="ref-lundberg2017"/>
+    <w:bookmarkEnd w:id="164"/>
+    <w:bookmarkStart w:id="165" w:name="ref-lundberg2017"/>
     <w:p>
       <w:pPr>
         <w:pStyle w:val="Bibliography"/>
@@ -58881,8 +59118,8 @@
         <w:t xml:space="preserve">, v. 30, 2017.</w:t>
       </w:r>
     </w:p>
-    <w:bookmarkEnd w:id="162"/>
-    <w:bookmarkStart w:id="163" w:name="ref-manski1993"/>
+    <w:bookmarkEnd w:id="165"/>
+    <w:bookmarkStart w:id="166" w:name="ref-manski1993"/>
     <w:p>
       <w:pPr>
         <w:pStyle w:val="Bibliography"/>
@@ -58921,8 +59158,8 @@
         <w:t xml:space="preserve">, v. 60, n. 3, p. 531–542, 1993.</w:t>
       </w:r>
     </w:p>
-    <w:bookmarkEnd w:id="163"/>
-    <w:bookmarkStart w:id="164" w:name="ref-marques2010"/>
+    <w:bookmarkEnd w:id="166"/>
+    <w:bookmarkStart w:id="167" w:name="ref-marques2010"/>
     <w:p>
       <w:pPr>
         <w:pStyle w:val="Bibliography"/>
@@ -58961,8 +59198,8 @@
         <w:t xml:space="preserve">, v. 53, n. 1, p. 5–50, 2010.</w:t>
       </w:r>
     </w:p>
-    <w:bookmarkEnd w:id="164"/>
-    <w:bookmarkStart w:id="165" w:name="ref-oaxaca1973"/>
+    <w:bookmarkEnd w:id="167"/>
+    <w:bookmarkStart w:id="168" w:name="ref-oaxaca1973"/>
     <w:p>
       <w:pPr>
         <w:pStyle w:val="Bibliography"/>
@@ -59001,8 +59238,8 @@
         <w:t xml:space="preserve">, v. 14, n. 3, p. 693–709, 1973.</w:t>
       </w:r>
     </w:p>
-    <w:bookmarkEnd w:id="165"/>
-    <w:bookmarkStart w:id="166" w:name="ref-oaxaca_ransom1999"/>
+    <w:bookmarkEnd w:id="168"/>
+    <w:bookmarkStart w:id="169" w:name="ref-oaxaca_ransom1999"/>
     <w:p>
       <w:pPr>
         <w:pStyle w:val="Bibliography"/>
@@ -59041,8 +59278,8 @@
         <w:t xml:space="preserve">, v. 81, n. 1, p. 154–157, 1999.</w:t>
       </w:r>
     </w:p>
-    <w:bookmarkEnd w:id="166"/>
-    <w:bookmarkStart w:id="167" w:name="ref-pager2007"/>
+    <w:bookmarkEnd w:id="169"/>
+    <w:bookmarkStart w:id="170" w:name="ref-pager2007"/>
     <w:p>
       <w:pPr>
         <w:pStyle w:val="Bibliography"/>
@@ -59081,8 +59318,8 @@
         <w:t xml:space="preserve">. Chicago: University of Chicago Press, 2007.</w:t>
       </w:r>
     </w:p>
-    <w:bookmarkEnd w:id="167"/>
-    <w:bookmarkStart w:id="168" w:name="ref-raudenbush2002"/>
+    <w:bookmarkEnd w:id="170"/>
+    <w:bookmarkStart w:id="171" w:name="ref-raudenbush2002"/>
     <w:p>
       <w:pPr>
         <w:pStyle w:val="Bibliography"/>
@@ -59121,8 +59358,8 @@
         <w:t xml:space="preserve">. 2. ed. Thousand Oaks, CA: Sage, 2002.</w:t>
       </w:r>
     </w:p>
-    <w:bookmarkEnd w:id="168"/>
-    <w:bookmarkStart w:id="169" w:name="ref-sampson1997"/>
+    <w:bookmarkEnd w:id="171"/>
+    <w:bookmarkStart w:id="172" w:name="ref-sampson1997"/>
     <w:p>
       <w:pPr>
         <w:pStyle w:val="Bibliography"/>
@@ -59161,8 +59398,8 @@
         <w:t xml:space="preserve">, v. 277, p. 918–924, 1997.</w:t>
       </w:r>
     </w:p>
-    <w:bookmarkEnd w:id="169"/>
-    <w:bookmarkStart w:id="170" w:name="ref-soares2009"/>
+    <w:bookmarkEnd w:id="172"/>
+    <w:bookmarkStart w:id="173" w:name="ref-soares2009"/>
     <w:p>
       <w:pPr>
         <w:pStyle w:val="Bibliography"/>
@@ -59201,8 +59438,8 @@
         <w:t xml:space="preserve">, v. 39, n. 4, p. 803–825, 2009.</w:t>
       </w:r>
     </w:p>
-    <w:bookmarkEnd w:id="170"/>
-    <w:bookmarkStart w:id="171" w:name="ref-telles2004"/>
+    <w:bookmarkEnd w:id="173"/>
+    <w:bookmarkStart w:id="174" w:name="ref-telles2004"/>
     <w:p>
       <w:pPr>
         <w:pStyle w:val="Bibliography"/>
@@ -59241,8 +59478,8 @@
         <w:t xml:space="preserve">. Princeton: Princeton University Press, 2004.</w:t>
       </w:r>
     </w:p>
-    <w:bookmarkEnd w:id="171"/>
-    <w:bookmarkStart w:id="172" w:name="ref-vanderweele2017"/>
+    <w:bookmarkEnd w:id="174"/>
+    <w:bookmarkStart w:id="175" w:name="ref-vanderweele2017"/>
     <w:p>
       <w:pPr>
         <w:pStyle w:val="Bibliography"/>
@@ -59281,8 +59518,8 @@
         <w:t xml:space="preserve">, v. 167, n. 4, p. 268–274, 2017.</w:t>
       </w:r>
     </w:p>
-    <w:bookmarkEnd w:id="172"/>
-    <w:bookmarkStart w:id="174" w:name="ref-wilm2026"/>
+    <w:bookmarkEnd w:id="175"/>
+    <w:bookmarkStart w:id="177" w:name="ref-wilm2026"/>
     <w:p>
       <w:pPr>
         <w:pStyle w:val="Bibliography"/>
@@ -59336,7 +59573,7 @@
         </w:rPr>
         <w:t xml:space="preserve">. Belém: Imazon, 2026. Disponível em: &lt;</w:t>
       </w:r>
-      <w:hyperlink r:id="rId173">
+      <w:hyperlink r:id="rId176">
         <w:r>
           <w:rPr>
             <w:rStyle w:val="Hyperlink"/>
@@ -59352,8 +59589,8 @@
         <w:t xml:space="preserve">&gt;.</w:t>
       </w:r>
     </w:p>
-    <w:bookmarkEnd w:id="174"/>
-    <w:bookmarkStart w:id="175" w:name="ref-wilson1987"/>
+    <w:bookmarkEnd w:id="177"/>
+    <w:bookmarkStart w:id="178" w:name="ref-wilson1987"/>
     <w:p>
       <w:pPr>
         <w:pStyle w:val="Bibliography"/>
@@ -59392,9 +59629,9 @@
         <w:t xml:space="preserve">. Chicago: University of Chicago Press, 1987.</w:t>
       </w:r>
     </w:p>
-    <w:bookmarkEnd w:id="175"/>
-    <w:bookmarkEnd w:id="176"/>
-    <w:bookmarkEnd w:id="177"/>
+    <w:bookmarkEnd w:id="178"/>
+    <w:bookmarkEnd w:id="179"/>
+    <w:bookmarkEnd w:id="180"/>
     <w:sectPr>
       <w:headerReference r:id="rId11" w:type="default"/>
       <w:footerReference r:id="rId12" w:type="default"/>

</xml_diff>

<commit_message>
data(resultados): entregáveis após o segundo Relatório de Formatação (06/10/2026)
Norma 31/31, Word 49 páginas, fósseis 0, números sem fonte 0, validate consistente.

Co-Authored-By: Claude Opus 5.5 (1M context) <noreply@anthropic.com>
Claude-Session: https://claude.ai/code/session_01ATPBca6o9jxRv5wGBtSSkf
</commit_message>
<xml_diff>
--- a/entregaveis/TCC_Ricardo_Calheiros_MBA_USP_Esalq.docx
+++ b/entregaveis/TCC_Ricardo_Calheiros_MBA_USP_Esalq.docx
@@ -64,7 +64,7 @@
           <w:rFonts w:ascii="Arial" w:hAnsi="Arial"/>
           <w:sz w:val="22"/>
         </w:rPr>
-        <w:t xml:space="preserve">; Edilson José Rodrigues</w:t>
+        <w:t>; Edilson José Rodrigues</w:t>
       </w:r>
       <w:r>
         <w:rPr>
@@ -354,7 +354,7 @@
           <w:rFonts w:ascii="Arial" w:hAnsi="Arial"/>
           <w:sz w:val="22"/>
         </w:rPr>
-        <w:t xml:space="preserve">trabalhadores negros ganharam 6,1% a menos; o bairro mediou</w:t>
+        <w:t>trabalhadores negros ganharam 6,1% a menos; o bairro mediou</w:t>
       </w:r>
       <w:r>
         <w:rPr>
@@ -420,21 +420,21 @@
           <w:rFonts w:ascii="Arial" w:hAnsi="Arial"/>
           <w:sz w:val="22"/>
         </w:rPr>
-        <w:t xml:space="preserve">: diferencial racial de rendimentos;</w:t>
-      </w:r>
-      <w:r>
-        <w:rPr>
-          <w:rFonts w:ascii="Arial" w:hAnsi="Arial"/>
-          <w:sz w:val="22"/>
-        </w:rPr>
-        <w:t xml:space="preserve"> </w:t>
-      </w:r>
-      <w:r>
-        <w:rPr>
-          <w:rFonts w:ascii="Arial" w:hAnsi="Arial"/>
-          <w:sz w:val="22"/>
-        </w:rPr>
-        <w:t xml:space="preserve">segregação residencial; teto de vidro; decomposição de Oaxaca–Blinder;</w:t>
+        <w:t>: diferencial racial de rendimentos;</w:t>
+      </w:r>
+      <w:r>
+        <w:rPr>
+          <w:rFonts w:ascii="Arial" w:hAnsi="Arial"/>
+          <w:sz w:val="22"/>
+        </w:rPr>
+        <w:t xml:space="preserve"> </w:t>
+      </w:r>
+      <w:r>
+        <w:rPr>
+          <w:rFonts w:ascii="Arial" w:hAnsi="Arial"/>
+          <w:sz w:val="22"/>
+        </w:rPr>
+        <w:t>segregação residencial; teto de vidro; decomposição de Oaxaca–Blinder;</w:t>
       </w:r>
       <w:r>
         <w:rPr>
@@ -642,7 +642,7 @@
           <w:rFonts w:ascii="Arial" w:hAnsi="Arial"/>
           <w:sz w:val="22"/>
         </w:rPr>
-        <w:t xml:space="preserve">age, sex and neighbourhood, Black workers earned 6.1% less; the</w:t>
+        <w:t>age, sex and neighbourhood, Black workers earned 6.1% less; the</w:t>
       </w:r>
       <w:r>
         <w:rPr>
@@ -708,21 +708,21 @@
           <w:rFonts w:ascii="Arial" w:hAnsi="Arial"/>
           <w:sz w:val="22"/>
         </w:rPr>
-        <w:t xml:space="preserve">: racial earnings gap; residential segregation; glass</w:t>
-      </w:r>
-      <w:r>
-        <w:rPr>
-          <w:rFonts w:ascii="Arial" w:hAnsi="Arial"/>
-          <w:sz w:val="22"/>
-        </w:rPr>
-        <w:t xml:space="preserve"> </w:t>
-      </w:r>
-      <w:r>
-        <w:rPr>
-          <w:rFonts w:ascii="Arial" w:hAnsi="Arial"/>
-          <w:sz w:val="22"/>
-        </w:rPr>
-        <w:t xml:space="preserve">ceiling; Oaxaca–Blinder decomposition; intersectionality.</w:t>
+        <w:t>: racial earnings gap; residential segregation; glass</w:t>
+      </w:r>
+      <w:r>
+        <w:rPr>
+          <w:rFonts w:ascii="Arial" w:hAnsi="Arial"/>
+          <w:sz w:val="22"/>
+        </w:rPr>
+        <w:t xml:space="preserve"> </w:t>
+      </w:r>
+      <w:r>
+        <w:rPr>
+          <w:rFonts w:ascii="Arial" w:hAnsi="Arial"/>
+          <w:sz w:val="22"/>
+        </w:rPr>
+        <w:t>ceiling; Oaxaca–Blinder decomposition; intersectionality.</w:t>
       </w:r>
     </w:p>
     <w:bookmarkStart w:id="22" w:name="considerações-iniciais"/>
@@ -845,7 +845,7 @@
           <w:rFonts w:ascii="Arial" w:hAnsi="Arial"/>
           <w:sz w:val="22"/>
         </w:rPr>
-        <w:t xml:space="preserve">explicação usual atribui esse hiato a diferenças de qualificação; se ela fosse</w:t>
+        <w:t>explicação usual atribui esse hiato a diferenças de qualificação; se ela fosse</w:t>
       </w:r>
       <w:r>
         <w:rPr>
@@ -965,7 +965,7 @@
           <w:rFonts w:ascii="Arial" w:hAnsi="Arial"/>
           <w:sz w:val="22"/>
         </w:rPr>
-        <w:t xml:space="preserve">discriminação por preferência, que a concorrência tenderia a erodir;</w:t>
+        <w:t>discriminação por preferência, que a concorrência tenderia a erodir;</w:t>
       </w:r>
       <w:r>
         <w:rPr>
@@ -1071,21 +1071,21 @@
           <w:rFonts w:ascii="Arial" w:hAnsi="Arial"/>
           <w:sz w:val="22"/>
         </w:rPr>
-        <w:t xml:space="preserve">ele é desvio moral de pessoas; na institucional, está nas regras e práticas das</w:t>
-      </w:r>
-      <w:r>
-        <w:rPr>
-          <w:rFonts w:ascii="Arial" w:hAnsi="Arial"/>
-          <w:sz w:val="22"/>
-        </w:rPr>
-        <w:t xml:space="preserve"> </w:t>
-      </w:r>
-      <w:r>
-        <w:rPr>
-          <w:rFonts w:ascii="Arial" w:hAnsi="Arial"/>
-          <w:sz w:val="22"/>
-        </w:rPr>
-        <w:t xml:space="preserve">organizações, que conferem vantagens a um grupo mesmo sem intenção explícita; na</w:t>
+        <w:t>ele é desvio moral de pessoas; na institucional, está nas regras e práticas das</w:t>
+      </w:r>
+      <w:r>
+        <w:rPr>
+          <w:rFonts w:ascii="Arial" w:hAnsi="Arial"/>
+          <w:sz w:val="22"/>
+        </w:rPr>
+        <w:t xml:space="preserve"> </w:t>
+      </w:r>
+      <w:r>
+        <w:rPr>
+          <w:rFonts w:ascii="Arial" w:hAnsi="Arial"/>
+          <w:sz w:val="22"/>
+        </w:rPr>
+        <w:t>organizações, que conferem vantagens a um grupo mesmo sem intenção explícita; na</w:t>
       </w:r>
       <w:r>
         <w:rPr>
@@ -1225,35 +1225,35 @@
           <w:rFonts w:ascii="Arial" w:hAnsi="Arial"/>
           <w:sz w:val="22"/>
         </w:rPr>
-        <w:t xml:space="preserve">de igualadas as características individuais; a sua mediação por estruturas — o</w:t>
-      </w:r>
-      <w:r>
-        <w:rPr>
-          <w:rFonts w:ascii="Arial" w:hAnsi="Arial"/>
-          <w:sz w:val="22"/>
-        </w:rPr>
-        <w:t xml:space="preserve"> </w:t>
-      </w:r>
-      <w:r>
-        <w:rPr>
-          <w:rFonts w:ascii="Arial" w:hAnsi="Arial"/>
-          <w:sz w:val="22"/>
-        </w:rPr>
-        <w:t xml:space="preserve">bairro de moradia e a porta das ocupações; e a sua acumulação onde se decide a</w:t>
-      </w:r>
-      <w:r>
-        <w:rPr>
-          <w:rFonts w:ascii="Arial" w:hAnsi="Arial"/>
-          <w:sz w:val="22"/>
-        </w:rPr>
-        <w:t xml:space="preserve"> </w:t>
-      </w:r>
-      <w:r>
-        <w:rPr>
-          <w:rFonts w:ascii="Arial" w:hAnsi="Arial"/>
-          <w:sz w:val="22"/>
-        </w:rPr>
-        <w:t xml:space="preserve">ascensão. Os métodos medem as marcas, não as intenções; por isso o texto fala em</w:t>
+        <w:t>de igualadas as características individuais; a sua mediação por estruturas — o</w:t>
+      </w:r>
+      <w:r>
+        <w:rPr>
+          <w:rFonts w:ascii="Arial" w:hAnsi="Arial"/>
+          <w:sz w:val="22"/>
+        </w:rPr>
+        <w:t xml:space="preserve"> </w:t>
+      </w:r>
+      <w:r>
+        <w:rPr>
+          <w:rFonts w:ascii="Arial" w:hAnsi="Arial"/>
+          <w:sz w:val="22"/>
+        </w:rPr>
+        <w:t>bairro de moradia e a porta das ocupações; e a sua acumulação onde se decide a</w:t>
+      </w:r>
+      <w:r>
+        <w:rPr>
+          <w:rFonts w:ascii="Arial" w:hAnsi="Arial"/>
+          <w:sz w:val="22"/>
+        </w:rPr>
+        <w:t xml:space="preserve"> </w:t>
+      </w:r>
+      <w:r>
+        <w:rPr>
+          <w:rFonts w:ascii="Arial" w:hAnsi="Arial"/>
+          <w:sz w:val="22"/>
+        </w:rPr>
+        <w:t>ascensão. Os métodos medem as marcas, não as intenções; por isso o texto fala em</w:t>
       </w:r>
       <w:r>
         <w:rPr>
@@ -1317,7 +1317,7 @@
           <w:rFonts w:ascii="Arial" w:hAnsi="Arial"/>
           <w:sz w:val="22"/>
         </w:rPr>
-        <w:t xml:space="preserve">; os efeitos de vizinhança, pelos quais</w:t>
+        <w:t>; os efeitos de vizinhança, pelos quais</w:t>
       </w:r>
       <w:r>
         <w:rPr>
@@ -1359,14 +1359,14 @@
           <w:rFonts w:ascii="Arial" w:hAnsi="Arial"/>
           <w:sz w:val="22"/>
         </w:rPr>
-        <w:t xml:space="preserve">(Marques, 2010; Sampson et al., 1997; Wilson, 1987)</w:t>
-      </w:r>
-      <w:r>
-        <w:rPr>
-          <w:rFonts w:ascii="Arial" w:hAnsi="Arial"/>
-          <w:sz w:val="22"/>
-        </w:rPr>
-        <w:t xml:space="preserve">; e a subvalorização do</w:t>
+        <w:t>(Marques, 2010; Wilson, 1987; Sampson et al., 1997)</w:t>
+      </w:r>
+      <w:r>
+        <w:rPr>
+          <w:rFonts w:ascii="Arial" w:hAnsi="Arial"/>
+          <w:sz w:val="22"/>
+        </w:rPr>
+        <w:t>; e a subvalorização do</w:t>
       </w:r>
       <w:r>
         <w:rPr>
@@ -1394,7 +1394,7 @@
           <w:rFonts w:ascii="Arial" w:hAnsi="Arial"/>
           <w:sz w:val="22"/>
         </w:rPr>
-        <w:t xml:space="preserve">(Henriques, 2001; Soares, 2009)</w:t>
+        <w:t>(Henriques, 2001; Soares, 2009)</w:t>
       </w:r>
       <w:r>
         <w:rPr>
@@ -1444,21 +1444,21 @@
           <w:rFonts w:ascii="Arial" w:hAnsi="Arial"/>
           <w:sz w:val="22"/>
         </w:rPr>
-        <w:t xml:space="preserve">mediada pelo bairro de moradia (H1); que a penalidade se agrava no topo da</w:t>
-      </w:r>
-      <w:r>
-        <w:rPr>
-          <w:rFonts w:ascii="Arial" w:hAnsi="Arial"/>
-          <w:sz w:val="22"/>
-        </w:rPr>
-        <w:t xml:space="preserve"> </w:t>
-      </w:r>
-      <w:r>
-        <w:rPr>
-          <w:rFonts w:ascii="Arial" w:hAnsi="Arial"/>
-          <w:sz w:val="22"/>
-        </w:rPr>
-        <w:t xml:space="preserve">distribuição, configurando teto de vidro (H2); e que a barreira opera antes do</w:t>
+        <w:t>mediada pelo bairro de moradia (H1); que a penalidade se agrava no topo da</w:t>
+      </w:r>
+      <w:r>
+        <w:rPr>
+          <w:rFonts w:ascii="Arial" w:hAnsi="Arial"/>
+          <w:sz w:val="22"/>
+        </w:rPr>
+        <w:t xml:space="preserve"> </w:t>
+      </w:r>
+      <w:r>
+        <w:rPr>
+          <w:rFonts w:ascii="Arial" w:hAnsi="Arial"/>
+          <w:sz w:val="22"/>
+        </w:rPr>
+        <w:t>distribuição, configurando teto de vidro (H2); e que a barreira opera antes do</w:t>
       </w:r>
       <w:r>
         <w:rPr>
@@ -1962,7 +1962,7 @@
           <w:rFonts w:ascii="Arial" w:hAnsi="Arial"/>
           <w:sz w:val="22"/>
         </w:rPr>
-        <w:t xml:space="preserve">de 2026 pelo deflator oficial da PNAD Contínua (IBGE), que varia por UF e trimestre;</w:t>
+        <w:t>de 2026 pelo deflator oficial da PNAD Contínua (IBGE), que varia por UF e trimestre;</w:t>
       </w:r>
       <w:r>
         <w:rPr>
@@ -2373,7 +2373,7 @@
           <w:rFonts w:ascii="Arial" w:hAnsi="Arial"/>
           <w:sz w:val="22"/>
         </w:rPr>
-        <w:t xml:space="preserve">territorial que a PNAD identifica e a mais próxima da ideia de vizinhança; por isso, ao longo</w:t>
+        <w:t>territorial que a PNAD identifica e a mais próxima da ideia de vizinhança; por isso, ao longo</w:t>
       </w:r>
       <w:r>
         <w:rPr>
@@ -2450,7 +2450,7 @@
           <w:rFonts w:ascii="Arial" w:hAnsi="Arial"/>
           <w:sz w:val="22"/>
         </w:rPr>
-        <w:t xml:space="preserve">variância, erros-padrão agrupados —, o texto usa UPA; no restante, bairro.</w:t>
+        <w:t>variância, erros-padrão agrupados —, o texto usa UPA; no restante, bairro.</w:t>
       </w:r>
     </w:p>
     <w:p>
@@ -2521,7 +2521,7 @@
           <w:rFonts w:ascii="Arial" w:hAnsi="Arial"/>
           <w:sz w:val="22"/>
         </w:rPr>
-        <w:t xml:space="preserve">pardo (código 4);</w:t>
+        <w:t>pardo (código 4);</w:t>
       </w:r>
       <w:r>
         <w:rPr>
@@ -5366,7 +5366,7 @@
           <w:rFonts w:ascii="Arial" w:hAnsi="Arial"/>
           <w:sz w:val="22"/>
         </w:rPr>
-        <w:t xml:space="preserve">; valores acima de</w:t>
+        <w:t>; valores acima de</w:t>
       </w:r>
       <w:r>
         <w:rPr>
@@ -5439,7 +5439,7 @@
           <w:rFonts w:ascii="Arial" w:hAnsi="Arial"/>
           <w:sz w:val="22"/>
         </w:rPr>
-        <w:t xml:space="preserve">; 3.271.443 brancos e 4.427.835 negros)</w:t>
+        <w:t>; 3.271.443 brancos e 4.427.835 negros)</w:t>
       </w:r>
       <w:r>
         <w:rPr>
@@ -5627,7 +5627,7 @@
           <w:rFonts w:ascii="Arial" w:hAnsi="Arial"/>
           <w:sz w:val="22"/>
         </w:rPr>
-        <w:t xml:space="preserve">media parte do gap racial; o modelo, portanto, coloca</w:t>
+        <w:t>media parte do gap racial; o modelo, portanto, coloca</w:t>
       </w:r>
       <w:r>
         <w:rPr>
@@ -5952,9 +5952,6 @@
             </m:r>
           </m:sub>
         </m:sSub>
-        <m:r>
-          <m:t> </m:t>
-        </m:r>
         <m:sSub>
           <m:e>
             <m:r>
@@ -5988,9 +5985,6 @@
             </m:r>
           </m:sub>
         </m:sSub>
-        <m:r>
-          <m:t> </m:t>
-        </m:r>
         <m:sSubSup>
           <m:e>
             <m:r>
@@ -6017,61 +6011,39 @@
           </m:rPr>
           <m:t>+</m:t>
         </m:r>
-        <m:nary>
-          <m:naryPr>
-            <m:chr m:val="∑"/>
-            <m:limLoc m:val="undOvr"/>
-            <m:subHide m:val="off"/>
-            <m:supHide m:val="on"/>
-          </m:naryPr>
+        <m:sSubSup>
+          <m:e>
+            <m:r>
+              <m:rPr>
+                <m:sty m:val="bi"/>
+              </m:rPr>
+              <m:t>β</m:t>
+            </m:r>
+          </m:e>
           <m:sub>
             <m:r>
-              <m:t>e</m:t>
+              <m:t>E</m:t>
             </m:r>
           </m:sub>
           <m:sup>
             <m:r>
-              <m:t>​</m:t>
+              <m:rPr>
+                <m:sty m:val="p"/>
+              </m:rPr>
+              <m:t>′</m:t>
             </m:r>
           </m:sup>
-          <m:e>
-            <m:sSub>
-              <m:e>
-                <m:r>
-                  <m:t>β</m:t>
-                </m:r>
-              </m:e>
-              <m:sub>
-                <m:r>
-                  <m:t>e</m:t>
-                </m:r>
-              </m:sub>
-            </m:sSub>
-          </m:e>
-        </m:nary>
-        <m:r>
-          <m:t> </m:t>
-        </m:r>
+        </m:sSubSup>
         <m:sSub>
           <m:e>
             <m:r>
               <m:rPr>
-                <m:nor/>
-                <m:sty m:val="p"/>
+                <m:sty m:val="bi"/>
               </m:rPr>
-              <m:t>Educ</m:t>
+              <m:t>E</m:t>
             </m:r>
           </m:e>
           <m:sub>
-            <m:r>
-              <m:t>e</m:t>
-            </m:r>
-            <m:r>
-              <m:rPr>
-                <m:sty m:val="p"/>
-              </m:rPr>
-              <m:t>,</m:t>
-            </m:r>
             <m:r>
               <m:t>i</m:t>
             </m:r>
@@ -6192,6 +6164,35 @@
           <m:rPr>
             <m:sty m:val="bi"/>
           </m:rPr>
+          <m:t>E</m:t>
+        </m:r>
+      </m:oMath>
+      <w:r>
+        <w:rPr>
+          <w:rFonts w:ascii="Arial" w:hAnsi="Arial"/>
+          <w:sz w:val="22"/>
+        </w:rPr>
+        <w:t xml:space="preserve"> </w:t>
+      </w:r>
+      <w:r>
+        <w:rPr>
+          <w:rFonts w:ascii="Arial" w:hAnsi="Arial"/>
+          <w:sz w:val="22"/>
+        </w:rPr>
+        <w:t xml:space="preserve">reúne as variáveis indicadoras cumulativas de escolaridade,</w:t>
+      </w:r>
+      <w:r>
+        <w:rPr>
+          <w:rFonts w:ascii="Arial" w:hAnsi="Arial"/>
+          <w:sz w:val="22"/>
+        </w:rPr>
+        <w:t xml:space="preserve"> </w:t>
+      </w:r>
+      <m:oMath>
+        <m:r>
+          <m:rPr>
+            <m:sty m:val="bi"/>
+          </m:rPr>
           <m:t>Z</m:t>
         </m:r>
       </m:oMath>
@@ -6207,21 +6208,7 @@
           <w:rFonts w:ascii="Arial" w:hAnsi="Arial"/>
           <w:sz w:val="22"/>
         </w:rPr>
-        <w:t xml:space="preserve">reúne horas, situação urbana e ano (e, no M4, vínculo e</w:t>
-      </w:r>
-      <w:r>
-        <w:rPr>
-          <w:rFonts w:ascii="Arial" w:hAnsi="Arial"/>
-          <w:sz w:val="22"/>
-        </w:rPr>
-        <w:t xml:space="preserve"> </w:t>
-      </w:r>
-      <w:r>
-        <w:rPr>
-          <w:rFonts w:ascii="Arial" w:hAnsi="Arial"/>
-          <w:sz w:val="22"/>
-        </w:rPr>
-        <w:t xml:space="preserve">grupo CBO), e o termo de erro é</w:t>
+        <w:t xml:space="preserve">reúne horas, situação urbana e ano (e, no M4, vínculo e grupo CBO), e o termo de erro é</w:t>
       </w:r>
       <w:r>
         <w:rPr>
@@ -7025,7 +7012,7 @@
           <w:rFonts w:ascii="Arial" w:hAnsi="Arial"/>
           <w:sz w:val="22"/>
         </w:rPr>
-        <w:t xml:space="preserve">bairros; valores</w:t>
+        <w:t>bairros; valores</w:t>
       </w:r>
       <w:r>
         <w:rPr>
@@ -7153,21 +7140,21 @@
           <w:rFonts w:ascii="Arial" w:hAnsi="Arial"/>
           <w:sz w:val="22"/>
         </w:rPr>
-        <w:t xml:space="preserve">são estimados em degraus aninhados: M0 (nulo: só o intercepto aleatório, que dá o ICC);</w:t>
-      </w:r>
-      <w:r>
-        <w:rPr>
-          <w:rFonts w:ascii="Arial" w:hAnsi="Arial"/>
-          <w:sz w:val="22"/>
-        </w:rPr>
-        <w:t xml:space="preserve"> </w:t>
-      </w:r>
-      <w:r>
-        <w:rPr>
-          <w:rFonts w:ascii="Arial" w:hAnsi="Arial"/>
-          <w:sz w:val="22"/>
-        </w:rPr>
-        <w:t xml:space="preserve">M1 (+ capital humano e demografia); M2 (+ contexto do bairro, nível 2); M3 (+ efeitos</w:t>
+        <w:t>são estimados em degraus aninhados: M0 (nulo: só o intercepto aleatório, que dá o ICC);</w:t>
+      </w:r>
+      <w:r>
+        <w:rPr>
+          <w:rFonts w:ascii="Arial" w:hAnsi="Arial"/>
+          <w:sz w:val="22"/>
+        </w:rPr>
+        <w:t xml:space="preserve"> </w:t>
+      </w:r>
+      <w:r>
+        <w:rPr>
+          <w:rFonts w:ascii="Arial" w:hAnsi="Arial"/>
+          <w:sz w:val="22"/>
+        </w:rPr>
+        <w:t>M1 (+ capital humano e demografia); M2 (+ contexto do bairro, nível 2); M3 (+ efeitos</w:t>
       </w:r>
       <w:r>
         <w:rPr>
@@ -7204,7 +7191,7 @@
           <w:rFonts w:ascii="Arial" w:hAnsi="Arial"/>
           <w:sz w:val="22"/>
         </w:rPr>
-        <w:t xml:space="preserve">; e M4 (+ vínculo</w:t>
+        <w:t>; e M4 (+ vínculo</w:t>
       </w:r>
       <w:r>
         <w:rPr>
@@ -7544,7 +7531,7 @@
           <w:rFonts w:ascii="Arial" w:hAnsi="Arial"/>
           <w:sz w:val="22"/>
         </w:rPr>
-        <w:t xml:space="preserve">degraus; com</w:t>
+        <w:t>degraus; com</w:t>
       </w:r>
       <w:r>
         <w:rPr>
@@ -7664,7 +7651,7 @@
           <w:rFonts w:ascii="Arial" w:hAnsi="Arial"/>
           <w:sz w:val="22"/>
         </w:rPr>
-        <w:t xml:space="preserve">por ML e 0,30182 por REML;</w:t>
+        <w:t>por ML e 0,30182 por REML;</w:t>
       </w:r>
       <w:r>
         <w:rPr>
@@ -8112,7 +8099,7 @@
           <w:rFonts w:ascii="Arial" w:hAnsi="Arial"/>
           <w:sz w:val="22"/>
         </w:rPr>
-        <w:t xml:space="preserve">os controles do HLM M3 —, comparável à literatura; e (B) acrescentando formalidade e</w:t>
+        <w:t>os controles do HLM M3 —, comparável à literatura; e (B) acrescentando formalidade e</w:t>
       </w:r>
       <w:r>
         <w:rPr>
@@ -8363,7 +8350,7 @@
           <w:rFonts w:ascii="Arial" w:hAnsi="Arial"/>
           <w:sz w:val="22"/>
         </w:rPr>
-        <w:t xml:space="preserve">, agora com função de ligação logit; o ICC do nível de</w:t>
+        <w:t>, agora com função de ligação logit; o ICC do nível de</w:t>
       </w:r>
       <w:r>
         <w:rPr>
@@ -8876,7 +8863,7 @@
           <w:rFonts w:ascii="Arial" w:hAnsi="Arial"/>
           <w:sz w:val="22"/>
         </w:rPr>
-        <w:t xml:space="preserve">— os mesmos extremos da decomposição RIF —; o</w:t>
+        <w:t>— os mesmos extremos da decomposição RIF —; o</w:t>
       </w:r>
       <w:r>
         <w:rPr>
@@ -9241,7 +9228,7 @@
           <w:rFonts w:ascii="Arial" w:hAnsi="Arial"/>
           <w:sz w:val="22"/>
         </w:rPr>
-        <w:t xml:space="preserve">para explicar o efeito observado; e o índice de</w:t>
+        <w:t>para explicar o efeito observado; e o índice de</w:t>
       </w:r>
       <w:r>
         <w:rPr>
@@ -9499,7 +9486,7 @@
           <w:rFonts w:ascii="Arial" w:hAnsi="Arial"/>
           <w:sz w:val="22"/>
         </w:rPr>
-        <w:t xml:space="preserve">; quando reportado, usa a distribuição</w:t>
+        <w:t>; quando reportado, usa a distribuição</w:t>
       </w:r>
       <w:r>
         <w:rPr>
@@ -9560,7 +9547,7 @@
           <w:rFonts w:ascii="Arial" w:hAnsi="Arial"/>
           <w:sz w:val="22"/>
         </w:rPr>
-        <w:t xml:space="preserve">graus de liberdade. No HLM, o intercepto aleatório de UPA modela explicitamente a correlação intra-bairro, de modo que o erro-padrão do modelo já a incorpora (sob a hipótese de efeitos aleatórios); como contraprova, os coeficientes do HLM são comparados aos do OLS com efeitos fixos de UF e erro-padrão agrupado por UPA, que coincidem em sinal, magnitude e significância. No OLS com efeitos fixos de UF (especificação do M3), o erro-padrão de</w:t>
+        <w:t>graus de liberdade. No HLM, o intercepto aleatório de UPA modela explicitamente a correlação intra-bairro, de modo que o erro-padrão do modelo já a incorpora (sob a hipótese de efeitos aleatórios); como contraprova, os coeficientes do HLM são comparados aos do OLS com efeitos fixos de UF e erro-padrão agrupado por UPA, que coincidem em sinal, magnitude e significância. No OLS com efeitos fixos de UF (especificação do M3), o erro-padrão de</w:t>
       </w:r>
       <w:r>
         <w:rPr>
@@ -9606,7 +9593,7 @@
           <w:rFonts w:ascii="Arial" w:hAnsi="Arial"/>
           <w:sz w:val="22"/>
         </w:rPr>
-        <w:t xml:space="preserve">passa de 0,0005 (convencional) para 0,0009 (agrupado por UPA) e 0,0033 (agrupado por UF); para o regressor de contexto</w:t>
+        <w:t>passa de 0,0005 (convencional) para 0,0009 (agrupado por UPA) e 0,0033 (agrupado por UF); para o regressor de contexto</w:t>
       </w:r>
       <w:r>
         <w:rPr>
@@ -9770,7 +9757,7 @@
           <w:rFonts w:ascii="Arial" w:hAnsi="Arial"/>
           <w:sz w:val="22"/>
         </w:rPr>
-        <w:t xml:space="preserve">permanece acima de 19 mesmo no agrupamento mais conservador, nenhuma conclusão sobre o gap racial depende da escolha do erro-padrão; a correção importa para os coeficientes contextuais e para as variáveis de UF.</w:t>
+        <w:t>permanece acima de 19 mesmo no agrupamento mais conservador, nenhuma conclusão sobre o gap racial depende da escolha do erro-padrão; a correção importa para os coeficientes contextuais e para as variáveis de UF.</w:t>
       </w:r>
     </w:p>
     <w:p>
@@ -9994,7 +9981,7 @@
           <w:rFonts w:ascii="Arial" w:hAnsi="Arial"/>
           <w:sz w:val="22"/>
         </w:rPr>
-        <w:t xml:space="preserve">, e a parcela de preço da Oaxaca–Blinder (A) de 17,9% a 15,3%. O modelo multinível ponderado (pacote WeMix, do R) mostrou-se computacionalmente inviável com 41 mil UPAs e fica como agenda; os demais resultados são não ponderados.</w:t>
+        <w:t>, e a parcela de preço da Oaxaca–Blinder (A) de 17,9% a 15,3%. O modelo multinível ponderado (pacote WeMix, do R) mostrou-se computacionalmente inviável com 41 mil UPAs e fica como agenda; os demais resultados são não ponderados.</w:t>
       </w:r>
     </w:p>
     <w:p>
@@ -12481,7 +12468,7 @@
           <w:rFonts w:ascii="Arial" w:hAnsi="Arial"/>
           <w:sz w:val="22"/>
         </w:rPr>
-        <w:t xml:space="preserve">foi escolhida por validação cruzada (Tabela 14), e não por conveniência;</w:t>
+        <w:t>foi escolhida por validação cruzada (Tabela 14), e não por conveniência;</w:t>
       </w:r>
       <w:r>
         <w:rPr>
@@ -12607,7 +12594,7 @@
           <w:rFonts w:ascii="Arial" w:hAnsi="Arial"/>
           <w:sz w:val="22"/>
         </w:rPr>
-        <w:t xml:space="preserve">ajustados e avaliados na população completa; só o cálculo dos valores SHAP usa uma amostra</w:t>
+        <w:t>ajustados e avaliados na população completa; só o cálculo dos valores SHAP usa uma amostra</w:t>
       </w:r>
       <w:r>
         <w:rPr>
@@ -12683,7 +12670,7 @@
           <w:rFonts w:ascii="Arial" w:hAnsi="Arial"/>
           <w:sz w:val="22"/>
         </w:rPr>
-        <w:t xml:space="preserve">Os resultados seguem a trajetória anunciada nas Considerações Iniciais: o bairro, a composição do diferencial, a porta das ocupações, a escada da distribuição de renda, a interseção de raça e gênero e o que o agregado esconde por cor, setor e idade. Cada etapa responde a uma pergunta e deixa a seguinte; a Discussão, ao final, reúne as respostas e as confronta com as políticas vigentes.</w:t>
+        <w:t>Os resultados seguem a trajetória anunciada nas Considerações Iniciais: o bairro, a composição do diferencial, a porta das ocupações, a escada da distribuição de renda, a interseção de raça e gênero e o que o agregado esconde por cor, setor e idade. Cada etapa responde a uma pergunta e deixa a seguinte; a Discussão, ao final, reúne as respostas e as confronta com as políticas vigentes.</w:t>
       </w:r>
     </w:p>
     <w:bookmarkStart w:id="52" w:name="Xf873877e7a67a97c590f3d0007ecfbb5641a604"/>
@@ -12884,1422 +12871,7 @@
         <w:t xml:space="preserve">aproximar-se de zero à medida que cada degrau acrescenta um bloco de controles.</w:t>
       </w:r>
     </w:p>
-    <w:p>
-      <w:pPr>
-        <w:pStyle w:val="BodyText"/>
-        <w:spacing w:line="360" w:lineRule="auto" w:after="0"/>
-        <w:ind w:firstLine="709"/>
-        <w:jc w:val="both"/>
-      </w:pPr>
-      <w:r>
-        <w:rPr>
-          <w:rFonts w:ascii="Arial" w:hAnsi="Arial"/>
-          <w:b/>
-          <w:bCs/>
-          <w:sz w:val="22"/>
-        </w:rPr>
-        <w:t xml:space="preserve">Mais de um terço da diferença de renda está entre bairros, não dentro deles.</w:t>
-      </w:r>
-      <w:r>
-        <w:rPr>
-          <w:rFonts w:ascii="Arial" w:hAnsi="Arial"/>
-          <w:sz w:val="22"/>
-        </w:rPr>
-        <w:t xml:space="preserve"> </w:t>
-      </w:r>
-      <w:r>
-        <w:rPr>
-          <w:rFonts w:ascii="Arial" w:hAnsi="Arial"/>
-          <w:sz w:val="22"/>
-        </w:rPr>
-        <w:t xml:space="preserve">Antes de qualquer controle, o modelo nulo reparte a variação do log-rendimento em duas</w:t>
-      </w:r>
-      <w:r>
-        <w:rPr>
-          <w:rFonts w:ascii="Arial" w:hAnsi="Arial"/>
-          <w:sz w:val="22"/>
-        </w:rPr>
-        <w:t xml:space="preserve"> </w:t>
-      </w:r>
-      <w:r>
-        <w:rPr>
-          <w:rFonts w:ascii="Arial" w:hAnsi="Arial"/>
-          <w:sz w:val="22"/>
-        </w:rPr>
-        <w:t xml:space="preserve">parcelas: a que separa um bairro de outro e a que separa dois vizinhos. O ICC da UPA é</w:t>
-      </w:r>
-      <w:r>
-        <w:rPr>
-          <w:rFonts w:ascii="Arial" w:hAnsi="Arial"/>
-          <w:sz w:val="22"/>
-        </w:rPr>
-        <w:t xml:space="preserve"> </w:t>
-      </w:r>
-      <w:r>
-        <w:rPr>
-          <w:rFonts w:ascii="Arial" w:hAnsi="Arial"/>
-          <w:sz w:val="22"/>
-        </w:rPr>
-        <w:t xml:space="preserve">de 0,353</w:t>
-      </w:r>
-      <w:r>
-        <w:rPr>
-          <w:rStyle w:val="FootnoteReference"/>
-          <w:rFonts w:ascii="Arial" w:hAnsi="Arial"/>
-          <w:sz w:val="22"/>
-          <w:vertAlign w:val="superscript"/>
-        </w:rPr>
-        <w:footnoteReference w:id="35"/>
-      </w:r>
-      <w:r>
-        <w:rPr>
-          <w:rFonts w:ascii="Arial" w:hAnsi="Arial"/>
-          <w:sz w:val="22"/>
-        </w:rPr>
-        <w:t xml:space="preserve"> </w:t>
-      </w:r>
-      <w:r>
-        <w:rPr>
-          <w:rFonts w:ascii="Arial" w:hAnsi="Arial"/>
-          <w:sz w:val="22"/>
-        </w:rPr>
-        <w:t xml:space="preserve">— isto é,</w:t>
-      </w:r>
-      <w:r>
-        <w:rPr>
-          <w:rFonts w:ascii="Arial" w:hAnsi="Arial"/>
-          <w:sz w:val="22"/>
-        </w:rPr>
-        <w:t xml:space="preserve"> </w:t>
-      </w:r>
-      <w:r>
-        <w:rPr>
-          <w:rFonts w:ascii="Arial" w:hAnsi="Arial"/>
-          <w:b/>
-          <w:bCs/>
-          <w:sz w:val="22"/>
-        </w:rPr>
-        <w:t xml:space="preserve">35,3% da</w:t>
-      </w:r>
-      <w:r>
-        <w:rPr>
-          <w:rFonts w:ascii="Arial" w:hAnsi="Arial"/>
-          <w:b/>
-          <w:bCs/>
-          <w:sz w:val="22"/>
-        </w:rPr>
-        <w:t xml:space="preserve"> </w:t>
-      </w:r>
-      <w:r>
-        <w:rPr>
-          <w:rFonts w:ascii="Arial" w:hAnsi="Arial"/>
-          <w:b/>
-          <w:bCs/>
-          <w:sz w:val="22"/>
-        </w:rPr>
-        <w:t xml:space="preserve">variância do log-rendimento está entre bairros</w:t>
-      </w:r>
-      <w:r>
-        <w:rPr>
-          <w:rFonts w:ascii="Arial" w:hAnsi="Arial"/>
-          <w:sz w:val="22"/>
-        </w:rPr>
-        <w:t xml:space="preserve">. Em linguagem de leitor: de toda a</w:t>
-      </w:r>
-      <w:r>
-        <w:rPr>
-          <w:rFonts w:ascii="Arial" w:hAnsi="Arial"/>
-          <w:sz w:val="22"/>
-        </w:rPr>
-        <w:t xml:space="preserve"> </w:t>
-      </w:r>
-      <w:r>
-        <w:rPr>
-          <w:rFonts w:ascii="Arial" w:hAnsi="Arial"/>
-          <w:sz w:val="22"/>
-        </w:rPr>
-        <w:t xml:space="preserve">diferença de renda entre duas pessoas sorteadas ao acaso no país, mais de um terço já</w:t>
-      </w:r>
-      <w:r>
-        <w:rPr>
-          <w:rFonts w:ascii="Arial" w:hAnsi="Arial"/>
-          <w:sz w:val="22"/>
-        </w:rPr>
-        <w:t xml:space="preserve"> </w:t>
-      </w:r>
-      <w:r>
-        <w:rPr>
-          <w:rFonts w:ascii="Arial" w:hAnsi="Arial"/>
-          <w:sz w:val="22"/>
-        </w:rPr>
-        <w:t xml:space="preserve">está associada a morarem em bairros diferentes, antes de se saber qualquer outra coisa</w:t>
-      </w:r>
-      <w:r>
-        <w:rPr>
-          <w:rFonts w:ascii="Arial" w:hAnsi="Arial"/>
-          <w:sz w:val="22"/>
-        </w:rPr>
-        <w:t xml:space="preserve"> </w:t>
-      </w:r>
-      <w:r>
-        <w:rPr>
-          <w:rFonts w:ascii="Arial" w:hAnsi="Arial"/>
-          <w:sz w:val="22"/>
-        </w:rPr>
-        <w:t xml:space="preserve">sobre elas. É muito acima do limiar de 5% a partir do qual</w:t>
-      </w:r>
-      <w:r>
-        <w:rPr>
-          <w:rFonts w:ascii="Arial" w:hAnsi="Arial"/>
-          <w:sz w:val="22"/>
-        </w:rPr>
-        <w:t xml:space="preserve"> </w:t>
-      </w:r>
-      <w:r>
-        <w:rPr>
-          <w:rFonts w:ascii="Arial" w:hAnsi="Arial"/>
-          <w:sz w:val="22"/>
-        </w:rPr>
-        <w:t xml:space="preserve">Raudenbush e Bryk (2002)</w:t>
-      </w:r>
-      <w:r>
-        <w:rPr>
-          <w:rFonts w:ascii="Arial" w:hAnsi="Arial"/>
-          <w:sz w:val="22"/>
-        </w:rPr>
-        <w:t xml:space="preserve"> </w:t>
-      </w:r>
-      <w:r>
-        <w:rPr>
-          <w:rFonts w:ascii="Arial" w:hAnsi="Arial"/>
-          <w:sz w:val="22"/>
-        </w:rPr>
-        <w:t xml:space="preserve">consideram indispensável tratar a estrutura aninhada, e maior do que a parcela entre</w:t>
-      </w:r>
-      <w:r>
-        <w:rPr>
-          <w:rFonts w:ascii="Arial" w:hAnsi="Arial"/>
-          <w:sz w:val="22"/>
-        </w:rPr>
-        <w:t xml:space="preserve"> </w:t>
-      </w:r>
-      <w:r>
-        <w:rPr>
-          <w:rFonts w:ascii="Arial" w:hAnsi="Arial"/>
-          <w:sz w:val="22"/>
-        </w:rPr>
-        <w:t xml:space="preserve">estados (cerca de 11%, no modelo alternativo com UF aleatória usado como robustez).</w:t>
-      </w:r>
-      <w:r>
-        <w:rPr>
-          <w:rFonts w:ascii="Arial" w:hAnsi="Arial"/>
-          <w:sz w:val="22"/>
-        </w:rPr>
-        <w:t xml:space="preserve"> </w:t>
-      </w:r>
-      <w:r>
-        <w:rPr>
-          <w:rFonts w:ascii="Arial" w:hAnsi="Arial"/>
-          <w:sz w:val="22"/>
-        </w:rPr>
-        <w:t xml:space="preserve">Ignorar essa estrutura trataria como independentes pessoas que compartilham o mesmo</w:t>
-      </w:r>
-      <w:r>
-        <w:rPr>
-          <w:rFonts w:ascii="Arial" w:hAnsi="Arial"/>
-          <w:sz w:val="22"/>
-        </w:rPr>
-        <w:t xml:space="preserve"> </w:t>
-      </w:r>
-      <w:r>
-        <w:rPr>
-          <w:rFonts w:ascii="Arial" w:hAnsi="Arial"/>
-          <w:sz w:val="22"/>
-        </w:rPr>
-        <w:t xml:space="preserve">mercado de trabalho local.</w:t>
-      </w:r>
-    </w:p>
-    <w:p>
-      <w:pPr>
-        <w:pStyle w:val="BodyText"/>
-        <w:spacing w:line="360" w:lineRule="auto" w:after="0"/>
-        <w:ind w:firstLine="709"/>
-        <w:jc w:val="both"/>
-      </w:pPr>
-      <w:r>
-        <w:rPr>
-          <w:rFonts w:ascii="Arial" w:hAnsi="Arial"/>
-          <w:b/>
-          <w:bCs/>
-          <w:sz w:val="22"/>
-        </w:rPr>
-        <w:t xml:space="preserve">Comparar vizinhos reduz o gap em cerca de 40%.</w:t>
-      </w:r>
-      <w:r>
-        <w:rPr>
-          <w:rFonts w:ascii="Arial" w:hAnsi="Arial"/>
-          <w:sz w:val="22"/>
-        </w:rPr>
-        <w:t xml:space="preserve"> </w:t>
-      </w:r>
-      <w:r>
-        <w:rPr>
-          <w:rFonts w:ascii="Arial" w:hAnsi="Arial"/>
-          <w:sz w:val="22"/>
-        </w:rPr>
-        <w:t xml:space="preserve">Com escolaridade, idade, sexo, horas, situação urbana e ano, mas</w:t>
-      </w:r>
-      <w:r>
-        <w:rPr>
-          <w:rFonts w:ascii="Arial" w:hAnsi="Arial"/>
-          <w:sz w:val="22"/>
-        </w:rPr>
-        <w:t xml:space="preserve"> </w:t>
-      </w:r>
-      <w:r>
-        <w:rPr>
-          <w:rFonts w:ascii="Arial" w:hAnsi="Arial"/>
-          <w:sz w:val="22"/>
-        </w:rPr>
-        <w:t xml:space="preserve">sem</w:t>
-      </w:r>
-      <w:r>
-        <w:rPr>
-          <w:rFonts w:ascii="Arial" w:hAnsi="Arial"/>
-          <w:sz w:val="22"/>
-        </w:rPr>
-        <w:t xml:space="preserve"> </w:t>
-      </w:r>
-      <w:r>
-        <w:rPr>
-          <w:rFonts w:ascii="Arial" w:hAnsi="Arial"/>
-          <w:sz w:val="22"/>
-        </w:rPr>
-        <w:t xml:space="preserve">nenhum</w:t>
-      </w:r>
-      <w:r>
-        <w:rPr>
-          <w:rFonts w:ascii="Arial" w:hAnsi="Arial"/>
-          <w:sz w:val="22"/>
-        </w:rPr>
-        <w:t xml:space="preserve"> </w:t>
-      </w:r>
-      <w:r>
-        <w:rPr>
-          <w:rFonts w:ascii="Arial" w:hAnsi="Arial"/>
-          <w:sz w:val="22"/>
-        </w:rPr>
-        <w:t xml:space="preserve">efeito de bairro (OLS com efeitos fixos de UF, Subseção</w:t>
-      </w:r>
-      <w:r>
-        <w:rPr>
-          <w:rFonts w:ascii="Arial" w:hAnsi="Arial"/>
-          <w:sz w:val="22"/>
-        </w:rPr>
-        <w:t xml:space="preserve"> </w:t>
-      </w:r>
-      <w:r>
-        <w:rPr>
-          <w:rFonts w:ascii="Arial" w:hAnsi="Arial"/>
-          <w:sz w:val="22"/>
-        </w:rPr>
-        <w:t xml:space="preserve">“Inferência: erros-padrão agrupados, poucos clusters e pesos”</w:t>
-      </w:r>
-      <w:r>
-        <w:rPr>
-          <w:rFonts w:ascii="Arial" w:hAnsi="Arial"/>
-          <w:sz w:val="22"/>
-        </w:rPr>
-        <w:t xml:space="preserve">),</w:t>
-      </w:r>
-      <w:r>
-        <w:rPr>
-          <w:rFonts w:ascii="Arial" w:hAnsi="Arial"/>
-          <w:sz w:val="22"/>
-        </w:rPr>
-        <w:t xml:space="preserve"> </w:t>
-      </w:r>
-      <w:r>
-        <w:rPr>
-          <w:rFonts w:ascii="Arial" w:hAnsi="Arial"/>
-          <w:sz w:val="22"/>
-        </w:rPr>
-        <w:t xml:space="preserve">trabalhadores negros recebem</w:t>
-      </w:r>
-      <w:r>
-        <w:rPr>
-          <w:rFonts w:ascii="Arial" w:hAnsi="Arial"/>
-          <w:sz w:val="22"/>
-        </w:rPr>
-        <w:t xml:space="preserve"> </w:t>
-      </w:r>
-      <w:r>
-        <w:rPr>
-          <w:rFonts w:ascii="Arial" w:hAnsi="Arial"/>
-          <w:b/>
-          <w:bCs/>
-          <w:sz w:val="22"/>
-        </w:rPr>
-        <w:t xml:space="preserve">10,5% a menos</w:t>
-      </w:r>
-      <w:r>
-        <w:rPr>
-          <w:rFonts w:ascii="Arial" w:hAnsi="Arial"/>
-          <w:sz w:val="22"/>
-        </w:rPr>
-        <w:t xml:space="preserve"> </w:t>
-      </w:r>
-      <w:r>
-        <w:rPr>
-          <w:rFonts w:ascii="Arial" w:hAnsi="Arial"/>
-          <w:sz w:val="22"/>
-        </w:rPr>
-        <w:t xml:space="preserve">que brancos comparáveis</w:t>
-      </w:r>
-      <w:r>
-        <w:rPr>
-          <w:rFonts w:ascii="Arial" w:hAnsi="Arial"/>
-          <w:sz w:val="22"/>
-        </w:rPr>
-        <w:t xml:space="preserve"> </w:t>
-      </w:r>
-      <w:r>
-        <w:rPr>
-          <w:rFonts w:ascii="Arial" w:hAnsi="Arial"/>
-          <w:sz w:val="22"/>
-        </w:rPr>
-        <w:t xml:space="preserve">(</w:t>
-      </w:r>
-      <m:oMath>
-        <m:acc>
-          <m:accPr>
-            <m:chr m:val="̂"/>
-          </m:accPr>
-          <m:e>
-            <m:r>
-              <m:t>β</m:t>
-            </m:r>
-          </m:e>
-        </m:acc>
-        <m:r>
-          <m:rPr>
-            <m:sty m:val="p"/>
-          </m:rPr>
-          <m:t>=</m:t>
-        </m:r>
-        <m:r>
-          <m:rPr>
-            <m:sty m:val="p"/>
-          </m:rPr>
-          <m:t>−</m:t>
-        </m:r>
-        <m:r>
-          <m:t>0</m:t>
-        </m:r>
-        <m:r>
-          <m:rPr>
-            <m:sty m:val="p"/>
-          </m:rPr>
-          <m:t>,</m:t>
-        </m:r>
-        <m:r>
-          <m:t>1104</m:t>
-        </m:r>
-      </m:oMath>
-      <w:r>
-        <w:rPr>
-          <w:rFonts w:ascii="Arial" w:hAnsi="Arial"/>
-          <w:sz w:val="22"/>
-        </w:rPr>
-        <w:t xml:space="preserve">)</w:t>
-      </w:r>
-      <w:r>
-        <w:rPr>
-          <w:rStyle w:val="FootnoteReference"/>
-          <w:rFonts w:ascii="Arial" w:hAnsi="Arial"/>
-          <w:sz w:val="22"/>
-          <w:vertAlign w:val="superscript"/>
-        </w:rPr>
-        <w:footnoteReference w:id="36"/>
-      </w:r>
-      <w:r>
-        <w:rPr>
-          <w:rFonts w:ascii="Arial" w:hAnsi="Arial"/>
-          <w:sz w:val="22"/>
-        </w:rPr>
-        <w:t xml:space="preserve">. O M1 acrescenta o intercepto aleatório de UPA — na</w:t>
-      </w:r>
-      <w:r>
-        <w:rPr>
-          <w:rFonts w:ascii="Arial" w:hAnsi="Arial"/>
-          <w:sz w:val="22"/>
-        </w:rPr>
-        <w:t xml:space="preserve"> </w:t>
-      </w:r>
-      <w:r>
-        <w:rPr>
-          <w:rFonts w:ascii="Arial" w:hAnsi="Arial"/>
-          <w:sz w:val="22"/>
-        </w:rPr>
-        <w:t xml:space="preserve">prática, um nível de renda próprio para cada bairro — e com ele a comparação deixa de</w:t>
-      </w:r>
-      <w:r>
-        <w:rPr>
-          <w:rFonts w:ascii="Arial" w:hAnsi="Arial"/>
-          <w:sz w:val="22"/>
-        </w:rPr>
-        <w:t xml:space="preserve"> </w:t>
-      </w:r>
-      <w:r>
-        <w:rPr>
-          <w:rFonts w:ascii="Arial" w:hAnsi="Arial"/>
-          <w:sz w:val="22"/>
-        </w:rPr>
-        <w:t xml:space="preserve">ser entre todos os trabalhadores do país e passa a ser entre negros e brancos</w:t>
-      </w:r>
-      <w:r>
-        <w:rPr>
-          <w:rFonts w:ascii="Arial" w:hAnsi="Arial"/>
-          <w:sz w:val="22"/>
-        </w:rPr>
-        <w:t xml:space="preserve"> </w:t>
-      </w:r>
-      <w:r>
-        <w:rPr>
-          <w:rFonts w:ascii="Arial" w:hAnsi="Arial"/>
-          <w:sz w:val="22"/>
-        </w:rPr>
-        <w:t xml:space="preserve">do</w:t>
-      </w:r>
-      <w:r>
-        <w:rPr>
-          <w:rFonts w:ascii="Arial" w:hAnsi="Arial"/>
-          <w:sz w:val="22"/>
-        </w:rPr>
-        <w:t xml:space="preserve"> </w:t>
-      </w:r>
-      <w:r>
-        <w:rPr>
-          <w:rFonts w:ascii="Arial" w:hAnsi="Arial"/>
-          <w:sz w:val="22"/>
-        </w:rPr>
-        <w:t xml:space="preserve">mesmo bairro</w:t>
-      </w:r>
-      <w:r>
-        <w:rPr>
-          <w:rFonts w:ascii="Arial" w:hAnsi="Arial"/>
-          <w:sz w:val="22"/>
-        </w:rPr>
-        <w:t xml:space="preserve">: a penalidade cai para</w:t>
-      </w:r>
-      <w:r>
-        <w:rPr>
-          <w:rFonts w:ascii="Arial" w:hAnsi="Arial"/>
-          <w:sz w:val="22"/>
-        </w:rPr>
-        <w:t xml:space="preserve"> </w:t>
-      </w:r>
-      <w:r>
-        <w:rPr>
-          <w:rFonts w:ascii="Arial" w:hAnsi="Arial"/>
-          <w:b/>
-          <w:bCs/>
-          <w:sz w:val="22"/>
-        </w:rPr>
-        <w:t xml:space="preserve">6,5%</w:t>
-      </w:r>
-      <w:r>
-        <w:rPr>
-          <w:rStyle w:val="FootnoteReference"/>
-          <w:rFonts w:ascii="Arial" w:hAnsi="Arial"/>
-          <w:sz w:val="22"/>
-          <w:vertAlign w:val="superscript"/>
-        </w:rPr>
-        <w:footnoteReference w:id="37"/>
-      </w:r>
-      <w:r>
-        <w:rPr>
-          <w:rFonts w:ascii="Arial" w:hAnsi="Arial"/>
-          <w:sz w:val="22"/>
-        </w:rPr>
-        <w:t xml:space="preserve">. Medida na régua do gap agregado,</w:t>
-      </w:r>
-      <w:r>
-        <w:rPr>
-          <w:rFonts w:ascii="Arial" w:hAnsi="Arial"/>
-          <w:sz w:val="22"/>
-        </w:rPr>
-        <w:t xml:space="preserve"> </w:t>
-      </w:r>
-      <w:r>
-        <w:rPr>
-          <w:rFonts w:ascii="Arial" w:hAnsi="Arial"/>
-          <w:b/>
-          <w:bCs/>
-          <w:sz w:val="22"/>
-        </w:rPr>
-        <w:t xml:space="preserve">39,5% da distância já foi percorrida</w:t>
-      </w:r>
-      <w:r>
-        <w:rPr>
-          <w:rFonts w:ascii="Arial" w:hAnsi="Arial"/>
-          <w:sz w:val="22"/>
-        </w:rPr>
-        <w:t xml:space="preserve"> </w:t>
-      </w:r>
-      <w:r>
-        <w:rPr>
-          <w:rFonts w:ascii="Arial" w:hAnsi="Arial"/>
-          <w:sz w:val="22"/>
-        </w:rPr>
-        <w:t xml:space="preserve">— percorrida no sentido de</w:t>
-      </w:r>
-      <w:r>
-        <w:rPr>
-          <w:rFonts w:ascii="Arial" w:hAnsi="Arial"/>
-          <w:sz w:val="22"/>
-        </w:rPr>
-        <w:t xml:space="preserve"> </w:t>
-      </w:r>
-      <w:r>
-        <w:rPr>
-          <w:rFonts w:ascii="Arial" w:hAnsi="Arial"/>
-          <w:sz w:val="22"/>
-        </w:rPr>
-        <w:t xml:space="preserve">atribuída a um fator observável, e não no sentido de explicada sem discriminação, já que</w:t>
-      </w:r>
-      <w:r>
-        <w:rPr>
-          <w:rFonts w:ascii="Arial" w:hAnsi="Arial"/>
-          <w:sz w:val="22"/>
-        </w:rPr>
-        <w:t xml:space="preserve"> </w:t>
-      </w:r>
-      <w:r>
-        <w:rPr>
-          <w:rFonts w:ascii="Arial" w:hAnsi="Arial"/>
-          <w:sz w:val="22"/>
-        </w:rPr>
-        <w:t xml:space="preserve">o bairro em que se consegue morar é ele próprio produto de exclusão. Esse é o teste da</w:t>
-      </w:r>
-      <w:r>
-        <w:rPr>
-          <w:rFonts w:ascii="Arial" w:hAnsi="Arial"/>
-          <w:sz w:val="22"/>
-        </w:rPr>
-        <w:t xml:space="preserve"> </w:t>
-      </w:r>
-      <w:r>
-        <w:rPr>
-          <w:rFonts w:ascii="Arial" w:hAnsi="Arial"/>
-          <w:sz w:val="22"/>
-        </w:rPr>
-        <w:t xml:space="preserve">Hipótese H1, e ele passa: negros e brancos com o mesmo capital humano não moram nos</w:t>
-      </w:r>
-      <w:r>
-        <w:rPr>
-          <w:rFonts w:ascii="Arial" w:hAnsi="Arial"/>
-          <w:sz w:val="22"/>
-        </w:rPr>
-        <w:t xml:space="preserve"> </w:t>
-      </w:r>
-      <w:r>
-        <w:rPr>
-          <w:rFonts w:ascii="Arial" w:hAnsi="Arial"/>
-          <w:sz w:val="22"/>
-        </w:rPr>
-        <w:t xml:space="preserve">mesmos bairros, e os bairros pagam diferente. Os controles individuais explicam, além</w:t>
-      </w:r>
-      <w:r>
-        <w:rPr>
-          <w:rFonts w:ascii="Arial" w:hAnsi="Arial"/>
-          <w:sz w:val="22"/>
-        </w:rPr>
-        <w:t xml:space="preserve"> </w:t>
-      </w:r>
-      <w:r>
-        <w:rPr>
-          <w:rFonts w:ascii="Arial" w:hAnsi="Arial"/>
-          <w:sz w:val="22"/>
-        </w:rPr>
-        <w:t xml:space="preserve">disso, 66,5% da variância entre bairros do M0 — parte do que parecia</w:t>
-      </w:r>
-      <w:r>
-        <w:rPr>
-          <w:rFonts w:ascii="Arial" w:hAnsi="Arial"/>
-          <w:sz w:val="22"/>
-        </w:rPr>
-        <w:t xml:space="preserve"> </w:t>
-      </w:r>
-      <w:r>
-        <w:rPr>
-          <w:rFonts w:ascii="Arial" w:hAnsi="Arial"/>
-          <w:sz w:val="22"/>
-        </w:rPr>
-        <w:t xml:space="preserve">“bairro”</w:t>
-      </w:r>
-      <w:r>
-        <w:rPr>
-          <w:rFonts w:ascii="Arial" w:hAnsi="Arial"/>
-          <w:sz w:val="22"/>
-        </w:rPr>
-        <w:t xml:space="preserve"> </w:t>
-      </w:r>
-      <w:r>
-        <w:rPr>
-          <w:rFonts w:ascii="Arial" w:hAnsi="Arial"/>
-          <w:sz w:val="22"/>
-        </w:rPr>
-        <w:t xml:space="preserve">é composição de quem mora nele.</w:t>
-      </w:r>
-    </w:p>
-    <w:p>
-      <w:pPr>
-        <w:pStyle w:val="BodyText"/>
-        <w:spacing w:line="360" w:lineRule="auto" w:after="0"/>
-        <w:ind w:firstLine="709"/>
-        <w:jc w:val="both"/>
-      </w:pPr>
-      <w:r>
-        <w:rPr>
-          <w:rFonts w:ascii="Arial" w:hAnsi="Arial"/>
-          <w:sz w:val="22"/>
-        </w:rPr>
-        <w:t xml:space="preserve">Vale guardar a frase: 39</w:t>
-      </w:r>
-      <w:r>
-        <w:rPr>
-          <w:rFonts w:ascii="Arial" w:hAnsi="Arial"/>
-          <w:sz w:val="22"/>
-        </w:rPr>
-        <w:t xml:space="preserve">,</w:t>
-      </w:r>
-      <w:r>
-        <w:rPr>
-          <w:rFonts w:ascii="Arial" w:hAnsi="Arial"/>
-          <w:sz w:val="22"/>
-        </w:rPr>
-        <w:t xml:space="preserve">5% do gap racial não separam duas pessoas,</w:t>
-      </w:r>
-      <w:r>
-        <w:rPr>
-          <w:rFonts w:ascii="Arial" w:hAnsi="Arial"/>
-          <w:sz w:val="22"/>
-        </w:rPr>
-        <w:t xml:space="preserve"> </w:t>
-      </w:r>
-      <w:r>
-        <w:rPr>
-          <w:rFonts w:ascii="Arial" w:hAnsi="Arial"/>
-          <w:sz w:val="22"/>
-        </w:rPr>
-        <w:t xml:space="preserve">separam dois endereços. Resta saber o que, num endereço, produz essa diferença.</w:t>
-      </w:r>
-    </w:p>
-    <w:p>
-      <w:pPr>
-        <w:pStyle w:val="BodyText"/>
-        <w:spacing w:line="360" w:lineRule="auto" w:after="0"/>
-        <w:ind w:firstLine="709"/>
-        <w:jc w:val="both"/>
-      </w:pPr>
-      <w:r>
-        <w:rPr>
-          <w:rFonts w:ascii="Arial" w:hAnsi="Arial"/>
-          <w:b/>
-          <w:bCs/>
-          <w:sz w:val="22"/>
-        </w:rPr>
-        <w:t xml:space="preserve">Morar onde moram os negros custa outra vez.</w:t>
-      </w:r>
-      <w:r>
-        <w:rPr>
-          <w:rFonts w:ascii="Arial" w:hAnsi="Arial"/>
-          <w:sz w:val="22"/>
-        </w:rPr>
-        <w:t xml:space="preserve"> </w:t>
-      </w:r>
-      <w:r>
-        <w:rPr>
-          <w:rFonts w:ascii="Arial" w:hAnsi="Arial"/>
-          <w:sz w:val="22"/>
-        </w:rPr>
-        <w:t xml:space="preserve">O M2 pergunta o que, num bairro, faz a renda ser mais alta ou mais baixa, e responde com</w:t>
-      </w:r>
-      <w:r>
-        <w:rPr>
-          <w:rFonts w:ascii="Arial" w:hAnsi="Arial"/>
-          <w:sz w:val="22"/>
-        </w:rPr>
-        <w:t xml:space="preserve"> </w:t>
-      </w:r>
-      <w:r>
-        <w:rPr>
-          <w:rFonts w:ascii="Arial" w:hAnsi="Arial"/>
-          <w:sz w:val="22"/>
-        </w:rPr>
-        <w:t xml:space="preserve">três covariáveis de nível 2 que juntas explicam 55,2% da variância</w:t>
-      </w:r>
-      <w:r>
-        <w:rPr>
-          <w:rFonts w:ascii="Arial" w:hAnsi="Arial"/>
-          <w:sz w:val="22"/>
-        </w:rPr>
-        <w:t xml:space="preserve"> </w:t>
-      </w:r>
-      <w:r>
-        <w:rPr>
-          <w:rFonts w:ascii="Arial" w:hAnsi="Arial"/>
-          <w:sz w:val="22"/>
-        </w:rPr>
-        <w:t xml:space="preserve">entre bairros que restava no M1</w:t>
-      </w:r>
-      <w:r>
-        <w:rPr>
-          <w:rStyle w:val="FootnoteReference"/>
-          <w:rFonts w:ascii="Arial" w:hAnsi="Arial"/>
-          <w:sz w:val="22"/>
-          <w:vertAlign w:val="superscript"/>
-        </w:rPr>
-        <w:footnoteReference w:id="38"/>
-      </w:r>
-      <w:r>
-        <w:rPr>
-          <w:rFonts w:ascii="Arial" w:hAnsi="Arial"/>
-          <w:sz w:val="22"/>
-        </w:rPr>
-        <w:t xml:space="preserve">. A mais eloquente é a</w:t>
-      </w:r>
-      <w:r>
-        <w:rPr>
-          <w:rFonts w:ascii="Arial" w:hAnsi="Arial"/>
-          <w:sz w:val="22"/>
-        </w:rPr>
-        <w:t xml:space="preserve"> </w:t>
-      </w:r>
-      <w:r>
-        <w:rPr>
-          <w:rFonts w:ascii="Arial" w:hAnsi="Arial"/>
-          <w:sz w:val="22"/>
-        </w:rPr>
-        <w:t xml:space="preserve">composição racial:</w:t>
-      </w:r>
-      <w:r>
-        <w:rPr>
-          <w:rFonts w:ascii="Arial" w:hAnsi="Arial"/>
-          <w:sz w:val="22"/>
-        </w:rPr>
-        <w:t xml:space="preserve"> </w:t>
-      </w:r>
-      <m:oMath>
-        <m:sSub>
-          <m:e>
-            <m:acc>
-              <m:accPr>
-                <m:chr m:val="̂"/>
-              </m:accPr>
-              <m:e>
-                <m:r>
-                  <m:t>γ</m:t>
-                </m:r>
-              </m:e>
-            </m:acc>
-          </m:e>
-          <m:sub>
-            <m:r>
-              <m:t>01</m:t>
-            </m:r>
-          </m:sub>
-        </m:sSub>
-        <m:r>
-          <m:rPr>
-            <m:sty m:val="p"/>
-          </m:rPr>
-          <m:t>=</m:t>
-        </m:r>
-        <m:r>
-          <m:rPr>
-            <m:sty m:val="p"/>
-          </m:rPr>
-          <m:t>−</m:t>
-        </m:r>
-        <m:r>
-          <m:t>0</m:t>
-        </m:r>
-        <m:r>
-          <m:rPr>
-            <m:sty m:val="p"/>
-          </m:rPr>
-          <m:t>,</m:t>
-        </m:r>
-        <m:r>
-          <m:t>1272</m:t>
-        </m:r>
-      </m:oMath>
-      <w:r>
-        <w:rPr>
-          <w:rFonts w:ascii="Arial" w:hAnsi="Arial"/>
-          <w:sz w:val="22"/>
-        </w:rPr>
-        <w:t xml:space="preserve"> </w:t>
-      </w:r>
-      <w:r>
-        <w:rPr>
-          <w:rFonts w:ascii="Arial" w:hAnsi="Arial"/>
-          <w:sz w:val="22"/>
-        </w:rPr>
-        <w:t xml:space="preserve">significa que um desvio-padrão a mais</w:t>
-      </w:r>
-      <w:r>
-        <w:rPr>
-          <w:rFonts w:ascii="Arial" w:hAnsi="Arial"/>
-          <w:sz w:val="22"/>
-        </w:rPr>
-        <w:t xml:space="preserve"> </w:t>
-      </w:r>
-      <w:r>
-        <w:rPr>
-          <w:rFonts w:ascii="Arial" w:hAnsi="Arial"/>
-          <w:sz w:val="22"/>
-        </w:rPr>
-        <w:t xml:space="preserve">na proporção de moradores negros da UPA reduz o rendimento de</w:t>
-      </w:r>
-      <w:r>
-        <w:rPr>
-          <w:rFonts w:ascii="Arial" w:hAnsi="Arial"/>
-          <w:sz w:val="22"/>
-        </w:rPr>
-        <w:t xml:space="preserve"> </w:t>
-      </w:r>
-      <w:r>
-        <w:rPr>
-          <w:rFonts w:ascii="Arial" w:hAnsi="Arial"/>
-          <w:sz w:val="22"/>
-        </w:rPr>
-        <w:t xml:space="preserve">todos</w:t>
-      </w:r>
-      <w:r>
-        <w:rPr>
-          <w:rFonts w:ascii="Arial" w:hAnsi="Arial"/>
-          <w:sz w:val="22"/>
-        </w:rPr>
-        <w:t xml:space="preserve"> </w:t>
-      </w:r>
-      <w:r>
-        <w:rPr>
-          <w:rFonts w:ascii="Arial" w:hAnsi="Arial"/>
-          <w:sz w:val="22"/>
-        </w:rPr>
-        <w:t xml:space="preserve">os moradores,</w:t>
-      </w:r>
-      <w:r>
-        <w:rPr>
-          <w:rFonts w:ascii="Arial" w:hAnsi="Arial"/>
-          <w:sz w:val="22"/>
-        </w:rPr>
-        <w:t xml:space="preserve"> </w:t>
-      </w:r>
-      <w:r>
-        <w:rPr>
-          <w:rFonts w:ascii="Arial" w:hAnsi="Arial"/>
-          <w:sz w:val="22"/>
-        </w:rPr>
-        <w:t xml:space="preserve">negros e brancos, em 0,13 log-pontos — cerca de 2</w:t>
-      </w:r>
-      <w:r>
-        <w:rPr>
-          <w:rFonts w:ascii="Arial" w:hAnsi="Arial"/>
-          <w:sz w:val="22"/>
-        </w:rPr>
-        <w:t xml:space="preserve">,</w:t>
-      </w:r>
-      <w:r>
-        <w:rPr>
-          <w:rFonts w:ascii="Arial" w:hAnsi="Arial"/>
-          <w:sz w:val="22"/>
-        </w:rPr>
-        <w:t xml:space="preserve">0 vezes a</w:t>
-      </w:r>
-      <w:r>
-        <w:rPr>
-          <w:rFonts w:ascii="Arial" w:hAnsi="Arial"/>
-          <w:sz w:val="22"/>
-        </w:rPr>
-        <w:t xml:space="preserve"> </w:t>
-      </w:r>
-      <w:r>
-        <w:rPr>
-          <w:rFonts w:ascii="Arial" w:hAnsi="Arial"/>
-          <w:sz w:val="22"/>
-        </w:rPr>
-        <w:t xml:space="preserve">penalidade que um trabalhador negro carrega individualmente no mesmo modelo. É a evidência</w:t>
-      </w:r>
-      <w:r>
-        <w:rPr>
-          <w:rFonts w:ascii="Arial" w:hAnsi="Arial"/>
-          <w:sz w:val="22"/>
-        </w:rPr>
-        <w:t xml:space="preserve"> </w:t>
-      </w:r>
-      <w:r>
-        <w:rPr>
-          <w:rFonts w:ascii="Arial" w:hAnsi="Arial"/>
-          <w:sz w:val="22"/>
-        </w:rPr>
-        <w:t xml:space="preserve">mais direta da</w:t>
-      </w:r>
-      <w:r>
-        <w:rPr>
-          <w:rFonts w:ascii="Arial" w:hAnsi="Arial"/>
-          <w:sz w:val="22"/>
-        </w:rPr>
-        <w:t xml:space="preserve"> </w:t>
-      </w:r>
-      <w:r>
-        <w:rPr>
-          <w:rFonts w:ascii="Arial" w:hAnsi="Arial"/>
-          <w:sz w:val="22"/>
-        </w:rPr>
-        <w:t xml:space="preserve">dupla desvantagem</w:t>
-      </w:r>
-      <w:r>
-        <w:rPr>
-          <w:rFonts w:ascii="Arial" w:hAnsi="Arial"/>
-          <w:sz w:val="22"/>
-        </w:rPr>
-        <w:t xml:space="preserve">: ser negro custa, e morar onde moram os negros</w:t>
-      </w:r>
-      <w:r>
-        <w:rPr>
-          <w:rFonts w:ascii="Arial" w:hAnsi="Arial"/>
-          <w:sz w:val="22"/>
-        </w:rPr>
-        <w:t xml:space="preserve"> </w:t>
-      </w:r>
-      <w:r>
-        <w:rPr>
-          <w:rFonts w:ascii="Arial" w:hAnsi="Arial"/>
-          <w:sz w:val="22"/>
-        </w:rPr>
-        <w:t xml:space="preserve">custa outra vez, inclusive para quem não é negro. Já o coeficiente individual mal se move</w:t>
-      </w:r>
-      <w:r>
-        <w:rPr>
-          <w:rFonts w:ascii="Arial" w:hAnsi="Arial"/>
-          <w:sz w:val="22"/>
-        </w:rPr>
-        <w:t xml:space="preserve"> </w:t>
-      </w:r>
-      <w:r>
-        <w:rPr>
-          <w:rFonts w:ascii="Arial" w:hAnsi="Arial"/>
-          <w:sz w:val="22"/>
-        </w:rPr>
-        <w:t xml:space="preserve">(de</w:t>
-      </w:r>
-      <w:r>
-        <w:rPr>
-          <w:rFonts w:ascii="Arial" w:hAnsi="Arial"/>
-          <w:sz w:val="22"/>
-        </w:rPr>
-        <w:t xml:space="preserve"> </w:t>
-      </w:r>
-      <m:oMath>
-        <m:r>
-          <m:rPr>
-            <m:sty m:val="p"/>
-          </m:rPr>
-          <m:t>−</m:t>
-        </m:r>
-        <m:r>
-          <m:t>0</m:t>
-        </m:r>
-        <m:r>
-          <m:rPr>
-            <m:sty m:val="p"/>
-          </m:rPr>
-          <m:t>,</m:t>
-        </m:r>
-        <m:r>
-          <m:t>0669</m:t>
-        </m:r>
-      </m:oMath>
-      <w:r>
-        <w:rPr>
-          <w:rFonts w:ascii="Arial" w:hAnsi="Arial"/>
-          <w:sz w:val="22"/>
-        </w:rPr>
-        <w:t xml:space="preserve"> </w:t>
-      </w:r>
-      <w:r>
-        <w:rPr>
-          <w:rFonts w:ascii="Arial" w:hAnsi="Arial"/>
-          <w:sz w:val="22"/>
-        </w:rPr>
-        <w:t xml:space="preserve">para</w:t>
-      </w:r>
-      <w:r>
-        <w:rPr>
-          <w:rFonts w:ascii="Arial" w:hAnsi="Arial"/>
-          <w:sz w:val="22"/>
-        </w:rPr>
-        <w:t xml:space="preserve"> </w:t>
-      </w:r>
-      <m:oMath>
-        <m:r>
-          <m:rPr>
-            <m:sty m:val="p"/>
-          </m:rPr>
-          <m:t>−</m:t>
-        </m:r>
-        <m:r>
-          <m:t>0</m:t>
-        </m:r>
-        <m:r>
-          <m:rPr>
-            <m:sty m:val="p"/>
-          </m:rPr>
-          <m:t>,</m:t>
-        </m:r>
-        <m:r>
-          <m:t>0637</m:t>
-        </m:r>
-      </m:oMath>
-      <w:r>
-        <w:rPr>
-          <w:rFonts w:ascii="Arial" w:hAnsi="Arial"/>
-          <w:sz w:val="22"/>
-        </w:rPr>
-        <w:t xml:space="preserve">): acrescentar a composição do bairro quase não altera a</w:t>
-      </w:r>
-      <w:r>
-        <w:rPr>
-          <w:rFonts w:ascii="Arial" w:hAnsi="Arial"/>
-          <w:sz w:val="22"/>
-        </w:rPr>
-        <w:t xml:space="preserve"> </w:t>
-      </w:r>
-      <w:r>
-        <w:rPr>
-          <w:rFonts w:ascii="Arial" w:hAnsi="Arial"/>
-          <w:sz w:val="22"/>
-        </w:rPr>
-        <w:t xml:space="preserve">penalidade racial média — as duas desvantagens se somam, em vez de uma explicar a outra.</w:t>
-      </w:r>
-    </w:p>
-    <w:p>
-      <w:pPr>
-        <w:pStyle w:val="BodyText"/>
-        <w:spacing w:line="360" w:lineRule="auto" w:after="0"/>
-        <w:ind w:firstLine="709"/>
-        <w:jc w:val="both"/>
-      </w:pPr>
-      <w:r>
-        <w:rPr>
-          <w:rFonts w:ascii="Arial" w:hAnsi="Arial"/>
-          <w:sz w:val="22"/>
-        </w:rPr>
-        <w:t xml:space="preserve">Em uma frase: o bairro cobra duas vezes — da pessoa negra, pela cor; e de todos</w:t>
-      </w:r>
-      <w:r>
-        <w:rPr>
-          <w:rFonts w:ascii="Arial" w:hAnsi="Arial"/>
-          <w:sz w:val="22"/>
-        </w:rPr>
-        <w:t xml:space="preserve"> </w:t>
-      </w:r>
-      <w:r>
-        <w:rPr>
-          <w:rFonts w:ascii="Arial" w:hAnsi="Arial"/>
-          <w:sz w:val="22"/>
-        </w:rPr>
-        <w:t xml:space="preserve">os que moram ali, pela composição racial do lugar.</w:t>
-      </w:r>
-    </w:p>
-    <w:p>
-      <w:pPr>
-        <w:pStyle w:val="BodyText"/>
-        <w:spacing w:line="360" w:lineRule="auto" w:after="0"/>
-        <w:ind w:firstLine="709"/>
-        <w:jc w:val="both"/>
-      </w:pPr>
-      <w:r>
-        <w:rPr>
-          <w:rFonts w:ascii="Arial" w:hAnsi="Arial"/>
-          <w:b/>
-          <w:bCs/>
-          <w:sz w:val="22"/>
-        </w:rPr>
-        <w:t xml:space="preserve">Acrescentar o estado não move a régua.</w:t>
-      </w:r>
-      <w:r>
-        <w:rPr>
-          <w:rFonts w:ascii="Arial" w:hAnsi="Arial"/>
-          <w:sz w:val="22"/>
-        </w:rPr>
-        <w:t xml:space="preserve"> </w:t>
-      </w:r>
-      <w:r>
-        <w:rPr>
-          <w:rFonts w:ascii="Arial" w:hAnsi="Arial"/>
-          <w:sz w:val="22"/>
-        </w:rPr>
-        <w:t xml:space="preserve">Com os efeitos fixos de UF, a penalidade é de</w:t>
-      </w:r>
-      <w:r>
-        <w:rPr>
-          <w:rFonts w:ascii="Arial" w:hAnsi="Arial"/>
-          <w:sz w:val="22"/>
-        </w:rPr>
-        <w:t xml:space="preserve"> </w:t>
-      </w:r>
-      <w:r>
-        <w:rPr>
-          <w:rFonts w:ascii="Arial" w:hAnsi="Arial"/>
-          <w:b/>
-          <w:bCs/>
-          <w:sz w:val="22"/>
-        </w:rPr>
-        <w:t xml:space="preserve">6,1%</w:t>
-      </w:r>
-      <w:r>
-        <w:rPr>
-          <w:rFonts w:ascii="Arial" w:hAnsi="Arial"/>
-          <w:sz w:val="22"/>
-        </w:rPr>
-        <w:t xml:space="preserve"> </w:t>
-      </w:r>
-      <w:r>
-        <w:rPr>
-          <w:rFonts w:ascii="Arial" w:hAnsi="Arial"/>
-          <w:sz w:val="22"/>
-        </w:rPr>
-        <w:t xml:space="preserve">(</w:t>
-      </w:r>
-      <m:oMath>
-        <m:sSubSup>
-          <m:e>
-            <m:acc>
-              <m:accPr>
-                <m:chr m:val="̂"/>
-              </m:accPr>
-              <m:e>
-                <m:r>
-                  <m:t>β</m:t>
-                </m:r>
-              </m:e>
-            </m:acc>
-          </m:e>
-          <m:sub>
-            <m:r>
-              <m:rPr>
-                <m:nor/>
-                <m:sty m:val="p"/>
-              </m:rPr>
-              <m:t>negro</m:t>
-            </m:r>
-          </m:sub>
-          <m:sup>
-            <m:r>
-              <m:t>M</m:t>
-            </m:r>
-            <m:r>
-              <m:t>3</m:t>
-            </m:r>
-          </m:sup>
-        </m:sSubSup>
-        <m:r>
-          <m:rPr>
-            <m:sty m:val="p"/>
-          </m:rPr>
-          <m:t>=</m:t>
-        </m:r>
-        <m:r>
-          <m:rPr>
-            <m:sty m:val="p"/>
-          </m:rPr>
-          <m:t>−</m:t>
-        </m:r>
-        <m:r>
-          <m:t>0</m:t>
-        </m:r>
-        <m:r>
-          <m:rPr>
-            <m:sty m:val="p"/>
-          </m:rPr>
-          <m:t>,</m:t>
-        </m:r>
-        <m:r>
-          <m:t>0629</m:t>
-        </m:r>
-      </m:oMath>
-      <w:r>
-        <w:rPr>
-          <w:rFonts w:ascii="Arial" w:hAnsi="Arial"/>
-          <w:sz w:val="22"/>
-        </w:rPr>
-        <w:t xml:space="preserve">). Na régua do gap</w:t>
-      </w:r>
-      <w:r>
-        <w:rPr>
-          <w:rFonts w:ascii="Arial" w:hAnsi="Arial"/>
-          <w:sz w:val="22"/>
-        </w:rPr>
-        <w:t xml:space="preserve"> </w:t>
-      </w:r>
-      <w:r>
-        <w:rPr>
-          <w:rFonts w:ascii="Arial" w:hAnsi="Arial"/>
-          <w:sz w:val="22"/>
-        </w:rPr>
-        <w:t xml:space="preserve">agregado, 43,0% — praticamente os mesmos 39,5% do M1. O</w:t>
-      </w:r>
-      <w:r>
-        <w:rPr>
-          <w:rFonts w:ascii="Arial" w:hAnsi="Arial"/>
-          <w:sz w:val="22"/>
-        </w:rPr>
-        <w:t xml:space="preserve"> </w:t>
-      </w:r>
-      <w:r>
-        <w:rPr>
-          <w:rFonts w:ascii="Arial" w:hAnsi="Arial"/>
-          <w:sz w:val="22"/>
-        </w:rPr>
-        <w:t xml:space="preserve">dado relevante aqui é o que</w:t>
-      </w:r>
-      <w:r>
-        <w:rPr>
-          <w:rFonts w:ascii="Arial" w:hAnsi="Arial"/>
-          <w:sz w:val="22"/>
-        </w:rPr>
-        <w:t xml:space="preserve"> </w:t>
-      </w:r>
-      <w:r>
-        <w:rPr>
-          <w:rFonts w:ascii="Arial" w:hAnsi="Arial"/>
-          <w:sz w:val="22"/>
-        </w:rPr>
-        <w:t xml:space="preserve">não</w:t>
-      </w:r>
-      <w:r>
-        <w:rPr>
-          <w:rFonts w:ascii="Arial" w:hAnsi="Arial"/>
-          <w:sz w:val="22"/>
-        </w:rPr>
-        <w:t xml:space="preserve"> </w:t>
-      </w:r>
-      <w:r>
-        <w:rPr>
-          <w:rFonts w:ascii="Arial" w:hAnsi="Arial"/>
-          <w:sz w:val="22"/>
-        </w:rPr>
-        <w:t xml:space="preserve">aconteceu: depois que a comparação já é entre</w:t>
-      </w:r>
-      <w:r>
-        <w:rPr>
-          <w:rFonts w:ascii="Arial" w:hAnsi="Arial"/>
-          <w:sz w:val="22"/>
-        </w:rPr>
-        <w:t xml:space="preserve"> </w:t>
-      </w:r>
-      <w:r>
-        <w:rPr>
-          <w:rFonts w:ascii="Arial" w:hAnsi="Arial"/>
-          <w:sz w:val="22"/>
-        </w:rPr>
-        <w:t xml:space="preserve">vizinhos, o contexto do bairro (M2) e a unidade da federação (M3) retiram pouco</w:t>
-      </w:r>
-      <w:r>
-        <w:rPr>
-          <w:rFonts w:ascii="Arial" w:hAnsi="Arial"/>
-          <w:sz w:val="22"/>
-        </w:rPr>
-        <w:t xml:space="preserve"> </w:t>
-      </w:r>
-      <w:r>
-        <w:rPr>
-          <w:rFonts w:ascii="Arial" w:hAnsi="Arial"/>
-          <w:sz w:val="22"/>
-        </w:rPr>
-        <w:t xml:space="preserve">mais do diferencial. É esse patamar que este trabalho chama de</w:t>
-      </w:r>
-      <w:r>
-        <w:rPr>
-          <w:rFonts w:ascii="Arial" w:hAnsi="Arial"/>
-          <w:sz w:val="22"/>
-        </w:rPr>
-        <w:t xml:space="preserve"> </w:t>
-      </w:r>
-      <w:r>
-        <w:rPr>
-          <w:rFonts w:ascii="Arial" w:hAnsi="Arial"/>
-          <w:b/>
-          <w:bCs/>
-          <w:sz w:val="22"/>
-        </w:rPr>
-        <w:t xml:space="preserve">gap líquido</w:t>
-      </w:r>
-      <w:r>
-        <w:rPr>
-          <w:rFonts w:ascii="Arial" w:hAnsi="Arial"/>
-          <w:sz w:val="22"/>
-        </w:rPr>
-        <w:t xml:space="preserve">: o</w:t>
-      </w:r>
-      <w:r>
-        <w:rPr>
-          <w:rFonts w:ascii="Arial" w:hAnsi="Arial"/>
-          <w:sz w:val="22"/>
-        </w:rPr>
-        <w:t xml:space="preserve"> </w:t>
-      </w:r>
-      <w:r>
-        <w:rPr>
-          <w:rFonts w:ascii="Arial" w:hAnsi="Arial"/>
-          <w:sz w:val="22"/>
-        </w:rPr>
-        <w:t xml:space="preserve">que capital humano, contexto de bairro e estado não explicam — um limite superior da</w:t>
-      </w:r>
-      <w:r>
-        <w:rPr>
-          <w:rFonts w:ascii="Arial" w:hAnsi="Arial"/>
-          <w:sz w:val="22"/>
-        </w:rPr>
-        <w:t xml:space="preserve"> </w:t>
-      </w:r>
-      <w:r>
-        <w:rPr>
-          <w:rFonts w:ascii="Arial" w:hAnsi="Arial"/>
-          <w:sz w:val="22"/>
-        </w:rPr>
-        <w:t xml:space="preserve">penalidade direta sob seleção em observáveis (o M4 é o inferior), e não uma medida de</w:t>
-      </w:r>
-      <w:r>
-        <w:rPr>
-          <w:rFonts w:ascii="Arial" w:hAnsi="Arial"/>
-          <w:sz w:val="22"/>
-        </w:rPr>
-        <w:t xml:space="preserve"> </w:t>
-      </w:r>
-      <w:r>
-        <w:rPr>
-          <w:rFonts w:ascii="Arial" w:hAnsi="Arial"/>
-          <w:sz w:val="22"/>
-        </w:rPr>
-        <w:t xml:space="preserve">discriminação.</w:t>
-      </w:r>
-      <w:r>
-        <w:rPr>
-          <w:rStyle w:val="FootnoteReference"/>
-          <w:rFonts w:ascii="Arial" w:hAnsi="Arial"/>
-          <w:sz w:val="22"/>
-          <w:vertAlign w:val="superscript"/>
-        </w:rPr>
-        <w:footnoteReference w:id="39"/>
-      </w:r>
-    </w:p>
-    <w:bookmarkStart w:id="40" w:name="tab:hlm_resultados"/>
+    <w:bookmarkStart w:id="35" w:name="tab:hlm_resultados"/>
     <w:p>
       <w:pPr>
         <w:pStyle w:val="TableCaption"/>
@@ -20472,7 +19044,7 @@
         </w:tc>
       </w:tr>
     </w:tbl>
-    <w:bookmarkEnd w:id="40"/>
+    <w:bookmarkEnd w:id="35"/>
     <w:p>
       <w:pPr>
         <w:pStyle w:val="BodyText"/>
@@ -20594,7 +19166,7 @@
           <w:rFonts w:ascii="Arial" w:hAnsi="Arial"/>
           <w:sz w:val="22"/>
         </w:rPr>
-        <w:t xml:space="preserve">desta ordem quase todo coeficiente é significante; a inferência relevante está nos intervalos de confiança, não nos asteriscos</w:t>
+        <w:t>desta ordem quase todo coeficiente é significante; a inferência relevante está nos intervalos de confiança, não nos asteriscos</w:t>
       </w:r>
       <w:r>
         <w:rPr>
@@ -20870,7 +19442,7 @@
           <w:rFonts w:ascii="Arial" w:hAnsi="Arial"/>
           <w:sz w:val="22"/>
         </w:rPr>
-        <w:t xml:space="preserve">; LR</w:t>
+        <w:t>; LR</w:t>
       </w:r>
       <w:r>
         <w:rPr>
@@ -20939,7 +19511,7 @@
           <w:rFonts w:ascii="Arial" w:hAnsi="Arial"/>
           <w:sz w:val="22"/>
         </w:rPr>
-        <w:t xml:space="preserve">: a penalidade racial varia entre bairros;</w:t>
+        <w:t>: a penalidade racial varia entre bairros;</w:t>
       </w:r>
       <w:r>
         <w:rPr>
@@ -21026,6 +19598,1421 @@
           <w:sz w:val="22"/>
         </w:rPr>
         <w:t xml:space="preserve"/>
+      </w:r>
+    </w:p>
+    <w:p>
+      <w:pPr>
+        <w:pStyle w:val="BodyText"/>
+        <w:spacing w:line="360" w:lineRule="auto" w:after="0"/>
+        <w:ind w:firstLine="709"/>
+        <w:jc w:val="both"/>
+      </w:pPr>
+      <w:r>
+        <w:rPr>
+          <w:rFonts w:ascii="Arial" w:hAnsi="Arial"/>
+          <w:b/>
+          <w:bCs/>
+          <w:sz w:val="22"/>
+        </w:rPr>
+        <w:t xml:space="preserve">Mais de um terço da diferença de renda está entre bairros, não dentro deles.</w:t>
+      </w:r>
+      <w:r>
+        <w:rPr>
+          <w:rFonts w:ascii="Arial" w:hAnsi="Arial"/>
+          <w:sz w:val="22"/>
+        </w:rPr>
+        <w:t xml:space="preserve"> </w:t>
+      </w:r>
+      <w:r>
+        <w:rPr>
+          <w:rFonts w:ascii="Arial" w:hAnsi="Arial"/>
+          <w:sz w:val="22"/>
+        </w:rPr>
+        <w:t xml:space="preserve">Antes de qualquer controle, o modelo nulo reparte a variação do log-rendimento em duas</w:t>
+      </w:r>
+      <w:r>
+        <w:rPr>
+          <w:rFonts w:ascii="Arial" w:hAnsi="Arial"/>
+          <w:sz w:val="22"/>
+        </w:rPr>
+        <w:t xml:space="preserve"> </w:t>
+      </w:r>
+      <w:r>
+        <w:rPr>
+          <w:rFonts w:ascii="Arial" w:hAnsi="Arial"/>
+          <w:sz w:val="22"/>
+        </w:rPr>
+        <w:t xml:space="preserve">parcelas: a que separa um bairro de outro e a que separa dois vizinhos. O ICC da UPA é</w:t>
+      </w:r>
+      <w:r>
+        <w:rPr>
+          <w:rFonts w:ascii="Arial" w:hAnsi="Arial"/>
+          <w:sz w:val="22"/>
+        </w:rPr>
+        <w:t xml:space="preserve"> </w:t>
+      </w:r>
+      <w:r>
+        <w:rPr>
+          <w:rFonts w:ascii="Arial" w:hAnsi="Arial"/>
+          <w:sz w:val="22"/>
+        </w:rPr>
+        <w:t xml:space="preserve">de 0,353</w:t>
+      </w:r>
+      <w:r>
+        <w:rPr>
+          <w:rStyle w:val="FootnoteReference"/>
+          <w:rFonts w:ascii="Arial" w:hAnsi="Arial"/>
+          <w:sz w:val="22"/>
+          <w:vertAlign w:val="superscript"/>
+        </w:rPr>
+        <w:footnoteReference w:id="36"/>
+      </w:r>
+      <w:r>
+        <w:rPr>
+          <w:rFonts w:ascii="Arial" w:hAnsi="Arial"/>
+          <w:sz w:val="22"/>
+        </w:rPr>
+        <w:t xml:space="preserve"> </w:t>
+      </w:r>
+      <w:r>
+        <w:rPr>
+          <w:rFonts w:ascii="Arial" w:hAnsi="Arial"/>
+          <w:sz w:val="22"/>
+        </w:rPr>
+        <w:t xml:space="preserve">— isto é,</w:t>
+      </w:r>
+      <w:r>
+        <w:rPr>
+          <w:rFonts w:ascii="Arial" w:hAnsi="Arial"/>
+          <w:sz w:val="22"/>
+        </w:rPr>
+        <w:t xml:space="preserve"> </w:t>
+      </w:r>
+      <w:r>
+        <w:rPr>
+          <w:rFonts w:ascii="Arial" w:hAnsi="Arial"/>
+          <w:b/>
+          <w:bCs/>
+          <w:sz w:val="22"/>
+        </w:rPr>
+        <w:t xml:space="preserve">35,3% da</w:t>
+      </w:r>
+      <w:r>
+        <w:rPr>
+          <w:rFonts w:ascii="Arial" w:hAnsi="Arial"/>
+          <w:b/>
+          <w:bCs/>
+          <w:sz w:val="22"/>
+        </w:rPr>
+        <w:t xml:space="preserve"> </w:t>
+      </w:r>
+      <w:r>
+        <w:rPr>
+          <w:rFonts w:ascii="Arial" w:hAnsi="Arial"/>
+          <w:b/>
+          <w:bCs/>
+          <w:sz w:val="22"/>
+        </w:rPr>
+        <w:t xml:space="preserve">variância do log-rendimento está entre bairros</w:t>
+      </w:r>
+      <w:r>
+        <w:rPr>
+          <w:rFonts w:ascii="Arial" w:hAnsi="Arial"/>
+          <w:sz w:val="22"/>
+        </w:rPr>
+        <w:t xml:space="preserve">. Em linguagem de leitor: de toda a</w:t>
+      </w:r>
+      <w:r>
+        <w:rPr>
+          <w:rFonts w:ascii="Arial" w:hAnsi="Arial"/>
+          <w:sz w:val="22"/>
+        </w:rPr>
+        <w:t xml:space="preserve"> </w:t>
+      </w:r>
+      <w:r>
+        <w:rPr>
+          <w:rFonts w:ascii="Arial" w:hAnsi="Arial"/>
+          <w:sz w:val="22"/>
+        </w:rPr>
+        <w:t xml:space="preserve">diferença de renda entre duas pessoas sorteadas ao acaso no país, mais de um terço já</w:t>
+      </w:r>
+      <w:r>
+        <w:rPr>
+          <w:rFonts w:ascii="Arial" w:hAnsi="Arial"/>
+          <w:sz w:val="22"/>
+        </w:rPr>
+        <w:t xml:space="preserve"> </w:t>
+      </w:r>
+      <w:r>
+        <w:rPr>
+          <w:rFonts w:ascii="Arial" w:hAnsi="Arial"/>
+          <w:sz w:val="22"/>
+        </w:rPr>
+        <w:t xml:space="preserve">está associada a morarem em bairros diferentes, antes de se saber qualquer outra coisa</w:t>
+      </w:r>
+      <w:r>
+        <w:rPr>
+          <w:rFonts w:ascii="Arial" w:hAnsi="Arial"/>
+          <w:sz w:val="22"/>
+        </w:rPr>
+        <w:t xml:space="preserve"> </w:t>
+      </w:r>
+      <w:r>
+        <w:rPr>
+          <w:rFonts w:ascii="Arial" w:hAnsi="Arial"/>
+          <w:sz w:val="22"/>
+        </w:rPr>
+        <w:t xml:space="preserve">sobre elas. É muito acima do limiar de 5% a partir do qual</w:t>
+      </w:r>
+      <w:r>
+        <w:rPr>
+          <w:rFonts w:ascii="Arial" w:hAnsi="Arial"/>
+          <w:sz w:val="22"/>
+        </w:rPr>
+        <w:t xml:space="preserve"> </w:t>
+      </w:r>
+      <w:r>
+        <w:rPr>
+          <w:rFonts w:ascii="Arial" w:hAnsi="Arial"/>
+          <w:sz w:val="22"/>
+        </w:rPr>
+        <w:t xml:space="preserve">Raudenbush e Bryk (2002)</w:t>
+      </w:r>
+      <w:r>
+        <w:rPr>
+          <w:rFonts w:ascii="Arial" w:hAnsi="Arial"/>
+          <w:sz w:val="22"/>
+        </w:rPr>
+        <w:t xml:space="preserve"> </w:t>
+      </w:r>
+      <w:r>
+        <w:rPr>
+          <w:rFonts w:ascii="Arial" w:hAnsi="Arial"/>
+          <w:sz w:val="22"/>
+        </w:rPr>
+        <w:t xml:space="preserve">consideram indispensável tratar a estrutura aninhada, e maior do que a parcela entre</w:t>
+      </w:r>
+      <w:r>
+        <w:rPr>
+          <w:rFonts w:ascii="Arial" w:hAnsi="Arial"/>
+          <w:sz w:val="22"/>
+        </w:rPr>
+        <w:t xml:space="preserve"> </w:t>
+      </w:r>
+      <w:r>
+        <w:rPr>
+          <w:rFonts w:ascii="Arial" w:hAnsi="Arial"/>
+          <w:sz w:val="22"/>
+        </w:rPr>
+        <w:t xml:space="preserve">estados (cerca de 11%, no modelo alternativo com UF aleatória usado como robustez).</w:t>
+      </w:r>
+      <w:r>
+        <w:rPr>
+          <w:rFonts w:ascii="Arial" w:hAnsi="Arial"/>
+          <w:sz w:val="22"/>
+        </w:rPr>
+        <w:t xml:space="preserve"> </w:t>
+      </w:r>
+      <w:r>
+        <w:rPr>
+          <w:rFonts w:ascii="Arial" w:hAnsi="Arial"/>
+          <w:sz w:val="22"/>
+        </w:rPr>
+        <w:t xml:space="preserve">Ignorar essa estrutura trataria como independentes pessoas que compartilham o mesmo</w:t>
+      </w:r>
+      <w:r>
+        <w:rPr>
+          <w:rFonts w:ascii="Arial" w:hAnsi="Arial"/>
+          <w:sz w:val="22"/>
+        </w:rPr>
+        <w:t xml:space="preserve"> </w:t>
+      </w:r>
+      <w:r>
+        <w:rPr>
+          <w:rFonts w:ascii="Arial" w:hAnsi="Arial"/>
+          <w:sz w:val="22"/>
+        </w:rPr>
+        <w:t xml:space="preserve">mercado de trabalho local.</w:t>
+      </w:r>
+    </w:p>
+    <w:p>
+      <w:pPr>
+        <w:pStyle w:val="BodyText"/>
+        <w:spacing w:line="360" w:lineRule="auto" w:after="0"/>
+        <w:ind w:firstLine="709"/>
+        <w:jc w:val="both"/>
+      </w:pPr>
+      <w:r>
+        <w:rPr>
+          <w:rFonts w:ascii="Arial" w:hAnsi="Arial"/>
+          <w:b/>
+          <w:bCs/>
+          <w:sz w:val="22"/>
+        </w:rPr>
+        <w:t xml:space="preserve">Comparar vizinhos reduz o gap em cerca de 40%.</w:t>
+      </w:r>
+      <w:r>
+        <w:rPr>
+          <w:rFonts w:ascii="Arial" w:hAnsi="Arial"/>
+          <w:sz w:val="22"/>
+        </w:rPr>
+        <w:t xml:space="preserve"> </w:t>
+      </w:r>
+      <w:r>
+        <w:rPr>
+          <w:rFonts w:ascii="Arial" w:hAnsi="Arial"/>
+          <w:sz w:val="22"/>
+        </w:rPr>
+        <w:t xml:space="preserve">Com escolaridade, idade, sexo, horas, situação urbana e ano, mas</w:t>
+      </w:r>
+      <w:r>
+        <w:rPr>
+          <w:rFonts w:ascii="Arial" w:hAnsi="Arial"/>
+          <w:sz w:val="22"/>
+        </w:rPr>
+        <w:t xml:space="preserve"> </w:t>
+      </w:r>
+      <w:r>
+        <w:rPr>
+          <w:rFonts w:ascii="Arial" w:hAnsi="Arial"/>
+          <w:sz w:val="22"/>
+        </w:rPr>
+        <w:t xml:space="preserve">sem</w:t>
+      </w:r>
+      <w:r>
+        <w:rPr>
+          <w:rFonts w:ascii="Arial" w:hAnsi="Arial"/>
+          <w:sz w:val="22"/>
+        </w:rPr>
+        <w:t xml:space="preserve"> </w:t>
+      </w:r>
+      <w:r>
+        <w:rPr>
+          <w:rFonts w:ascii="Arial" w:hAnsi="Arial"/>
+          <w:sz w:val="22"/>
+        </w:rPr>
+        <w:t xml:space="preserve">nenhum</w:t>
+      </w:r>
+      <w:r>
+        <w:rPr>
+          <w:rFonts w:ascii="Arial" w:hAnsi="Arial"/>
+          <w:sz w:val="22"/>
+        </w:rPr>
+        <w:t xml:space="preserve"> </w:t>
+      </w:r>
+      <w:r>
+        <w:rPr>
+          <w:rFonts w:ascii="Arial" w:hAnsi="Arial"/>
+          <w:sz w:val="22"/>
+        </w:rPr>
+        <w:t xml:space="preserve">efeito de bairro (OLS com efeitos fixos de UF, Subseção</w:t>
+      </w:r>
+      <w:r>
+        <w:rPr>
+          <w:rFonts w:ascii="Arial" w:hAnsi="Arial"/>
+          <w:sz w:val="22"/>
+        </w:rPr>
+        <w:t xml:space="preserve"> </w:t>
+      </w:r>
+      <w:r>
+        <w:rPr>
+          <w:rFonts w:ascii="Arial" w:hAnsi="Arial"/>
+          <w:sz w:val="22"/>
+        </w:rPr>
+        <w:t xml:space="preserve">“Inferência: erros-padrão agrupados, poucos clusters e pesos”</w:t>
+      </w:r>
+      <w:r>
+        <w:rPr>
+          <w:rFonts w:ascii="Arial" w:hAnsi="Arial"/>
+          <w:sz w:val="22"/>
+        </w:rPr>
+        <w:t xml:space="preserve">),</w:t>
+      </w:r>
+      <w:r>
+        <w:rPr>
+          <w:rFonts w:ascii="Arial" w:hAnsi="Arial"/>
+          <w:sz w:val="22"/>
+        </w:rPr>
+        <w:t xml:space="preserve"> </w:t>
+      </w:r>
+      <w:r>
+        <w:rPr>
+          <w:rFonts w:ascii="Arial" w:hAnsi="Arial"/>
+          <w:sz w:val="22"/>
+        </w:rPr>
+        <w:t xml:space="preserve">trabalhadores negros recebem</w:t>
+      </w:r>
+      <w:r>
+        <w:rPr>
+          <w:rFonts w:ascii="Arial" w:hAnsi="Arial"/>
+          <w:sz w:val="22"/>
+        </w:rPr>
+        <w:t xml:space="preserve"> </w:t>
+      </w:r>
+      <w:r>
+        <w:rPr>
+          <w:rFonts w:ascii="Arial" w:hAnsi="Arial"/>
+          <w:b/>
+          <w:bCs/>
+          <w:sz w:val="22"/>
+        </w:rPr>
+        <w:t xml:space="preserve">10,5% a menos</w:t>
+      </w:r>
+      <w:r>
+        <w:rPr>
+          <w:rFonts w:ascii="Arial" w:hAnsi="Arial"/>
+          <w:sz w:val="22"/>
+        </w:rPr>
+        <w:t xml:space="preserve"> </w:t>
+      </w:r>
+      <w:r>
+        <w:rPr>
+          <w:rFonts w:ascii="Arial" w:hAnsi="Arial"/>
+          <w:sz w:val="22"/>
+        </w:rPr>
+        <w:t xml:space="preserve">que brancos comparáveis</w:t>
+      </w:r>
+      <w:r>
+        <w:rPr>
+          <w:rFonts w:ascii="Arial" w:hAnsi="Arial"/>
+          <w:sz w:val="22"/>
+        </w:rPr>
+        <w:t xml:space="preserve"> </w:t>
+      </w:r>
+      <w:r>
+        <w:rPr>
+          <w:rFonts w:ascii="Arial" w:hAnsi="Arial"/>
+          <w:sz w:val="22"/>
+        </w:rPr>
+        <w:t xml:space="preserve">(</w:t>
+      </w:r>
+      <m:oMath>
+        <m:acc>
+          <m:accPr>
+            <m:chr m:val="̂"/>
+          </m:accPr>
+          <m:e>
+            <m:r>
+              <m:t>β</m:t>
+            </m:r>
+          </m:e>
+        </m:acc>
+        <m:r>
+          <m:rPr>
+            <m:sty m:val="p"/>
+          </m:rPr>
+          <m:t>=</m:t>
+        </m:r>
+        <m:r>
+          <m:rPr>
+            <m:sty m:val="p"/>
+          </m:rPr>
+          <m:t>−</m:t>
+        </m:r>
+        <m:r>
+          <m:t>0</m:t>
+        </m:r>
+        <m:r>
+          <m:rPr>
+            <m:sty m:val="p"/>
+          </m:rPr>
+          <m:t>,</m:t>
+        </m:r>
+        <m:r>
+          <m:t>1104</m:t>
+        </m:r>
+      </m:oMath>
+      <w:r>
+        <w:rPr>
+          <w:rFonts w:ascii="Arial" w:hAnsi="Arial"/>
+          <w:sz w:val="22"/>
+        </w:rPr>
+        <w:t xml:space="preserve">)</w:t>
+      </w:r>
+      <w:r>
+        <w:rPr>
+          <w:rStyle w:val="FootnoteReference"/>
+          <w:rFonts w:ascii="Arial" w:hAnsi="Arial"/>
+          <w:sz w:val="22"/>
+          <w:vertAlign w:val="superscript"/>
+        </w:rPr>
+        <w:footnoteReference w:id="37"/>
+      </w:r>
+      <w:r>
+        <w:rPr>
+          <w:rFonts w:ascii="Arial" w:hAnsi="Arial"/>
+          <w:sz w:val="22"/>
+        </w:rPr>
+        <w:t xml:space="preserve">. O M1 acrescenta o intercepto aleatório de UPA — na</w:t>
+      </w:r>
+      <w:r>
+        <w:rPr>
+          <w:rFonts w:ascii="Arial" w:hAnsi="Arial"/>
+          <w:sz w:val="22"/>
+        </w:rPr>
+        <w:t xml:space="preserve"> </w:t>
+      </w:r>
+      <w:r>
+        <w:rPr>
+          <w:rFonts w:ascii="Arial" w:hAnsi="Arial"/>
+          <w:sz w:val="22"/>
+        </w:rPr>
+        <w:t xml:space="preserve">prática, um nível de renda próprio para cada bairro — e com ele a comparação deixa de</w:t>
+      </w:r>
+      <w:r>
+        <w:rPr>
+          <w:rFonts w:ascii="Arial" w:hAnsi="Arial"/>
+          <w:sz w:val="22"/>
+        </w:rPr>
+        <w:t xml:space="preserve"> </w:t>
+      </w:r>
+      <w:r>
+        <w:rPr>
+          <w:rFonts w:ascii="Arial" w:hAnsi="Arial"/>
+          <w:sz w:val="22"/>
+        </w:rPr>
+        <w:t xml:space="preserve">ser entre todos os trabalhadores do país e passa a ser entre negros e brancos</w:t>
+      </w:r>
+      <w:r>
+        <w:rPr>
+          <w:rFonts w:ascii="Arial" w:hAnsi="Arial"/>
+          <w:sz w:val="22"/>
+        </w:rPr>
+        <w:t xml:space="preserve"> </w:t>
+      </w:r>
+      <w:r>
+        <w:rPr>
+          <w:rFonts w:ascii="Arial" w:hAnsi="Arial"/>
+          <w:sz w:val="22"/>
+        </w:rPr>
+        <w:t xml:space="preserve">do</w:t>
+      </w:r>
+      <w:r>
+        <w:rPr>
+          <w:rFonts w:ascii="Arial" w:hAnsi="Arial"/>
+          <w:sz w:val="22"/>
+        </w:rPr>
+        <w:t xml:space="preserve"> </w:t>
+      </w:r>
+      <w:r>
+        <w:rPr>
+          <w:rFonts w:ascii="Arial" w:hAnsi="Arial"/>
+          <w:sz w:val="22"/>
+        </w:rPr>
+        <w:t xml:space="preserve">mesmo bairro</w:t>
+      </w:r>
+      <w:r>
+        <w:rPr>
+          <w:rFonts w:ascii="Arial" w:hAnsi="Arial"/>
+          <w:sz w:val="22"/>
+        </w:rPr>
+        <w:t xml:space="preserve">: a penalidade cai para</w:t>
+      </w:r>
+      <w:r>
+        <w:rPr>
+          <w:rFonts w:ascii="Arial" w:hAnsi="Arial"/>
+          <w:sz w:val="22"/>
+        </w:rPr>
+        <w:t xml:space="preserve"> </w:t>
+      </w:r>
+      <w:r>
+        <w:rPr>
+          <w:rFonts w:ascii="Arial" w:hAnsi="Arial"/>
+          <w:b/>
+          <w:bCs/>
+          <w:sz w:val="22"/>
+        </w:rPr>
+        <w:t xml:space="preserve">6,5%</w:t>
+      </w:r>
+      <w:r>
+        <w:rPr>
+          <w:rStyle w:val="FootnoteReference"/>
+          <w:rFonts w:ascii="Arial" w:hAnsi="Arial"/>
+          <w:sz w:val="22"/>
+          <w:vertAlign w:val="superscript"/>
+        </w:rPr>
+        <w:footnoteReference w:id="38"/>
+      </w:r>
+      <w:r>
+        <w:rPr>
+          <w:rFonts w:ascii="Arial" w:hAnsi="Arial"/>
+          <w:sz w:val="22"/>
+        </w:rPr>
+        <w:t xml:space="preserve">. Medida na régua do gap agregado,</w:t>
+      </w:r>
+      <w:r>
+        <w:rPr>
+          <w:rFonts w:ascii="Arial" w:hAnsi="Arial"/>
+          <w:sz w:val="22"/>
+        </w:rPr>
+        <w:t xml:space="preserve"> </w:t>
+      </w:r>
+      <w:r>
+        <w:rPr>
+          <w:rFonts w:ascii="Arial" w:hAnsi="Arial"/>
+          <w:b/>
+          <w:bCs/>
+          <w:sz w:val="22"/>
+        </w:rPr>
+        <w:t xml:space="preserve">39,5% da distância já foi percorrida</w:t>
+      </w:r>
+      <w:r>
+        <w:rPr>
+          <w:rFonts w:ascii="Arial" w:hAnsi="Arial"/>
+          <w:sz w:val="22"/>
+        </w:rPr>
+        <w:t xml:space="preserve"> </w:t>
+      </w:r>
+      <w:r>
+        <w:rPr>
+          <w:rFonts w:ascii="Arial" w:hAnsi="Arial"/>
+          <w:sz w:val="22"/>
+        </w:rPr>
+        <w:t xml:space="preserve">— percorrida no sentido de</w:t>
+      </w:r>
+      <w:r>
+        <w:rPr>
+          <w:rFonts w:ascii="Arial" w:hAnsi="Arial"/>
+          <w:sz w:val="22"/>
+        </w:rPr>
+        <w:t xml:space="preserve"> </w:t>
+      </w:r>
+      <w:r>
+        <w:rPr>
+          <w:rFonts w:ascii="Arial" w:hAnsi="Arial"/>
+          <w:sz w:val="22"/>
+        </w:rPr>
+        <w:t xml:space="preserve">atribuída a um fator observável, e não no sentido de explicada sem discriminação, já que</w:t>
+      </w:r>
+      <w:r>
+        <w:rPr>
+          <w:rFonts w:ascii="Arial" w:hAnsi="Arial"/>
+          <w:sz w:val="22"/>
+        </w:rPr>
+        <w:t xml:space="preserve"> </w:t>
+      </w:r>
+      <w:r>
+        <w:rPr>
+          <w:rFonts w:ascii="Arial" w:hAnsi="Arial"/>
+          <w:sz w:val="22"/>
+        </w:rPr>
+        <w:t xml:space="preserve">o bairro em que se consegue morar é ele próprio produto de exclusão. Esse é o teste da</w:t>
+      </w:r>
+      <w:r>
+        <w:rPr>
+          <w:rFonts w:ascii="Arial" w:hAnsi="Arial"/>
+          <w:sz w:val="22"/>
+        </w:rPr>
+        <w:t xml:space="preserve"> </w:t>
+      </w:r>
+      <w:r>
+        <w:rPr>
+          <w:rFonts w:ascii="Arial" w:hAnsi="Arial"/>
+          <w:sz w:val="22"/>
+        </w:rPr>
+        <w:t xml:space="preserve">Hipótese H1, e ele passa: negros e brancos com o mesmo capital humano não moram nos</w:t>
+      </w:r>
+      <w:r>
+        <w:rPr>
+          <w:rFonts w:ascii="Arial" w:hAnsi="Arial"/>
+          <w:sz w:val="22"/>
+        </w:rPr>
+        <w:t xml:space="preserve"> </w:t>
+      </w:r>
+      <w:r>
+        <w:rPr>
+          <w:rFonts w:ascii="Arial" w:hAnsi="Arial"/>
+          <w:sz w:val="22"/>
+        </w:rPr>
+        <w:t xml:space="preserve">mesmos bairros, e os bairros pagam diferente. Os controles individuais explicam, além</w:t>
+      </w:r>
+      <w:r>
+        <w:rPr>
+          <w:rFonts w:ascii="Arial" w:hAnsi="Arial"/>
+          <w:sz w:val="22"/>
+        </w:rPr>
+        <w:t xml:space="preserve"> </w:t>
+      </w:r>
+      <w:r>
+        <w:rPr>
+          <w:rFonts w:ascii="Arial" w:hAnsi="Arial"/>
+          <w:sz w:val="22"/>
+        </w:rPr>
+        <w:t xml:space="preserve">disso, 66,5% da variância entre bairros do M0 — parte do que parecia</w:t>
+      </w:r>
+      <w:r>
+        <w:rPr>
+          <w:rFonts w:ascii="Arial" w:hAnsi="Arial"/>
+          <w:sz w:val="22"/>
+        </w:rPr>
+        <w:t xml:space="preserve"> </w:t>
+      </w:r>
+      <w:r>
+        <w:rPr>
+          <w:rFonts w:ascii="Arial" w:hAnsi="Arial"/>
+          <w:sz w:val="22"/>
+        </w:rPr>
+        <w:t xml:space="preserve">“bairro”</w:t>
+      </w:r>
+      <w:r>
+        <w:rPr>
+          <w:rFonts w:ascii="Arial" w:hAnsi="Arial"/>
+          <w:sz w:val="22"/>
+        </w:rPr>
+        <w:t xml:space="preserve"> </w:t>
+      </w:r>
+      <w:r>
+        <w:rPr>
+          <w:rFonts w:ascii="Arial" w:hAnsi="Arial"/>
+          <w:sz w:val="22"/>
+        </w:rPr>
+        <w:t xml:space="preserve">é composição de quem mora nele.</w:t>
+      </w:r>
+    </w:p>
+    <w:p>
+      <w:pPr>
+        <w:pStyle w:val="BodyText"/>
+        <w:spacing w:line="360" w:lineRule="auto" w:after="0"/>
+        <w:ind w:firstLine="709"/>
+        <w:jc w:val="both"/>
+      </w:pPr>
+      <w:r>
+        <w:rPr>
+          <w:rFonts w:ascii="Arial" w:hAnsi="Arial"/>
+          <w:sz w:val="22"/>
+        </w:rPr>
+        <w:t xml:space="preserve">Vale guardar a frase: 39</w:t>
+      </w:r>
+      <w:r>
+        <w:rPr>
+          <w:rFonts w:ascii="Arial" w:hAnsi="Arial"/>
+          <w:sz w:val="22"/>
+        </w:rPr>
+        <w:t xml:space="preserve">,</w:t>
+      </w:r>
+      <w:r>
+        <w:rPr>
+          <w:rFonts w:ascii="Arial" w:hAnsi="Arial"/>
+          <w:sz w:val="22"/>
+        </w:rPr>
+        <w:t xml:space="preserve">5% do gap racial não separam duas pessoas,</w:t>
+      </w:r>
+      <w:r>
+        <w:rPr>
+          <w:rFonts w:ascii="Arial" w:hAnsi="Arial"/>
+          <w:sz w:val="22"/>
+        </w:rPr>
+        <w:t xml:space="preserve"> </w:t>
+      </w:r>
+      <w:r>
+        <w:rPr>
+          <w:rFonts w:ascii="Arial" w:hAnsi="Arial"/>
+          <w:sz w:val="22"/>
+        </w:rPr>
+        <w:t xml:space="preserve">separam dois endereços. Resta saber o que, num endereço, produz essa diferença.</w:t>
+      </w:r>
+    </w:p>
+    <w:p>
+      <w:pPr>
+        <w:pStyle w:val="BodyText"/>
+        <w:spacing w:line="360" w:lineRule="auto" w:after="0"/>
+        <w:ind w:firstLine="709"/>
+        <w:jc w:val="both"/>
+      </w:pPr>
+      <w:r>
+        <w:rPr>
+          <w:rFonts w:ascii="Arial" w:hAnsi="Arial"/>
+          <w:b/>
+          <w:bCs/>
+          <w:sz w:val="22"/>
+        </w:rPr>
+        <w:t xml:space="preserve">Morar onde moram os negros custa outra vez.</w:t>
+      </w:r>
+      <w:r>
+        <w:rPr>
+          <w:rFonts w:ascii="Arial" w:hAnsi="Arial"/>
+          <w:sz w:val="22"/>
+        </w:rPr>
+        <w:t xml:space="preserve"> </w:t>
+      </w:r>
+      <w:r>
+        <w:rPr>
+          <w:rFonts w:ascii="Arial" w:hAnsi="Arial"/>
+          <w:sz w:val="22"/>
+        </w:rPr>
+        <w:t xml:space="preserve">O M2 pergunta o que, num bairro, faz a renda ser mais alta ou mais baixa, e responde com</w:t>
+      </w:r>
+      <w:r>
+        <w:rPr>
+          <w:rFonts w:ascii="Arial" w:hAnsi="Arial"/>
+          <w:sz w:val="22"/>
+        </w:rPr>
+        <w:t xml:space="preserve"> </w:t>
+      </w:r>
+      <w:r>
+        <w:rPr>
+          <w:rFonts w:ascii="Arial" w:hAnsi="Arial"/>
+          <w:sz w:val="22"/>
+        </w:rPr>
+        <w:t xml:space="preserve">três covariáveis de nível 2 que juntas explicam 55,2% da variância</w:t>
+      </w:r>
+      <w:r>
+        <w:rPr>
+          <w:rFonts w:ascii="Arial" w:hAnsi="Arial"/>
+          <w:sz w:val="22"/>
+        </w:rPr>
+        <w:t xml:space="preserve"> </w:t>
+      </w:r>
+      <w:r>
+        <w:rPr>
+          <w:rFonts w:ascii="Arial" w:hAnsi="Arial"/>
+          <w:sz w:val="22"/>
+        </w:rPr>
+        <w:t xml:space="preserve">entre bairros que restava no M1</w:t>
+      </w:r>
+      <w:r>
+        <w:rPr>
+          <w:rStyle w:val="FootnoteReference"/>
+          <w:rFonts w:ascii="Arial" w:hAnsi="Arial"/>
+          <w:sz w:val="22"/>
+          <w:vertAlign w:val="superscript"/>
+        </w:rPr>
+        <w:footnoteReference w:id="39"/>
+      </w:r>
+      <w:r>
+        <w:rPr>
+          <w:rFonts w:ascii="Arial" w:hAnsi="Arial"/>
+          <w:sz w:val="22"/>
+        </w:rPr>
+        <w:t xml:space="preserve">. A mais eloquente é a</w:t>
+      </w:r>
+      <w:r>
+        <w:rPr>
+          <w:rFonts w:ascii="Arial" w:hAnsi="Arial"/>
+          <w:sz w:val="22"/>
+        </w:rPr>
+        <w:t xml:space="preserve"> </w:t>
+      </w:r>
+      <w:r>
+        <w:rPr>
+          <w:rFonts w:ascii="Arial" w:hAnsi="Arial"/>
+          <w:sz w:val="22"/>
+        </w:rPr>
+        <w:t xml:space="preserve">composição racial:</w:t>
+      </w:r>
+      <w:r>
+        <w:rPr>
+          <w:rFonts w:ascii="Arial" w:hAnsi="Arial"/>
+          <w:sz w:val="22"/>
+        </w:rPr>
+        <w:t xml:space="preserve"> </w:t>
+      </w:r>
+      <m:oMath>
+        <m:sSub>
+          <m:e>
+            <m:acc>
+              <m:accPr>
+                <m:chr m:val="̂"/>
+              </m:accPr>
+              <m:e>
+                <m:r>
+                  <m:t>γ</m:t>
+                </m:r>
+              </m:e>
+            </m:acc>
+          </m:e>
+          <m:sub>
+            <m:r>
+              <m:t>01</m:t>
+            </m:r>
+          </m:sub>
+        </m:sSub>
+        <m:r>
+          <m:rPr>
+            <m:sty m:val="p"/>
+          </m:rPr>
+          <m:t>=</m:t>
+        </m:r>
+        <m:r>
+          <m:rPr>
+            <m:sty m:val="p"/>
+          </m:rPr>
+          <m:t>−</m:t>
+        </m:r>
+        <m:r>
+          <m:t>0</m:t>
+        </m:r>
+        <m:r>
+          <m:rPr>
+            <m:sty m:val="p"/>
+          </m:rPr>
+          <m:t>,</m:t>
+        </m:r>
+        <m:r>
+          <m:t>1272</m:t>
+        </m:r>
+      </m:oMath>
+      <w:r>
+        <w:rPr>
+          <w:rFonts w:ascii="Arial" w:hAnsi="Arial"/>
+          <w:sz w:val="22"/>
+        </w:rPr>
+        <w:t xml:space="preserve"> </w:t>
+      </w:r>
+      <w:r>
+        <w:rPr>
+          <w:rFonts w:ascii="Arial" w:hAnsi="Arial"/>
+          <w:sz w:val="22"/>
+        </w:rPr>
+        <w:t xml:space="preserve">significa que um desvio-padrão a mais</w:t>
+      </w:r>
+      <w:r>
+        <w:rPr>
+          <w:rFonts w:ascii="Arial" w:hAnsi="Arial"/>
+          <w:sz w:val="22"/>
+        </w:rPr>
+        <w:t xml:space="preserve"> </w:t>
+      </w:r>
+      <w:r>
+        <w:rPr>
+          <w:rFonts w:ascii="Arial" w:hAnsi="Arial"/>
+          <w:sz w:val="22"/>
+        </w:rPr>
+        <w:t xml:space="preserve">na proporção de moradores negros da UPA reduz o rendimento de</w:t>
+      </w:r>
+      <w:r>
+        <w:rPr>
+          <w:rFonts w:ascii="Arial" w:hAnsi="Arial"/>
+          <w:sz w:val="22"/>
+        </w:rPr>
+        <w:t xml:space="preserve"> </w:t>
+      </w:r>
+      <w:r>
+        <w:rPr>
+          <w:rFonts w:ascii="Arial" w:hAnsi="Arial"/>
+          <w:sz w:val="22"/>
+        </w:rPr>
+        <w:t xml:space="preserve">todos</w:t>
+      </w:r>
+      <w:r>
+        <w:rPr>
+          <w:rFonts w:ascii="Arial" w:hAnsi="Arial"/>
+          <w:sz w:val="22"/>
+        </w:rPr>
+        <w:t xml:space="preserve"> </w:t>
+      </w:r>
+      <w:r>
+        <w:rPr>
+          <w:rFonts w:ascii="Arial" w:hAnsi="Arial"/>
+          <w:sz w:val="22"/>
+        </w:rPr>
+        <w:t xml:space="preserve">os moradores,</w:t>
+      </w:r>
+      <w:r>
+        <w:rPr>
+          <w:rFonts w:ascii="Arial" w:hAnsi="Arial"/>
+          <w:sz w:val="22"/>
+        </w:rPr>
+        <w:t xml:space="preserve"> </w:t>
+      </w:r>
+      <w:r>
+        <w:rPr>
+          <w:rFonts w:ascii="Arial" w:hAnsi="Arial"/>
+          <w:sz w:val="22"/>
+        </w:rPr>
+        <w:t xml:space="preserve">negros e brancos, em 0,13 log-pontos — cerca de 2</w:t>
+      </w:r>
+      <w:r>
+        <w:rPr>
+          <w:rFonts w:ascii="Arial" w:hAnsi="Arial"/>
+          <w:sz w:val="22"/>
+        </w:rPr>
+        <w:t xml:space="preserve">,</w:t>
+      </w:r>
+      <w:r>
+        <w:rPr>
+          <w:rFonts w:ascii="Arial" w:hAnsi="Arial"/>
+          <w:sz w:val="22"/>
+        </w:rPr>
+        <w:t xml:space="preserve">0 vezes a</w:t>
+      </w:r>
+      <w:r>
+        <w:rPr>
+          <w:rFonts w:ascii="Arial" w:hAnsi="Arial"/>
+          <w:sz w:val="22"/>
+        </w:rPr>
+        <w:t xml:space="preserve"> </w:t>
+      </w:r>
+      <w:r>
+        <w:rPr>
+          <w:rFonts w:ascii="Arial" w:hAnsi="Arial"/>
+          <w:sz w:val="22"/>
+        </w:rPr>
+        <w:t xml:space="preserve">penalidade que um trabalhador negro carrega individualmente no mesmo modelo. É a evidência</w:t>
+      </w:r>
+      <w:r>
+        <w:rPr>
+          <w:rFonts w:ascii="Arial" w:hAnsi="Arial"/>
+          <w:sz w:val="22"/>
+        </w:rPr>
+        <w:t xml:space="preserve"> </w:t>
+      </w:r>
+      <w:r>
+        <w:rPr>
+          <w:rFonts w:ascii="Arial" w:hAnsi="Arial"/>
+          <w:sz w:val="22"/>
+        </w:rPr>
+        <w:t xml:space="preserve">mais direta da</w:t>
+      </w:r>
+      <w:r>
+        <w:rPr>
+          <w:rFonts w:ascii="Arial" w:hAnsi="Arial"/>
+          <w:sz w:val="22"/>
+        </w:rPr>
+        <w:t xml:space="preserve"> </w:t>
+      </w:r>
+      <w:r>
+        <w:rPr>
+          <w:rFonts w:ascii="Arial" w:hAnsi="Arial"/>
+          <w:sz w:val="22"/>
+        </w:rPr>
+        <w:t xml:space="preserve">dupla desvantagem</w:t>
+      </w:r>
+      <w:r>
+        <w:rPr>
+          <w:rFonts w:ascii="Arial" w:hAnsi="Arial"/>
+          <w:sz w:val="22"/>
+        </w:rPr>
+        <w:t xml:space="preserve">: ser negro custa, e morar onde moram os negros</w:t>
+      </w:r>
+      <w:r>
+        <w:rPr>
+          <w:rFonts w:ascii="Arial" w:hAnsi="Arial"/>
+          <w:sz w:val="22"/>
+        </w:rPr>
+        <w:t xml:space="preserve"> </w:t>
+      </w:r>
+      <w:r>
+        <w:rPr>
+          <w:rFonts w:ascii="Arial" w:hAnsi="Arial"/>
+          <w:sz w:val="22"/>
+        </w:rPr>
+        <w:t xml:space="preserve">custa outra vez, inclusive para quem não é negro. Já o coeficiente individual mal se move</w:t>
+      </w:r>
+      <w:r>
+        <w:rPr>
+          <w:rFonts w:ascii="Arial" w:hAnsi="Arial"/>
+          <w:sz w:val="22"/>
+        </w:rPr>
+        <w:t xml:space="preserve"> </w:t>
+      </w:r>
+      <w:r>
+        <w:rPr>
+          <w:rFonts w:ascii="Arial" w:hAnsi="Arial"/>
+          <w:sz w:val="22"/>
+        </w:rPr>
+        <w:t xml:space="preserve">(de</w:t>
+      </w:r>
+      <w:r>
+        <w:rPr>
+          <w:rFonts w:ascii="Arial" w:hAnsi="Arial"/>
+          <w:sz w:val="22"/>
+        </w:rPr>
+        <w:t xml:space="preserve"> </w:t>
+      </w:r>
+      <m:oMath>
+        <m:r>
+          <m:rPr>
+            <m:sty m:val="p"/>
+          </m:rPr>
+          <m:t>−</m:t>
+        </m:r>
+        <m:r>
+          <m:t>0</m:t>
+        </m:r>
+        <m:r>
+          <m:rPr>
+            <m:sty m:val="p"/>
+          </m:rPr>
+          <m:t>,</m:t>
+        </m:r>
+        <m:r>
+          <m:t>0669</m:t>
+        </m:r>
+      </m:oMath>
+      <w:r>
+        <w:rPr>
+          <w:rFonts w:ascii="Arial" w:hAnsi="Arial"/>
+          <w:sz w:val="22"/>
+        </w:rPr>
+        <w:t xml:space="preserve"> </w:t>
+      </w:r>
+      <w:r>
+        <w:rPr>
+          <w:rFonts w:ascii="Arial" w:hAnsi="Arial"/>
+          <w:sz w:val="22"/>
+        </w:rPr>
+        <w:t xml:space="preserve">para</w:t>
+      </w:r>
+      <w:r>
+        <w:rPr>
+          <w:rFonts w:ascii="Arial" w:hAnsi="Arial"/>
+          <w:sz w:val="22"/>
+        </w:rPr>
+        <w:t xml:space="preserve"> </w:t>
+      </w:r>
+      <m:oMath>
+        <m:r>
+          <m:rPr>
+            <m:sty m:val="p"/>
+          </m:rPr>
+          <m:t>−</m:t>
+        </m:r>
+        <m:r>
+          <m:t>0</m:t>
+        </m:r>
+        <m:r>
+          <m:rPr>
+            <m:sty m:val="p"/>
+          </m:rPr>
+          <m:t>,</m:t>
+        </m:r>
+        <m:r>
+          <m:t>0637</m:t>
+        </m:r>
+      </m:oMath>
+      <w:r>
+        <w:rPr>
+          <w:rFonts w:ascii="Arial" w:hAnsi="Arial"/>
+          <w:sz w:val="22"/>
+        </w:rPr>
+        <w:t xml:space="preserve">): acrescentar a composição do bairro quase não altera a</w:t>
+      </w:r>
+      <w:r>
+        <w:rPr>
+          <w:rFonts w:ascii="Arial" w:hAnsi="Arial"/>
+          <w:sz w:val="22"/>
+        </w:rPr>
+        <w:t xml:space="preserve"> </w:t>
+      </w:r>
+      <w:r>
+        <w:rPr>
+          <w:rFonts w:ascii="Arial" w:hAnsi="Arial"/>
+          <w:sz w:val="22"/>
+        </w:rPr>
+        <w:t xml:space="preserve">penalidade racial média — as duas desvantagens se somam, em vez de uma explicar a outra.</w:t>
+      </w:r>
+    </w:p>
+    <w:p>
+      <w:pPr>
+        <w:pStyle w:val="BodyText"/>
+        <w:spacing w:line="360" w:lineRule="auto" w:after="0"/>
+        <w:ind w:firstLine="709"/>
+        <w:jc w:val="both"/>
+      </w:pPr>
+      <w:r>
+        <w:rPr>
+          <w:rFonts w:ascii="Arial" w:hAnsi="Arial"/>
+          <w:sz w:val="22"/>
+        </w:rPr>
+        <w:t>Em uma frase: o bairro cobra duas vezes — da pessoa negra, pela cor; e de todos</w:t>
+      </w:r>
+      <w:r>
+        <w:rPr>
+          <w:rFonts w:ascii="Arial" w:hAnsi="Arial"/>
+          <w:sz w:val="22"/>
+        </w:rPr>
+        <w:t xml:space="preserve"> </w:t>
+      </w:r>
+      <w:r>
+        <w:rPr>
+          <w:rFonts w:ascii="Arial" w:hAnsi="Arial"/>
+          <w:sz w:val="22"/>
+        </w:rPr>
+        <w:t xml:space="preserve">os que moram ali, pela composição racial do lugar.</w:t>
+      </w:r>
+    </w:p>
+    <w:p>
+      <w:pPr>
+        <w:pStyle w:val="BodyText"/>
+        <w:spacing w:line="360" w:lineRule="auto" w:after="0"/>
+        <w:ind w:firstLine="709"/>
+        <w:jc w:val="both"/>
+      </w:pPr>
+      <w:r>
+        <w:rPr>
+          <w:rFonts w:ascii="Arial" w:hAnsi="Arial"/>
+          <w:b/>
+          <w:bCs/>
+          <w:sz w:val="22"/>
+        </w:rPr>
+        <w:t xml:space="preserve">Acrescentar o estado não move a régua.</w:t>
+      </w:r>
+      <w:r>
+        <w:rPr>
+          <w:rFonts w:ascii="Arial" w:hAnsi="Arial"/>
+          <w:sz w:val="22"/>
+        </w:rPr>
+        <w:t xml:space="preserve"> </w:t>
+      </w:r>
+      <w:r>
+        <w:rPr>
+          <w:rFonts w:ascii="Arial" w:hAnsi="Arial"/>
+          <w:sz w:val="22"/>
+        </w:rPr>
+        <w:t xml:space="preserve">Com os efeitos fixos de UF, a penalidade é de</w:t>
+      </w:r>
+      <w:r>
+        <w:rPr>
+          <w:rFonts w:ascii="Arial" w:hAnsi="Arial"/>
+          <w:sz w:val="22"/>
+        </w:rPr>
+        <w:t xml:space="preserve"> </w:t>
+      </w:r>
+      <w:r>
+        <w:rPr>
+          <w:rFonts w:ascii="Arial" w:hAnsi="Arial"/>
+          <w:b/>
+          <w:bCs/>
+          <w:sz w:val="22"/>
+        </w:rPr>
+        <w:t xml:space="preserve">6,1%</w:t>
+      </w:r>
+      <w:r>
+        <w:rPr>
+          <w:rFonts w:ascii="Arial" w:hAnsi="Arial"/>
+          <w:sz w:val="22"/>
+        </w:rPr>
+        <w:t xml:space="preserve"> </w:t>
+      </w:r>
+      <w:r>
+        <w:rPr>
+          <w:rFonts w:ascii="Arial" w:hAnsi="Arial"/>
+          <w:sz w:val="22"/>
+        </w:rPr>
+        <w:t xml:space="preserve">(</w:t>
+      </w:r>
+      <m:oMath>
+        <m:sSubSup>
+          <m:e>
+            <m:acc>
+              <m:accPr>
+                <m:chr m:val="̂"/>
+              </m:accPr>
+              <m:e>
+                <m:r>
+                  <m:t>β</m:t>
+                </m:r>
+              </m:e>
+            </m:acc>
+          </m:e>
+          <m:sub>
+            <m:r>
+              <m:rPr>
+                <m:nor/>
+                <m:sty m:val="p"/>
+              </m:rPr>
+              <m:t>negro</m:t>
+            </m:r>
+          </m:sub>
+          <m:sup>
+            <m:r>
+              <m:t>M</m:t>
+            </m:r>
+            <m:r>
+              <m:t>3</m:t>
+            </m:r>
+          </m:sup>
+        </m:sSubSup>
+        <m:r>
+          <m:rPr>
+            <m:sty m:val="p"/>
+          </m:rPr>
+          <m:t>=</m:t>
+        </m:r>
+        <m:r>
+          <m:rPr>
+            <m:sty m:val="p"/>
+          </m:rPr>
+          <m:t>−</m:t>
+        </m:r>
+        <m:r>
+          <m:t>0</m:t>
+        </m:r>
+        <m:r>
+          <m:rPr>
+            <m:sty m:val="p"/>
+          </m:rPr>
+          <m:t>,</m:t>
+        </m:r>
+        <m:r>
+          <m:t>0629</m:t>
+        </m:r>
+      </m:oMath>
+      <w:r>
+        <w:rPr>
+          <w:rFonts w:ascii="Arial" w:hAnsi="Arial"/>
+          <w:sz w:val="22"/>
+        </w:rPr>
+        <w:t xml:space="preserve">). Na régua do gap</w:t>
+      </w:r>
+      <w:r>
+        <w:rPr>
+          <w:rFonts w:ascii="Arial" w:hAnsi="Arial"/>
+          <w:sz w:val="22"/>
+        </w:rPr>
+        <w:t xml:space="preserve"> </w:t>
+      </w:r>
+      <w:r>
+        <w:rPr>
+          <w:rFonts w:ascii="Arial" w:hAnsi="Arial"/>
+          <w:sz w:val="22"/>
+        </w:rPr>
+        <w:t xml:space="preserve">agregado, 43,0% — praticamente os mesmos 39,5% do M1. O</w:t>
+      </w:r>
+      <w:r>
+        <w:rPr>
+          <w:rFonts w:ascii="Arial" w:hAnsi="Arial"/>
+          <w:sz w:val="22"/>
+        </w:rPr>
+        <w:t xml:space="preserve"> </w:t>
+      </w:r>
+      <w:r>
+        <w:rPr>
+          <w:rFonts w:ascii="Arial" w:hAnsi="Arial"/>
+          <w:sz w:val="22"/>
+        </w:rPr>
+        <w:t xml:space="preserve">dado relevante aqui é o que</w:t>
+      </w:r>
+      <w:r>
+        <w:rPr>
+          <w:rFonts w:ascii="Arial" w:hAnsi="Arial"/>
+          <w:sz w:val="22"/>
+        </w:rPr>
+        <w:t xml:space="preserve"> </w:t>
+      </w:r>
+      <w:r>
+        <w:rPr>
+          <w:rFonts w:ascii="Arial" w:hAnsi="Arial"/>
+          <w:sz w:val="22"/>
+        </w:rPr>
+        <w:t xml:space="preserve">não</w:t>
+      </w:r>
+      <w:r>
+        <w:rPr>
+          <w:rFonts w:ascii="Arial" w:hAnsi="Arial"/>
+          <w:sz w:val="22"/>
+        </w:rPr>
+        <w:t xml:space="preserve"> </w:t>
+      </w:r>
+      <w:r>
+        <w:rPr>
+          <w:rFonts w:ascii="Arial" w:hAnsi="Arial"/>
+          <w:sz w:val="22"/>
+        </w:rPr>
+        <w:t xml:space="preserve">aconteceu: depois que a comparação já é entre</w:t>
+      </w:r>
+      <w:r>
+        <w:rPr>
+          <w:rFonts w:ascii="Arial" w:hAnsi="Arial"/>
+          <w:sz w:val="22"/>
+        </w:rPr>
+        <w:t xml:space="preserve"> </w:t>
+      </w:r>
+      <w:r>
+        <w:rPr>
+          <w:rFonts w:ascii="Arial" w:hAnsi="Arial"/>
+          <w:sz w:val="22"/>
+        </w:rPr>
+        <w:t xml:space="preserve">vizinhos, o contexto do bairro (M2) e a unidade da federação (M3) retiram pouco</w:t>
+      </w:r>
+      <w:r>
+        <w:rPr>
+          <w:rFonts w:ascii="Arial" w:hAnsi="Arial"/>
+          <w:sz w:val="22"/>
+        </w:rPr>
+        <w:t xml:space="preserve"> </w:t>
+      </w:r>
+      <w:r>
+        <w:rPr>
+          <w:rFonts w:ascii="Arial" w:hAnsi="Arial"/>
+          <w:sz w:val="22"/>
+        </w:rPr>
+        <w:t xml:space="preserve">mais do diferencial. É esse patamar que este trabalho chama de</w:t>
+      </w:r>
+      <w:r>
+        <w:rPr>
+          <w:rFonts w:ascii="Arial" w:hAnsi="Arial"/>
+          <w:sz w:val="22"/>
+        </w:rPr>
+        <w:t xml:space="preserve"> </w:t>
+      </w:r>
+      <w:r>
+        <w:rPr>
+          <w:rFonts w:ascii="Arial" w:hAnsi="Arial"/>
+          <w:b/>
+          <w:bCs/>
+          <w:sz w:val="22"/>
+        </w:rPr>
+        <w:t xml:space="preserve">gap líquido</w:t>
+      </w:r>
+      <w:r>
+        <w:rPr>
+          <w:rFonts w:ascii="Arial" w:hAnsi="Arial"/>
+          <w:sz w:val="22"/>
+        </w:rPr>
+        <w:t xml:space="preserve">: o</w:t>
+      </w:r>
+      <w:r>
+        <w:rPr>
+          <w:rFonts w:ascii="Arial" w:hAnsi="Arial"/>
+          <w:sz w:val="22"/>
+        </w:rPr>
+        <w:t xml:space="preserve"> </w:t>
+      </w:r>
+      <w:r>
+        <w:rPr>
+          <w:rFonts w:ascii="Arial" w:hAnsi="Arial"/>
+          <w:sz w:val="22"/>
+        </w:rPr>
+        <w:t xml:space="preserve">que capital humano, contexto de bairro e estado não explicam — um limite superior da</w:t>
+      </w:r>
+      <w:r>
+        <w:rPr>
+          <w:rFonts w:ascii="Arial" w:hAnsi="Arial"/>
+          <w:sz w:val="22"/>
+        </w:rPr>
+        <w:t xml:space="preserve"> </w:t>
+      </w:r>
+      <w:r>
+        <w:rPr>
+          <w:rFonts w:ascii="Arial" w:hAnsi="Arial"/>
+          <w:sz w:val="22"/>
+        </w:rPr>
+        <w:t xml:space="preserve">penalidade direta sob seleção em observáveis (o M4 é o inferior), e não uma medida de</w:t>
+      </w:r>
+      <w:r>
+        <w:rPr>
+          <w:rFonts w:ascii="Arial" w:hAnsi="Arial"/>
+          <w:sz w:val="22"/>
+        </w:rPr>
+        <w:t xml:space="preserve"> </w:t>
+      </w:r>
+      <w:r>
+        <w:rPr>
+          <w:rFonts w:ascii="Arial" w:hAnsi="Arial"/>
+          <w:sz w:val="22"/>
+        </w:rPr>
+        <w:t xml:space="preserve">discriminação.</w:t>
+      </w:r>
+      <w:r>
+        <w:rPr>
+          <w:rStyle w:val="FootnoteReference"/>
+          <w:rFonts w:ascii="Arial" w:hAnsi="Arial"/>
+          <w:sz w:val="22"/>
+          <w:vertAlign w:val="superscript"/>
+        </w:rPr>
+        <w:footnoteReference w:id="40"/>
       </w:r>
     </w:p>
     <w:p>
@@ -22503,7 +22490,7 @@
           <w:rFonts w:ascii="Arial" w:hAnsi="Arial"/>
           <w:sz w:val="22"/>
         </w:rPr>
-        <w:t xml:space="preserve">idênticos; o que difere é o tratamento das variáveis que são elas próprias desfecho</w:t>
+        <w:t>idênticos; o que difere é o tratamento das variáveis que são elas próprias desfecho</w:t>
       </w:r>
       <w:r>
         <w:rPr>
@@ -22546,7 +22533,7 @@
           <w:rFonts w:ascii="Arial" w:hAnsi="Arial"/>
           <w:sz w:val="22"/>
         </w:rPr>
-        <w:t xml:space="preserve">verdadeiro está. O número deste trabalho é o gap líquido de 6,1% do M3; o</w:t>
+        <w:t>verdadeiro está. O número deste trabalho é o gap líquido de 6,1% do M3; o</w:t>
       </w:r>
       <w:r>
         <w:rPr>
@@ -22898,7 +22885,7 @@
           <w:rFonts w:ascii="Arial" w:hAnsi="Arial"/>
           <w:sz w:val="22"/>
         </w:rPr>
-        <w:t xml:space="preserve">efeitos fixos de UF do M3 com IC 95% (referência: primeira UF); no painel B, a</w:t>
+        <w:t>efeitos fixos de UF do M3 com IC 95% (referência: primeira UF); no painel B, a</w:t>
       </w:r>
       <w:r>
         <w:rPr>
@@ -22968,7 +22955,7 @@
           <w:rFonts w:ascii="Arial" w:hAnsi="Arial"/>
           <w:sz w:val="22"/>
         </w:rPr>
-        <w:t xml:space="preserve">Nota: Como ler a Figura 1: cada ponto no painel A é um estado;</w:t>
+        <w:t>Nota: Como ler a Figura 1: cada ponto no painel A é um estado;</w:t>
       </w:r>
       <w:r>
         <w:rPr>
@@ -23124,7 +23111,7 @@
           <w:rFonts w:ascii="Arial" w:hAnsi="Arial"/>
           <w:sz w:val="22"/>
         </w:rPr>
-        <w:t xml:space="preserve">de cada bairro (amostra de 250 UPAs com brancos e negros) e, em azul, a média; no painel B,</w:t>
+        <w:t>de cada bairro (amostra de 250 UPAs com brancos e negros) e, em azul, a média; no painel B,</w:t>
       </w:r>
       <w:r>
         <w:rPr>
@@ -23507,7 +23494,7 @@
           <w:rFonts w:ascii="Arial" w:hAnsi="Arial"/>
           <w:sz w:val="22"/>
         </w:rPr>
-        <w:t xml:space="preserve">1% com pós-graduação; a diferença entre o bruto e o condicional, em cada nível, é o que idade, sexo, jornada, bairro e estado explicam ali. A composição também difere: os negros são 67% de quem está sem fundamental completo e 37% de quem está com pós-graduação. Como no restante do trabalho, são diferenças condicionais entre pessoas comparáveis, não o efeito de estudar mais.</w:t>
+        <w:t>1% com pós-graduação; a diferença entre o bruto e o condicional, em cada nível, é o que idade, sexo, jornada, bairro e estado explicam ali. A composição também difere: os negros são 67% de quem está sem fundamental completo e 37% de quem está com pós-graduação. Como no restante do trabalho, são diferenças condicionais entre pessoas comparáveis, não o efeito de estudar mais.</w:t>
       </w:r>
     </w:p>
     <w:p>
@@ -23995,7 +23982,7 @@
           <w:rFonts w:ascii="Arial" w:hAnsi="Arial"/>
           <w:sz w:val="22"/>
         </w:rPr>
-        <w:t xml:space="preserve">o gap racial encolhe de 10,5% (agregado) para 5,6% (M4); o que resta</w:t>
+        <w:t>o gap racial encolhe de 10,5% (agregado) para 5,6% (M4); o que resta</w:t>
       </w:r>
       <w:r>
         <w:rPr>
@@ -24734,7 +24721,7 @@
           <w:rFonts w:ascii="Arial" w:hAnsi="Arial"/>
           <w:sz w:val="22"/>
         </w:rPr>
-        <w:t xml:space="preserve">(HLM de dois níveis, indivíduos em UPA, com efeitos fixos de UF; PNAD Contínua</w:t>
+        <w:t>(HLM de dois níveis, indivíduos em UPA, com efeitos fixos de UF; PNAD Contínua</w:t>
       </w:r>
       <w:r>
         <w:rPr>
@@ -24776,7 +24763,7 @@
           <w:rFonts w:ascii="Arial" w:hAnsi="Arial"/>
           <w:sz w:val="22"/>
         </w:rPr>
-        <w:t xml:space="preserve">acrescenta um bloco de controles ao anterior; à medida que se adiciona contexto e ocupação,</w:t>
+        <w:t>acrescenta um bloco de controles ao anterior; à medida que se adiciona contexto e ocupação,</w:t>
       </w:r>
       <w:r>
         <w:rPr>
@@ -24843,7 +24830,7 @@
           <w:rFonts w:ascii="Arial" w:hAnsi="Arial"/>
           <w:sz w:val="22"/>
         </w:rPr>
-        <w:t xml:space="preserve">é a penalidade racial em log-rendimento (mais próximo de zero = menor gap);</w:t>
+        <w:t>é a penalidade racial em log-rendimento (mais próximo de zero = menor gap);</w:t>
       </w:r>
       <w:r>
         <w:rPr>
@@ -24885,7 +24872,7 @@
           <w:rFonts w:ascii="Arial" w:hAnsi="Arial"/>
           <w:sz w:val="22"/>
         </w:rPr>
-        <w:t xml:space="preserve">penalidade em % de renda;</w:t>
+        <w:t>penalidade em % de renda;</w:t>
       </w:r>
       <w:r>
         <w:rPr>
@@ -25213,7 +25200,7 @@
           <w:rFonts w:ascii="Arial" w:hAnsi="Arial"/>
           <w:sz w:val="22"/>
         </w:rPr>
-        <w:t xml:space="preserve">de cada modelo; traço: IC 95% (estreito pelo</w:t>
+        <w:t>de cada modelo; traço: IC 95% (estreito pelo</w:t>
       </w:r>
       <w:r>
         <w:rPr>
@@ -25239,7 +25226,7 @@
           <w:rFonts w:ascii="Arial" w:hAnsi="Arial"/>
           <w:sz w:val="22"/>
         </w:rPr>
-        <w:t xml:space="preserve">de milhões);</w:t>
+        <w:t>de milhões);</w:t>
       </w:r>
       <w:r>
         <w:rPr>
@@ -25285,7 +25272,7 @@
           <w:rFonts w:ascii="Arial" w:hAnsi="Arial"/>
           <w:sz w:val="22"/>
         </w:rPr>
-        <w:t xml:space="preserve">Nota: Como ler a Figura 3: cada barra é um modelo da sequência e, de cima para baixo, acrescenta-se um bloco de controles ao anterior. O comprimento da barra é a penalidade racial em log-rendimento e o rótulo dentro dela, a mesma penalidade em % de renda; o traço fino é o intervalo de confiança de 95% com erro-padrão agrupado por UPA. Em azul, o M3 — o gap líquido</w:t>
+        <w:t>Nota: Como ler a Figura 3: cada barra é um modelo da sequência e, de cima para baixo, acrescenta-se um bloco de controles ao anterior. O comprimento da barra é a penalidade racial em log-rendimento e o rótulo dentro dela, a mesma penalidade em % de renda; o traço fino é o intervalo de confiança de 95% com erro-padrão agrupado por UPA. Em azul, o M3 — o gap líquido</w:t>
       </w:r>
     </w:p>
     <w:bookmarkEnd w:id="58"/>
@@ -25342,7 +25329,7 @@
           <w:rFonts w:ascii="Arial" w:hAnsi="Arial"/>
           <w:sz w:val="22"/>
         </w:rPr>
-        <w:t xml:space="preserve">Comparar vizinhos explicou parte do diferencial; resta saber de que é feito o que sobra. De que é feito o gap? Duas explicações rivalizam desde</w:t>
+        <w:t>Comparar vizinhos explicou parte do diferencial; resta saber de que é feito o que sobra. De que é feito o gap? Duas explicações rivalizam desde</w:t>
       </w:r>
       <w:r>
         <w:rPr>
@@ -25609,7 +25596,7 @@
           <w:rFonts w:ascii="Arial" w:hAnsi="Arial"/>
           <w:sz w:val="22"/>
         </w:rPr>
-        <w:t xml:space="preserve">explicado por características observáveis; em (B), tratando também formalidade e grupo</w:t>
+        <w:t>explicado por características observáveis; em (B), tratando também formalidade e grupo</w:t>
       </w:r>
       <w:r>
         <w:rPr>
@@ -26467,7 +26454,7 @@
           <w:rFonts w:ascii="Arial" w:hAnsi="Arial"/>
           <w:sz w:val="22"/>
         </w:rPr>
-        <w:t xml:space="preserve">de UF — os mesmos controles do HLM M3; a parcela não explicada é comparável à da literatura.</w:t>
+        <w:t>de UF — os mesmos controles do HLM M3; a parcela não explicada é comparável à da literatura.</w:t>
       </w:r>
       <w:r>
         <w:rPr>
@@ -26603,7 +26590,7 @@
           <w:rFonts w:ascii="Arial" w:hAnsi="Arial"/>
           <w:sz w:val="22"/>
         </w:rPr>
-        <w:t xml:space="preserve">; 41.459 UPAs).</w:t>
+        <w:t>; 41.459 UPAs).</w:t>
       </w:r>
       <w:r>
         <w:rPr>
@@ -27026,7 +27013,7 @@
           <w:rFonts w:ascii="Arial" w:hAnsi="Arial"/>
           <w:sz w:val="22"/>
         </w:rPr>
-        <w:t xml:space="preserve">de milhões, ambos os testes rejeitam qualquer hipótese nula pontual; o que importa é a</w:t>
+        <w:t>de milhões, ambos os testes rejeitam qualquer hipótese nula pontual; o que importa é a</w:t>
       </w:r>
       <w:r>
         <w:rPr>
@@ -27222,7 +27209,7 @@
           <w:rFonts w:ascii="Arial" w:hAnsi="Arial"/>
           <w:sz w:val="22"/>
         </w:rPr>
-        <w:t xml:space="preserve">opera na porta de entrada das ocupações — medida diretamente pelo modelo de acesso. O painel A traz a especificação A, sem ocupação; o painel B, a especificação B, com ocupação e vínculo</w:t>
+        <w:t>opera na porta de entrada das ocupações — medida diretamente pelo modelo de acesso. O painel A traz a especificação A, sem ocupação; o painel B, a especificação B, com ocupação e vínculo</w:t>
       </w:r>
     </w:p>
     <w:bookmarkEnd w:id="63"/>
@@ -27254,7 +27241,7 @@
           <w:rFonts w:ascii="Arial" w:hAnsi="Arial"/>
           <w:sz w:val="22"/>
         </w:rPr>
-        <w:t xml:space="preserve">Nota: Como ler a Figura 4: cada painel é uma cascata lida da esquerda para a direita. A primeira barra é o gap total em log-rendimento; a segunda desconta a parcela atribuída a diferenças de características (dotações); a terceira, em azul, é o que sobra sem explicação. A única diferença entre os painéis é se a ocupação entra ou não como característica</w:t>
+        <w:t>Nota: Como ler a Figura 4: cada painel é uma cascata lida da esquerda para a direita. A primeira barra é o gap total em log-rendimento; a segunda desconta a parcela atribuída a diferenças de características (dotações); a terceira, em azul, é o que sobra sem explicação. A única diferença entre os painéis é se a ocupação entra ou não como característica</w:t>
       </w:r>
     </w:p>
     <w:bookmarkEnd w:id="64"/>
@@ -27287,7 +27274,7 @@
           <w:rFonts w:ascii="Arial" w:hAnsi="Arial"/>
           <w:sz w:val="22"/>
         </w:rPr>
-        <w:t xml:space="preserve">A decomposição mostrou que parte do diferencial opera na entrada das ocupações; o modelo de acesso mede essa porta diretamente.</w:t>
+        <w:t>A decomposição mostrou que parte do diferencial opera na entrada das ocupações; o modelo de acesso mede essa porta diretamente.</w:t>
       </w:r>
       <w:r>
         <w:rPr>
@@ -27394,7 +27381,7 @@
           <w:rFonts w:ascii="Arial" w:hAnsi="Arial"/>
           <w:sz w:val="22"/>
         </w:rPr>
-        <w:t xml:space="preserve">se produz no salário, o remédio é fiscalização de remuneração; se ela se produz no</w:t>
+        <w:t>se produz no salário, o remédio é fiscalização de remuneração; se ela se produz no</w:t>
       </w:r>
       <w:r>
         <w:rPr>
@@ -27464,7 +27451,7 @@
           <w:rFonts w:ascii="Arial" w:hAnsi="Arial"/>
           <w:sz w:val="22"/>
         </w:rPr>
-        <w:t xml:space="preserve">de UF.</w:t>
+        <w:t>de UF; o ajuste e a classificação de cada degrau estão na Tabela 7.</w:t>
       </w:r>
       <w:r>
         <w:rPr>
@@ -30571,7 +30558,7 @@
           <w:rFonts w:ascii="Arial" w:hAnsi="Arial"/>
           <w:sz w:val="22"/>
         </w:rPr>
-        <w:t xml:space="preserve">); AUC com efeitos aleatórios (ajuste na amostra) e só com efeitos fixos;</w:t>
+        <w:t>); AUC com efeitos aleatórios (ajuste na amostra) e só com efeitos fixos;</w:t>
       </w:r>
       <w:r>
         <w:rPr>
@@ -30628,7 +30615,7 @@
           <w:rFonts w:ascii="Arial" w:hAnsi="Arial"/>
           <w:sz w:val="22"/>
         </w:rPr>
-        <w:t xml:space="preserve">especificidade) com as taxas correspondentes; Hosmer–Lemeshow em 10 decis. Modelos A1–A4 como na Tabela 8. Com</w:t>
+        <w:t>especificidade) com as taxas correspondentes; Hosmer–Lemeshow em 10 decis. Modelos A1–A4 como na Tabela 8. Com</w:t>
       </w:r>
       <w:r>
         <w:rPr>
@@ -31521,7 +31508,7 @@
           <w:rFonts w:ascii="Arial" w:hAnsi="Arial"/>
           <w:sz w:val="22"/>
         </w:rPr>
-        <w:t xml:space="preserve">IC 95%, por desfecho e degrau; em azul, o modelo com contexto de bairro (A2)</w:t>
+        <w:t>IC 95%, por desfecho e degrau; em azul, o modelo com contexto de bairro (A2)</w:t>
       </w:r>
     </w:p>
     <w:bookmarkEnd w:id="73"/>
@@ -31553,7 +31540,7 @@
           <w:rFonts w:ascii="Arial" w:hAnsi="Arial"/>
           <w:sz w:val="22"/>
         </w:rPr>
-        <w:t xml:space="preserve">Nota: Como ler a Figura 5: cada ponto é uma razão de chances e a linha horizontal, seu intervalo de confiança de 95%; a linha tracejada em 1 marca a paridade, de modo que quanto mais à esquerda, maior a desvantagem. Os blocos são os três desfechos e, dentro de cada um, os modelos; em azul, o A2, que compara pessoas do mesmo bairro</w:t>
+        <w:t>Nota: Como ler a Figura 5: cada ponto é uma razão de chances e a linha horizontal, seu intervalo de confiança de 95%; a linha tracejada em 1 marca a paridade, de modo que quanto mais à esquerda, maior a desvantagem. Os blocos são os três desfechos e, dentro de cada um, os modelos; em azul, o A2, que compara pessoas do mesmo bairro</w:t>
       </w:r>
     </w:p>
     <w:p>
@@ -31777,7 +31764,7 @@
           <w:rFonts w:ascii="Arial" w:hAnsi="Arial"/>
           <w:sz w:val="22"/>
         </w:rPr>
-        <w:t xml:space="preserve">Tabela 8) reproduz os OR a partir do A2 (cargo qualificado: 0,796 contra 0,814); no A1, sem o contexto do bairro, dá 0,728 contra 0,805, porque sem o intercepto de UPA o contexto omitido é absorvido pelo coeficiente racial. Com o contexto do bairro no modelo, a conclusão não depende da hipótese de efeitos aleatórios.</w:t>
+        <w:t>Tabela 8) reproduz os OR a partir do A2 (cargo qualificado: 0,796 contra 0,814); no A1, sem o contexto do bairro, dá 0,728 contra 0,805, porque sem o intercepto de UPA o contexto omitido é absorvido pelo coeficiente racial. Com o contexto do bairro no modelo, a conclusão não depende da hipótese de efeitos aleatórios.</w:t>
       </w:r>
     </w:p>
     <w:bookmarkStart w:id="75" w:name="tab:glmm_glassceil"/>
@@ -34466,7 +34453,7 @@
           <w:rFonts w:ascii="Arial" w:hAnsi="Arial"/>
           <w:sz w:val="22"/>
         </w:rPr>
-        <w:t xml:space="preserve">; 41.454 UPAs). A3 acrescenta o vínculo (formalidade, setor público, conta própria, doméstico), que é desfecho da própria discriminação: limite inferior. Todos os OR com</w:t>
+        <w:t>; 41.454 UPAs). A3 acrescenta o vínculo (formalidade, setor público, conta própria, doméstico), que é desfecho da própria discriminação: limite inferior. Todos os OR com</w:t>
       </w:r>
       <w:r>
         <w:rPr>
@@ -34503,7 +34490,7 @@
           <w:rFonts w:ascii="Arial" w:hAnsi="Arial"/>
           <w:sz w:val="22"/>
         </w:rPr>
-        <w:t xml:space="preserve">; com</w:t>
+        <w:t>; com</w:t>
       </w:r>
       <w:r>
         <w:rPr>
@@ -34596,7 +34583,7 @@
           <w:rFonts w:ascii="Arial" w:hAnsi="Arial"/>
           <w:sz w:val="22"/>
         </w:rPr>
-        <w:t xml:space="preserve">; quanto mais perto de zero, maior a barreira. O E-value é a força mínima de associação (razão de risco) que um confundidor não observado precisaria ter com a raça</w:t>
+        <w:t>; quanto mais perto de zero, maior a barreira. O E-value é a força mínima de associação (razão de risco) que um confundidor não observado precisaria ter com a raça</w:t>
       </w:r>
       <w:r>
         <w:rPr>
@@ -34624,7 +34611,7 @@
           <w:rFonts w:ascii="Arial" w:hAnsi="Arial"/>
           <w:sz w:val="22"/>
         </w:rPr>
-        <w:t xml:space="preserve">com o desfecho para anular o OR; o E-value (IC) faz o mesmo para o limite do intervalo. A coluna logit-FE mostra que a conclusão não depende da hipótese de efeitos aleatórios</w:t>
+        <w:t>com o desfecho para anular o OR; o E-value (IC) faz o mesmo para o limite do intervalo. A coluna logit-FE mostra que a conclusão não depende da hipótese de efeitos aleatórios</w:t>
       </w:r>
     </w:p>
     <w:bookmarkEnd w:id="76"/>
@@ -34795,7 +34782,7 @@
           <w:rFonts w:ascii="Arial" w:hAnsi="Arial"/>
           <w:sz w:val="22"/>
         </w:rPr>
-        <w:t xml:space="preserve">A regressão quantílica estima o gap em cada ponto da distribuição de renda; a</w:t>
+        <w:t>A regressão quantílica estima o gap em cada ponto da distribuição de renda; a</w:t>
       </w:r>
       <w:r>
         <w:rPr>
@@ -34865,7 +34852,7 @@
           <w:rFonts w:ascii="Arial" w:hAnsi="Arial"/>
           <w:sz w:val="22"/>
         </w:rPr>
-        <w:t xml:space="preserve">pessoas de mesmo perfil); a</w:t>
+        <w:t>pessoas de mesmo perfil); a</w:t>
       </w:r>
       <w:r>
         <w:rPr>
@@ -35368,7 +35355,7 @@
           <w:rFonts w:ascii="Arial" w:hAnsi="Arial"/>
           <w:sz w:val="22"/>
         </w:rPr>
-        <w:t xml:space="preserve">; por isso, no q25, o gap que a RIF decompõe fica bem abaixo do</w:t>
+        <w:t>; por isso, no q25, o gap que a RIF decompõe fica bem abaixo do</w:t>
       </w:r>
       <w:r>
         <w:rPr>
@@ -36495,7 +36482,7 @@
           <w:rFonts w:ascii="Arial" w:hAnsi="Arial"/>
           <w:sz w:val="22"/>
         </w:rPr>
-        <w:t xml:space="preserve">idade, sexo, jornada, área urbana, ano e contexto do bairro), mais efeitos fixos de UF; a ocupação</w:t>
+        <w:t>idade, sexo, jornada, área urbana, ano e contexto do bairro), mais efeitos fixos de UF; a ocupação</w:t>
       </w:r>
       <w:r>
         <w:rPr>
@@ -36617,7 +36604,7 @@
           <w:rFonts w:ascii="Arial" w:hAnsi="Arial"/>
           <w:sz w:val="22"/>
         </w:rPr>
-        <w:t xml:space="preserve">método e difere do gap observado da segunda coluna; as porcentagens</w:t>
+        <w:t>método e difere do gap observado da segunda coluna; as porcentagens</w:t>
       </w:r>
       <w:r>
         <w:rPr>
@@ -36711,7 +36698,7 @@
           <w:rFonts w:ascii="Arial" w:hAnsi="Arial"/>
           <w:sz w:val="22"/>
         </w:rPr>
-        <w:t xml:space="preserve">As colunas por sexo da Tabela 10 mostram que o padrão não é o mesmo para todos: entre homens, a penalidade cresce de 3,9% (q10) para 9,0% (q90); entre mulheres, a penalidade é maior nas duas pontas — 4,9% no q10, 4,3% na mediana e 7,3% no q90 —, de modo que ao teto de vidro se soma um piso pegajoso</w:t>
+        <w:t>As colunas por sexo da Tabela 10 mostram que o padrão não é o mesmo para todos: entre homens, a penalidade cresce de 3,9% (q10) para 9,0% (q90); entre mulheres, a penalidade é maior nas duas pontas — 4,9% no q10, 4,3% na mediana e 7,3% no q90 —, de modo que ao teto de vidro se soma um piso pegajoso</w:t>
       </w:r>
       <w:r>
         <w:rPr>
@@ -39223,7 +39210,7 @@
           <w:rFonts w:ascii="Arial" w:hAnsi="Arial"/>
           <w:sz w:val="22"/>
         </w:rPr>
-        <w:t xml:space="preserve">é maior ali; e como há mais dispersão condicional no topo, o coeficiente condicional</w:t>
+        <w:t>é maior ali; e como há mais dispersão condicional no topo, o coeficiente condicional</w:t>
       </w:r>
       <w:r>
         <w:rPr>
@@ -39468,7 +39455,7 @@
           <w:rFonts w:ascii="Arial" w:hAnsi="Arial"/>
           <w:sz w:val="22"/>
         </w:rPr>
-        <w:t xml:space="preserve">por bootstrap em blocos de UPA); no painel B, a parcela não explicada dos quantis</w:t>
+        <w:t>por bootstrap em blocos de UPA); no painel B, a parcela não explicada dos quantis</w:t>
       </w:r>
       <w:r>
         <w:rPr>
@@ -39654,7 +39641,7 @@
           <w:rFonts w:ascii="Arial" w:hAnsi="Arial"/>
           <w:sz w:val="22"/>
         </w:rPr>
-        <w:t xml:space="preserve">Até aqui, raça foi tratada como um eixo só; a última etapa pergunta quem está na interseção.</w:t>
+        <w:t>Até aqui, raça foi tratada como um eixo só; a última etapa pergunta quem está na interseção.</w:t>
       </w:r>
       <w:r>
         <w:rPr>
@@ -40599,7 +40586,7 @@
           <w:rFonts w:ascii="Arial" w:hAnsi="Arial"/>
           <w:sz w:val="22"/>
         </w:rPr>
-        <w:t xml:space="preserve">características observáveis; Retornos: parcela não explicada (discriminação). Gap (log):</w:t>
+        <w:t>características observáveis; Retornos: parcela não explicada (discriminação). Gap (log):</w:t>
       </w:r>
       <w:r>
         <w:rPr>
@@ -41077,7 +41064,7 @@
           <w:rFonts w:ascii="Arial" w:hAnsi="Arial"/>
           <w:sz w:val="22"/>
         </w:rPr>
-        <w:t xml:space="preserve">gênero e cada ponto, a razão de chances contra o homem branco, cuja referência é a linha tracejada em 1; abaixo dela, o grupo tem menos chance que ele. No painel A, siga a série azul (mulher negra): ela aparece acima da referência na categoria agregada e termina como o grupo mais distante da referência no topo da renda. No painel B, a mesma comparação por grande grupo da CBO mostra de onde vem a aparente vantagem: das ocupações feminizadas, não do comando</w:t>
+        <w:t>gênero e cada ponto, a razão de chances contra o homem branco, cuja referência é a linha tracejada em 1; abaixo dela, o grupo tem menos chance que ele. No painel A, siga a série azul (mulher negra): ela aparece acima da referência na categoria agregada e termina como o grupo mais distante da referência no topo da renda. No painel B, a mesma comparação por grande grupo da CBO mostra de onde vem a aparente vantagem: das ocupações feminizadas, não do comando</w:t>
       </w:r>
     </w:p>
     <w:p>
@@ -41262,7 +41249,7 @@
           <w:rFonts w:ascii="Arial" w:hAnsi="Arial"/>
           <w:sz w:val="22"/>
         </w:rPr>
-        <w:t xml:space="preserve">interseccionalidade não se confirma na entrada; separada a ocupação, ela se confirma.</w:t>
+        <w:t>interseccionalidade não se confirma na entrada; separada a ocupação, ela se confirma.</w:t>
       </w:r>
     </w:p>
     <w:p>
@@ -41784,7 +41771,7 @@
           <w:rFonts w:ascii="Arial" w:hAnsi="Arial"/>
           <w:sz w:val="22"/>
         </w:rPr>
-        <w:t xml:space="preserve">no décimo mais rico (Tabela 12); as diferenças entre os dois grupos ficam fora dos intervalos de 95%. A distância entre os dois grupos cresce rumo ao topo: na regressão quantílica, a penalidade de pretos e pardos, respectivamente, vai de 4,7% e 4,2% no primeiro decil a 10,0% e 8,0% no nono. A parcela de preço da decomposição RIF também se distribui de outro modo: nos pardos, cai de 26,9% no primeiro decil para 19,8% na mediana e 7,4% no nono, como no agregado; nos pretos, passa de 21,2% para 24,8% e 11,9%, sem ceder no topo. O padrão é compatível com o colorismo — a discriminação graduada pela tonalidade da pele</w:t>
+        <w:t>no décimo mais rico (Tabela 12); as diferenças entre os dois grupos ficam fora dos intervalos de 95%. A distância entre os dois grupos cresce rumo ao topo: na regressão quantílica, a penalidade de pretos e pardos, respectivamente, vai de 4,7% e 4,2% no primeiro decil a 10,0% e 8,0% no nono. A parcela de preço da decomposição RIF também se distribui de outro modo: nos pardos, cai de 26,9% no primeiro decil para 19,8% na mediana e 7,4% no nono, como no agregado; nos pretos, passa de 21,2% para 24,8% e 11,9%, sem ceder no topo. O padrão é compatível com o colorismo — a discriminação graduada pela tonalidade da pele</w:t>
       </w:r>
       <w:r>
         <w:rPr>
@@ -43363,7 +43350,7 @@
           <w:rFonts w:ascii="Arial" w:hAnsi="Arial"/>
           <w:sz w:val="22"/>
         </w:rPr>
-        <w:t xml:space="preserve">jornada e estado), em % de renda; por idade, M3 com a interação negro</w:t>
+        <w:t>jornada e estado), em % de renda; por idade, M3 com a interação negro</w:t>
       </w:r>
       <w:r>
         <w:rPr>
@@ -43448,7 +43435,7 @@
           <w:rFonts w:ascii="Arial" w:hAnsi="Arial"/>
           <w:sz w:val="22"/>
         </w:rPr>
-        <w:t xml:space="preserve">(VD4009); privado: os demais ocupados. Cada recorte foi estimado em todos os seus</w:t>
+        <w:t>(VD4009); privado: os demais ocupados. Cada recorte foi estimado em todos os seus</w:t>
       </w:r>
       <w:r>
         <w:rPr>
@@ -43490,7 +43477,7 @@
           <w:rFonts w:ascii="Arial" w:hAnsi="Arial"/>
           <w:sz w:val="22"/>
         </w:rPr>
-        <w:t xml:space="preserve">comparável;</w:t>
+        <w:t>comparável;</w:t>
       </w:r>
       <w:r>
         <w:rPr>
@@ -43622,7 +43609,7 @@
           <w:rFonts w:ascii="Arial" w:hAnsi="Arial"/>
           <w:sz w:val="22"/>
         </w:rPr>
-        <w:t xml:space="preserve">; no público, 4,6% e</w:t>
+        <w:t>; no público, 4,6% e</w:t>
       </w:r>
       <w:r>
         <w:rPr>
@@ -43714,7 +43701,7 @@
           <w:rFonts w:ascii="Arial" w:hAnsi="Arial"/>
           <w:sz w:val="22"/>
         </w:rPr>
-        <w:t xml:space="preserve">A penalidade cresce com a idade: 1,7% entre 14 e 29 anos, 8,8% entre 50 e 64 e 14,7% a partir dos 65. Dados transversais não separam as duas leituras possíveis: a de ciclo de vida (a desigualdade se acumula ao longo da carreira) é compatível com o teto de vidro; a de coorte, com melhora entre gerações. Acima dos 65 anos, o grupo é selecionado — só quem ainda trabalha — e menor, o que pede cautela com essa estimativa.</w:t>
+        <w:t>A penalidade cresce com a idade: 1,7% entre 14 e 29 anos, 8,8% entre 50 e 64 e 14,7% a partir dos 65. Dados transversais não separam as duas leituras possíveis: a de ciclo de vida (a desigualdade se acumula ao longo da carreira) é compatível com o teto de vidro; a de coorte, com melhora entre gerações. Acima dos 65 anos, o grupo é selecionado — só quem ainda trabalha — e menor, o que pede cautela com essa estimativa.</w:t>
       </w:r>
     </w:p>
     <w:bookmarkEnd w:id="95"/>
@@ -44613,7 +44600,7 @@
           <w:rFonts w:ascii="Arial" w:hAnsi="Arial"/>
           <w:sz w:val="22"/>
         </w:rPr>
-        <w:t xml:space="preserve">mais alto = melhor previsão; o</w:t>
+        <w:t>mais alto = melhor previsão; o</w:t>
       </w:r>
       <w:r>
         <w:rPr>
@@ -45055,7 +45042,7 @@
           <w:rFonts w:ascii="Arial" w:hAnsi="Arial"/>
           <w:sz w:val="22"/>
         </w:rPr>
-        <w:t xml:space="preserve">(Alencar, 2026a, b, c; Géron, 2021)</w:t>
+        <w:t>(Alencar, 2026a, b, c; Géron, 2021)</w:t>
       </w:r>
       <w:r>
         <w:rPr>
@@ -46212,7 +46199,7 @@
           <w:rFonts w:ascii="Arial" w:hAnsi="Arial"/>
           <w:sz w:val="22"/>
         </w:rPr>
-        <w:t xml:space="preserve">6.159.418 observações de treino e 1.539.855 de teste; nenhuma amostragem</w:t>
+        <w:t>6.159.418 observações de treino e 1.539.855 de teste; nenhuma amostragem</w:t>
       </w:r>
       <w:r>
         <w:rPr>
@@ -47023,7 +47010,7 @@
           <w:rFonts w:ascii="Arial" w:hAnsi="Arial"/>
           <w:sz w:val="22"/>
         </w:rPr>
-        <w:t xml:space="preserve">rendimento; para o leitor, o que importa é o erro em reais. Retransformando com a correção</w:t>
+        <w:t>rendimento; para o leitor, o que importa é o erro em reais. Retransformando com a correção</w:t>
       </w:r>
       <w:r>
         <w:rPr>
@@ -47351,21 +47338,21 @@
           <w:rFonts w:ascii="Arial" w:hAnsi="Arial"/>
           <w:sz w:val="22"/>
         </w:rPr>
-        <w:t xml:space="preserve">convergem: a diferença entre treino e teste é praticamente nula; o número de observações</w:t>
-      </w:r>
-      <w:r>
-        <w:rPr>
-          <w:rFonts w:ascii="Arial" w:hAnsi="Arial"/>
-          <w:sz w:val="22"/>
-        </w:rPr>
-        <w:t xml:space="preserve"> </w:t>
-      </w:r>
-      <w:r>
-        <w:rPr>
-          <w:rFonts w:ascii="Arial" w:hAnsi="Arial"/>
-          <w:sz w:val="22"/>
-        </w:rPr>
-        <w:t xml:space="preserve">supera em muitas ordens de grandeza a complexidade dos modelos, todos regularizados; e o</w:t>
+        <w:t>convergem: a diferença entre treino e teste é praticamente nula; o número de observações</w:t>
+      </w:r>
+      <w:r>
+        <w:rPr>
+          <w:rFonts w:ascii="Arial" w:hAnsi="Arial"/>
+          <w:sz w:val="22"/>
+        </w:rPr>
+        <w:t xml:space="preserve"> </w:t>
+      </w:r>
+      <w:r>
+        <w:rPr>
+          <w:rFonts w:ascii="Arial" w:hAnsi="Arial"/>
+          <w:sz w:val="22"/>
+        </w:rPr>
+        <w:t>supera em muitas ordens de grandeza a complexidade dos modelos, todos regularizados; e o</w:t>
       </w:r>
       <w:r>
         <w:rPr>
@@ -51234,7 +51221,7 @@
           <w:rFonts w:ascii="Arial" w:hAnsi="Arial"/>
           <w:sz w:val="22"/>
         </w:rPr>
-        <w:t xml:space="preserve">); valores maiores = maior peso na previsão da renda</w:t>
+        <w:t>); valores maiores = maior peso na previsão da renda</w:t>
       </w:r>
     </w:p>
     <w:bookmarkStart w:id="106" w:name="fig:shap"/>
@@ -51305,7 +51292,7 @@
           <w:rFonts w:ascii="Arial" w:hAnsi="Arial"/>
           <w:sz w:val="22"/>
         </w:rPr>
-        <w:t xml:space="preserve">Figura 8. Contexto do bairro, diploma superior e jornada dominam a previsão de renda; a raça</w:t>
+        <w:t>Figura 8. Contexto do bairro, diploma superior e jornada dominam a previsão de renda; a raça</w:t>
       </w:r>
       <w:r>
         <w:rPr>
@@ -51414,7 +51401,7 @@
           <w:rFonts w:ascii="Arial" w:hAnsi="Arial"/>
           <w:sz w:val="22"/>
         </w:rPr>
-        <w:t xml:space="preserve">Nota: Como ler a Figura 8: cada ponto é um trabalhador; quanto mais à direita (ou maior a barra), maior o efeito da variável na renda prevista. A cor indica se o valor da variável é alto ou baixo</w:t>
+        <w:t>Nota: Como ler a Figura 8: cada ponto é um trabalhador; quanto mais à direita (ou maior a barra), maior o efeito da variável na renda prevista. A cor indica se o valor da variável é alto ou baixo</w:t>
       </w:r>
     </w:p>
     <w:p>
@@ -51634,7 +51621,7 @@
           <w:rFonts w:ascii="Arial" w:hAnsi="Arial"/>
           <w:sz w:val="22"/>
         </w:rPr>
-        <w:t xml:space="preserve">; a</w:t>
+        <w:t>; a</w:t>
       </w:r>
       <w:r>
         <w:rPr>
@@ -52294,7 +52281,7 @@
           <w:rFonts w:ascii="Arial" w:hAnsi="Arial"/>
           <w:sz w:val="22"/>
         </w:rPr>
-        <w:t xml:space="preserve">variável de maior ganho entre todas as disponíveis; com a profundidade limitada</w:t>
+        <w:t>variável de maior ganho entre todas as disponíveis; com a profundidade limitada</w:t>
       </w:r>
       <w:r>
         <w:rPr>
@@ -52575,7 +52562,7 @@
           <w:rFonts w:ascii="Arial" w:hAnsi="Arial"/>
           <w:sz w:val="22"/>
         </w:rPr>
-        <w:t xml:space="preserve">do próprio grupo; cada barra é a contribuição de uma variável ao afastamento entre</w:t>
+        <w:t>do próprio grupo; cada barra é a contribuição de uma variável ao afastamento entre</w:t>
       </w:r>
       <w:r>
         <w:rPr>
@@ -52843,7 +52830,7 @@
           <w:rFonts w:ascii="Arial" w:hAnsi="Arial"/>
           <w:sz w:val="22"/>
         </w:rPr>
-        <w:t xml:space="preserve">Nenhum preditor do M4 tem VIF acima de 10; o maior é o de</w:t>
+        <w:t>Nenhum preditor do M4 tem VIF acima de 10; o maior é o de</w:t>
       </w:r>
       <w:r>
         <w:rPr>
@@ -53015,7 +53002,7 @@
           <w:rFonts w:ascii="Arial" w:hAnsi="Arial"/>
           <w:sz w:val="22"/>
         </w:rPr>
-        <w:t xml:space="preserve">do M4 dispensa, portanto, ortogonalização ou eliminação de preditores; o que ela</w:t>
+        <w:t>do M4 dispensa, portanto, ortogonalização ou eliminação de preditores; o que ela</w:t>
       </w:r>
       <w:r>
         <w:rPr>
@@ -53508,7 +53495,7 @@
           <w:rFonts w:ascii="Arial" w:hAnsi="Arial"/>
           <w:sz w:val="22"/>
         </w:rPr>
-        <w:t xml:space="preserve">; a decomposição de dotações,</w:t>
+        <w:t>; a decomposição de dotações,</w:t>
       </w:r>
       <w:r>
         <w:rPr>
@@ -53529,7 +53516,7 @@
           <w:rFonts w:ascii="Arial" w:hAnsi="Arial"/>
           <w:sz w:val="22"/>
         </w:rPr>
-        <w:t xml:space="preserve">; e o</w:t>
+        <w:t>; e o</w:t>
       </w:r>
       <w:r>
         <w:rPr>
@@ -53651,7 +53638,7 @@
           <w:rFonts w:ascii="Arial" w:hAnsi="Arial"/>
           <w:sz w:val="22"/>
         </w:rPr>
-        <w:t xml:space="preserve">salarial, só escolaridade) atinge as duas barreiras ao mesmo tempo; a magnitude</w:t>
+        <w:t>salarial, só escolaridade) atinge as duas barreiras ao mesmo tempo; a magnitude</w:t>
       </w:r>
       <w:r>
         <w:rPr>
@@ -53927,7 +53914,7 @@
           <w:rFonts w:ascii="Arial" w:hAnsi="Arial"/>
           <w:sz w:val="22"/>
         </w:rPr>
-        <w:t xml:space="preserve">diferenças de dotações; quando a ocupação é tratada como dotação, o não explicado</w:t>
+        <w:t>diferenças de dotações; quando a ocupação é tratada como dotação, o não explicado</w:t>
       </w:r>
       <w:r>
         <w:rPr>
@@ -54577,7 +54564,7 @@
           <w:rFonts w:ascii="Arial" w:hAnsi="Arial"/>
           <w:sz w:val="22"/>
         </w:rPr>
-        <w:t xml:space="preserve">1% na pós-graduação (Figura 10); a desvantagem de acesso, não: com superior completo, as chances de um trabalhador negro chegar a um cargo qualificado seguem 18% menores que as de um branco de mesmo perfil e bairro, e com pós-graduação, 23% menores (GLMM, degrau A4, Tabela 8). A escolaridade se associa a quase toda a convergência salarial, mas não à de acesso. Duas cautelas: são diferenças condicionais entre pessoas comparáveis, não o efeito de estudar mais — quem chega à pós-graduação é um grupo selecionado —, e as razões de chances do A4 incluem o vínculo, o que faz delas um limite inferior da desvantagem.</w:t>
+        <w:t>1% na pós-graduação (Figura 10); a desvantagem de acesso, não: com superior completo, as chances de um trabalhador negro chegar a um cargo qualificado seguem 18% menores que as de um branco de mesmo perfil e bairro, e com pós-graduação, 23% menores (GLMM, degrau A4, Tabela 8). A escolaridade se associa a quase toda a convergência salarial, mas não à de acesso. Duas cautelas: são diferenças condicionais entre pessoas comparáveis, não o efeito de estudar mais — quem chega à pós-graduação é um grupo selecionado —, e as razões de chances do A4 incluem o vínculo, o que faz delas um limite inferior da desvantagem.</w:t>
       </w:r>
     </w:p>
     <w:bookmarkStart w:id="122" w:name="fig:hlm_negro_educ"/>
@@ -54722,7 +54709,7 @@
           <w:rFonts w:ascii="Arial" w:hAnsi="Arial"/>
           <w:sz w:val="22"/>
         </w:rPr>
-        <w:t xml:space="preserve">é o rendimento do nível em relação ao branco sem fundamental completo; a inclinação é a</w:t>
+        <w:t>é o rendimento do nível em relação ao branco sem fundamental completo; a inclinação é a</w:t>
       </w:r>
       <w:r>
         <w:rPr>
@@ -55032,7 +55019,7 @@
           <w:rFonts w:ascii="Arial" w:hAnsi="Arial"/>
           <w:sz w:val="22"/>
         </w:rPr>
-        <w:t xml:space="preserve">ocupacional é descontada; a decomposição RIF mostra que essa parcela chega a 27%</w:t>
+        <w:t>ocupacional é descontada; a decomposição RIF mostra que essa parcela chega a 27%</w:t>
       </w:r>
       <w:r>
         <w:rPr>
@@ -55536,7 +55523,7 @@
           <w:rFonts w:ascii="Arial" w:hAnsi="Arial"/>
           <w:sz w:val="22"/>
         </w:rPr>
-        <w:t xml:space="preserve">26 ponto percentual a mais que a dos brancos em 2020, dentro da tendência anterior, e passou a crescer mais que a deles a partir de 2022, quando a penalidade seguia menor. Também não reflete a entrevista por telefone, adotada pelo IBGE em 2020 e 2021: a penalidade menor persistiu depois da volta da coleta presencial. Sem grupo de controle, a série não identifica a causa do degrau; ela mostra que a década não teve um ritmo de convergência a extrapolar, e que os resultados agrupados de 2016–2025 são uma média dos dois patamares. Nada disso trivializa os avanços recentes em políticas de cotas e de acesso ao ensino superior. Diz, sim, que reformas no campo educacional, sem intervenção simultânea nos mecanismos de segregação residencial e de acesso às ocupações, são insuficientes — que é precisamente o que a sequência de modelos deste trabalho mostrou.</w:t>
+        <w:t>26 ponto percentual a mais que a dos brancos em 2020, dentro da tendência anterior, e passou a crescer mais que a deles a partir de 2022, quando a penalidade seguia menor. Também não reflete a entrevista por telefone, adotada pelo IBGE em 2020 e 2021: a penalidade menor persistiu depois da volta da coleta presencial. Sem grupo de controle, a série não identifica a causa do degrau; ela mostra que a década não teve um ritmo de convergência a extrapolar, e que os resultados agrupados de 2016–2025 são uma média dos dois patamares. Nada disso trivializa os avanços recentes em políticas de cotas e de acesso ao ensino superior. Diz, sim, que reformas no campo educacional, sem intervenção simultânea nos mecanismos de segregação residencial e de acesso às ocupações, são insuficientes — que é precisamente o que a sequência de modelos deste trabalho mostrou.</w:t>
       </w:r>
     </w:p>
     <w:p>
@@ -55813,7 +55800,7 @@
           <w:rFonts w:ascii="Arial" w:hAnsi="Arial"/>
           <w:sz w:val="22"/>
         </w:rPr>
-        <w:t xml:space="preserve">— e penalidade salarial menor (4,6% contra 7,2%). É no setor privado que a subida mais se fecha, o que é compatível com a ausência de obrigação, mas também com a estrutura salarial regulada do setor público; os dados não separam as duas leituras.</w:t>
+        <w:t>— e penalidade salarial menor (4,6% contra 7,2%). É no setor privado que a subida mais se fecha, o que é compatível com a ausência de obrigação, mas também com a estrutura salarial regulada do setor público; os dados não separam as duas leituras.</w:t>
       </w:r>
     </w:p>
     <w:p>
@@ -55967,7 +55954,7 @@
           <w:rFonts w:ascii="Arial" w:hAnsi="Arial"/>
           <w:sz w:val="22"/>
         </w:rPr>
-        <w:t xml:space="preserve">no apoio administrativo); metas separadas para mulheres e para negros podem ser cumpridas pela mulher branca e pelo homem negro sem alcançá-la. A lei de transparência salarial</w:t>
+        <w:t>no apoio administrativo); metas separadas para mulheres e para negros podem ser cumpridas pela mulher branca e pelo homem negro sem alcançá-la. A lei de transparência salarial</w:t>
       </w:r>
       <w:r>
         <w:rPr>
@@ -56116,35 +56103,35 @@
           <w:rFonts w:ascii="Arial" w:hAnsi="Arial"/>
           <w:sz w:val="22"/>
         </w:rPr>
-        <w:t xml:space="preserve">. Dos resultados decorrem três pontos: o bairro carrega parte do diferencial; a penalidade é maior nos bairros de renda mais alta, o que pede fiscalização também ali, e não só na periferia; e as estimativas por bairro do modelo hierárquico servem para escolher onde começar e para medir se a penalidade mudou. A literatura de efeitos de vizinhança</w:t>
-      </w:r>
-      <w:r>
-        <w:rPr>
-          <w:rFonts w:ascii="Arial" w:hAnsi="Arial"/>
-          <w:sz w:val="22"/>
-        </w:rPr>
-        <w:t xml:space="preserve"> </w:t>
-      </w:r>
-      <w:r>
-        <w:rPr>
-          <w:rFonts w:ascii="Arial" w:hAnsi="Arial"/>
-          <w:sz w:val="22"/>
-        </w:rPr>
-        <w:t xml:space="preserve">(Marques, 2010; Sampson et al., 1997; Wilson, 1987)</w:t>
-      </w:r>
-      <w:r>
-        <w:rPr>
-          <w:rFonts w:ascii="Arial" w:hAnsi="Arial"/>
-          <w:sz w:val="22"/>
-        </w:rPr>
-        <w:t xml:space="preserve"> </w:t>
-      </w:r>
-      <w:r>
-        <w:rPr>
-          <w:rFonts w:ascii="Arial" w:hAnsi="Arial"/>
-          <w:sz w:val="22"/>
-        </w:rPr>
-        <w:t xml:space="preserve">sugere os instrumentos: transporte e intermediação de emprego que liguem os bairros segregados aos polos de emprego qualificado; aprendizagem, estágio e mentoria que levem redes de contato a quem não as tem — como a penalidade cresce com a idade, agir na entrada evita que ela se acumule, se a leitura de ciclo de vida for a correta —; currículo sem endereço nas primeiras etapas de seleção; escola de tempo integral e ensino técnico nos bairros de maior proporção de população negra; e habitação de interesse social em áreas centrais.</w:t>
+        <w:t>. Dos resultados decorrem três pontos: o bairro carrega parte do diferencial; a penalidade é maior nos bairros de renda mais alta, o que pede fiscalização também ali, e não só na periferia; e as estimativas por bairro do modelo hierárquico servem para escolher onde começar e para medir se a penalidade mudou. A literatura de efeitos de vizinhança</w:t>
+      </w:r>
+      <w:r>
+        <w:rPr>
+          <w:rFonts w:ascii="Arial" w:hAnsi="Arial"/>
+          <w:sz w:val="22"/>
+        </w:rPr>
+        <w:t xml:space="preserve"> </w:t>
+      </w:r>
+      <w:r>
+        <w:rPr>
+          <w:rFonts w:ascii="Arial" w:hAnsi="Arial"/>
+          <w:sz w:val="22"/>
+        </w:rPr>
+        <w:t>(Marques, 2010; Wilson, 1987; Sampson et al., 1997)</w:t>
+      </w:r>
+      <w:r>
+        <w:rPr>
+          <w:rFonts w:ascii="Arial" w:hAnsi="Arial"/>
+          <w:sz w:val="22"/>
+        </w:rPr>
+        <w:t xml:space="preserve"> </w:t>
+      </w:r>
+      <w:r>
+        <w:rPr>
+          <w:rFonts w:ascii="Arial" w:hAnsi="Arial"/>
+          <w:sz w:val="22"/>
+        </w:rPr>
+        <w:t>sugere os instrumentos: transporte e intermediação de emprego que liguem os bairros segregados aos polos de emprego qualificado; aprendizagem, estágio e mentoria que levem redes de contato a quem não as tem — como a penalidade cresce com a idade, agir na entrada evita que ela se acumule, se a leitura de ciclo de vida for a correta —; currículo sem endereço nas primeiras etapas de seleção; escola de tempo integral e ensino técnico nos bairros de maior proporção de população negra; e habitação de interesse social em áreas centrais.</w:t>
       </w:r>
       <w:r>
         <w:rPr>
@@ -56525,7 +56512,7 @@
           <w:rFonts w:ascii="Arial" w:hAnsi="Arial"/>
           <w:sz w:val="22"/>
         </w:rPr>
-        <w:t xml:space="preserve">controle exaustivo) é o que confere robustez ao diagnóstico; ainda assim, a</w:t>
+        <w:t>controle exaustivo) é o que confere robustez ao diagnóstico; ainda assim, a</w:t>
       </w:r>
       <w:r>
         <w:rPr>
@@ -56731,7 +56718,7 @@
           <w:rFonts w:ascii="Arial" w:hAnsi="Arial"/>
           <w:sz w:val="22"/>
         </w:rPr>
-        <w:t xml:space="preserve">qualificada —; uma correção de seleção à Heckman, que exigiria uma variável de</w:t>
+        <w:t>qualificada —; uma correção de seleção à Heckman, que exigiria uma variável de</w:t>
       </w:r>
       <w:r>
         <w:rPr>
@@ -57089,7 +57076,7 @@
           <w:rFonts w:ascii="Arial" w:hAnsi="Arial"/>
           <w:sz w:val="22"/>
         </w:rPr>
-        <w:t xml:space="preserve">própria discriminação; a jornada, não: com renda mensal, ela é controle necessário</w:t>
+        <w:t>própria discriminação; a jornada, não: com renda mensal, ela é controle necessário</w:t>
       </w:r>
       <w:r>
         <w:rPr>
@@ -57477,7 +57464,7 @@
           <w:rFonts w:ascii="Arial" w:hAnsi="Arial"/>
           <w:sz w:val="22"/>
         </w:rPr>
-        <w:t xml:space="preserve">Ignorá-la subestimaria os erros-padrão (Moulton);</w:t>
+        <w:t>Ignorá-la subestimaria os erros-padrão (Moulton);</w:t>
       </w:r>
       <w:r>
         <w:rPr>
@@ -57667,7 +57654,7 @@
           <w:rFonts w:ascii="Arial" w:hAnsi="Arial"/>
           <w:sz w:val="22"/>
         </w:rPr>
-        <w:t xml:space="preserve">; a leitura privilegia magnitude, intervalos de confiança e E-values,</w:t>
+        <w:t>; a leitura privilegia magnitude, intervalos de confiança e E-values,</w:t>
       </w:r>
       <w:r>
         <w:rPr>
@@ -57726,7 +57713,7 @@
           <w:rFonts w:ascii="Arial" w:hAnsi="Arial"/>
           <w:sz w:val="22"/>
         </w:rPr>
-        <w:t xml:space="preserve">individuais; o painel rotativo completo com microdado identificado e a extensão</w:t>
+        <w:t>individuais; o painel rotativo completo com microdado identificado e a extensão</w:t>
       </w:r>
       <w:r>
         <w:rPr>
@@ -58193,7 +58180,7 @@
           <w:rFonts w:ascii="Arial" w:hAnsi="Arial"/>
           <w:sz w:val="22"/>
         </w:rPr>
-        <w:t xml:space="preserve">Esses resultados indicam limites da política de diversidade vigente. As cotas atuam no ingresso, mas a desvantagem cresce onde se decide a ascensão. No setor público, a porta do cargo qualificado foi tão desigual quanto no privado; o teto pesou menos. A educação reduz a penalidade salarial, mas não abre a porta. O território não entra nos critérios, embora carregue parte do diferencial. Metas separadas por raça e por gênero não alcançam a mulher negra no comando. As prioridades sugeridas são metas de representação em cargos de direção com recorte interseccional, igualdade salarial por raça como obrigação fiscalizada, ação territorial nos bairros de maior proporção de população negra e monitoramento anual destes indicadores. Os resultados são associações condicionais, não efeitos causais, e as propostas são agenda, não efeito estimado.</w:t>
+        <w:t>Esses resultados indicam limites da política de diversidade vigente. As cotas atuam no ingresso, mas a desvantagem cresce onde se decide a ascensão. No setor público, a porta do cargo qualificado foi tão desigual quanto no privado; o teto pesou menos. A educação reduz a penalidade salarial, mas não abre a porta. O território não entra nos critérios, embora carregue parte do diferencial. Metas separadas por raça e por gênero não alcançam a mulher negra no comando. As prioridades sugeridas são metas de representação em cargos de direção com recorte interseccional, igualdade salarial por raça como obrigação fiscalizada, ação territorial nos bairros de maior proporção de população negra e monitoramento anual destes indicadores. Os resultados são associações condicionais, não efeitos causais, e as propostas são agenda, não efeito estimado.</w:t>
       </w:r>
     </w:p>
     <w:bookmarkEnd w:id="128"/>
@@ -58450,7 +58437,7 @@
           <w:rFonts w:ascii="Arial" w:hAnsi="Arial"/>
           <w:sz w:val="22"/>
         </w:rPr>
-        <w:t xml:space="preserve">Angrist, J.D.; Pischke, J.-S. 2009. Mostly Harmless Econometrics: An Empiricist’s Companion. Princeton University Press, Princeton, NJ, EUA.</w:t>
+        <w:t>Angrist, J.D.; Pischke, J.-S. 2009. Mostly Harmless Econometrics: An empiricist’s companion. Princeton University Press, Princeton, NJ, EUA.</w:t>
       </w:r>
     </w:p>
     <w:bookmarkEnd w:id="133"/>
@@ -58705,7 +58692,7 @@
           <w:rFonts w:ascii="Arial" w:hAnsi="Arial"/>
           <w:sz w:val="22"/>
         </w:rPr>
-        <w:t xml:space="preserve">Chen, T.; Guestrin, C. 2016.</w:t>
+        <w:t>Chen, T.; Guestrin, C. 2016.</w:t>
       </w:r>
       <w:r>
         <w:rPr>
@@ -58777,7 +58764,7 @@
           <w:rFonts w:ascii="Arial" w:hAnsi="Arial"/>
           <w:sz w:val="22"/>
         </w:rPr>
-        <w:t xml:space="preserve">Fávero, L.P.; Belfiore, P. 2024. Manual de Análise de Dados: estatística e machine learning com Excel, SPSS, Stata, R e Python. 2ed. GEN LTC, Rio de Janeiro, RJ, Brasil.</w:t>
+        <w:t>Fávero, L.P.; Belfiore, P. 2024. Manual de Análise de Dados: Estatística e machine learning com Excel, SPSS, Stata, R e Python. 2ed. GEN LTC, Rio de Janeiro, RJ, Brasil.</w:t>
       </w:r>
     </w:p>
     <w:bookmarkEnd w:id="151"/>
@@ -58794,7 +58781,7 @@
           <w:rFonts w:ascii="Arial" w:hAnsi="Arial"/>
           <w:sz w:val="22"/>
         </w:rPr>
-        <w:t xml:space="preserve">Firpo, S.P.; Fortin, N.M.; Lemieux, T. 2018. Decomposing wage distributions using recentered influence function regressions. Econometrics 6(2): 28.</w:t>
+        <w:t>Firpo, S.P.; Fortin, N.M.; Lemieux, T. 2018. Decomposing wage distributions using recentered influence function regressions. Econometrics 6(2): 28.</w:t>
       </w:r>
     </w:p>
     <w:bookmarkEnd w:id="152"/>
@@ -58811,7 +58798,7 @@
           <w:rFonts w:ascii="Arial" w:hAnsi="Arial"/>
           <w:sz w:val="22"/>
         </w:rPr>
-        <w:t xml:space="preserve">Frank, K.A.; Maroulis, S.J.; Duong, M.Q.; Kelcey, B.M. 2013. What would it take to change an inference? Using</w:t>
+        <w:t>Frank, K.A.; Maroulis, S.J.; Duong, M.Q.; Kelcey, B.M. 2013. What would it take to change an inference? Using</w:t>
       </w:r>
       <w:r>
         <w:rPr>
@@ -58849,7 +58836,7 @@
           <w:rFonts w:ascii="Arial" w:hAnsi="Arial"/>
           <w:sz w:val="22"/>
         </w:rPr>
-        <w:t xml:space="preserve">Géron, A. 2021. Mãos à Obra: Aprendizado de Máquina com Scikit-Learn, Keras &amp; TensorFlow: conceitos, ferramentas e técnicas para a construção de sistemas inteligentes. 2ed. Alta Books, Rio de Janeiro, RJ, Brasil.</w:t>
+        <w:t xml:space="preserve">Géron, A. 2021. Mãos à Obra: Aprendizado de máquina com Scikit-Learn, Keras &amp; TensorFlow: conceitos, ferramentas e técnicas para a construção de sistemas inteligentes. 2ed. Alta Books, Rio de Janeiro, RJ, Brasil.</w:t>
       </w:r>
     </w:p>
     <w:bookmarkEnd w:id="154"/>
@@ -58900,7 +58887,7 @@
           <w:rFonts w:ascii="Arial" w:hAnsi="Arial"/>
           <w:sz w:val="22"/>
         </w:rPr>
-        <w:t xml:space="preserve">Henriques, R. 2001. Desigualdade Racial no Brasil: Evolução das Condições de Vida na Década de 90. Texto para Discussão 807. Instituto de Pesquisa Econômica Aplicada, Rio de Janeiro, RJ, Brasil.</w:t>
+        <w:t xml:space="preserve">Henriques, R. 2001. Desigualdade Racial no Brasil: Evolução das condições de vida na década de 90. Texto para Discussão 807. Instituto de Pesquisa Econômica Aplicada, Rio de Janeiro, RJ, Brasil.</w:t>
       </w:r>
     </w:p>
     <w:bookmarkEnd w:id="157"/>
@@ -58917,7 +58904,7 @@
           <w:rFonts w:ascii="Arial" w:hAnsi="Arial"/>
           <w:sz w:val="22"/>
         </w:rPr>
-        <w:t xml:space="preserve">Instituto Brasileiro de Geografia e Estatística [IBGE]. 2019. Pesquisa de Orçamentos Familiares 2017-2018: Análise da Qualidade de Vida (Índice de Perda de Qualidade de Vida). Instituto Brasileiro de Geografia e Estatística, Rio de Janeiro, RJ, Brasil.</w:t>
+        <w:t xml:space="preserve">Instituto Brasileiro de Geografia e Estatística [IBGE]. 2019. Pesquisa de Orçamentos Familiares 2017-2018: Análise da qualidade de vida (índice de perda de qualidade de vida). Instituto Brasileiro de Geografia e Estatística, Rio de Janeiro, RJ, Brasil.</w:t>
       </w:r>
     </w:p>
     <w:bookmarkEnd w:id="158"/>
@@ -58934,7 +58921,7 @@
           <w:rFonts w:ascii="Arial" w:hAnsi="Arial"/>
           <w:sz w:val="22"/>
         </w:rPr>
-        <w:t xml:space="preserve">Instituto Brasileiro de Geografia e Estatística [IBGE]. 2023. Pesquisa Nacional por Amostra de Domicílios Contínua: Notas Metodológicas. Instituto Brasileiro de Geografia e Estatística, Rio de Janeiro, RJ, Brasil.</w:t>
+        <w:t xml:space="preserve">Instituto Brasileiro de Geografia e Estatística [IBGE]. 2023. Pesquisa Nacional por Amostra de Domicílios Contínua: Notas metodológicas. Instituto Brasileiro de Geografia e Estatística, Rio de Janeiro, RJ, Brasil.</w:t>
       </w:r>
     </w:p>
     <w:bookmarkEnd w:id="159"/>
@@ -58951,7 +58938,7 @@
           <w:rFonts w:ascii="Arial" w:hAnsi="Arial"/>
           <w:sz w:val="22"/>
         </w:rPr>
-        <w:t xml:space="preserve">Instituto Brasileiro de Geografia e Estatística [IBGE]. 2025. Pesquisa Nacional por Amostra de Domicílios Contínua: Rendimento de Todas as Fontes 2025. Instituto Brasileiro de Geografia e Estatística, Rio de Janeiro, RJ, Brasil.</w:t>
+        <w:t xml:space="preserve">Instituto Brasileiro de Geografia e Estatística [IBGE]. 2025. Pesquisa Nacional por Amostra de Domicílios Contínua: Rendimento de todas as fontes 2025. Instituto Brasileiro de Geografia e Estatística, Rio de Janeiro, RJ, Brasil.</w:t>
       </w:r>
     </w:p>
     <w:bookmarkEnd w:id="160"/>
@@ -59070,7 +59057,7 @@
           <w:rFonts w:ascii="Arial" w:hAnsi="Arial"/>
           <w:sz w:val="22"/>
         </w:rPr>
-        <w:t xml:space="preserve">Pager, D. 2007. Marked: Race, Crime, and Finding Work in an Era of Mass Incarceration. University of Chicago Press, Chicago, IL, EUA.</w:t>
+        <w:t xml:space="preserve">Pager, D. 2007. Marked: Race, crime, and finding work in an era of mass incarceration. University of Chicago Press, Chicago, IL, EUA.</w:t>
       </w:r>
     </w:p>
     <w:bookmarkEnd w:id="167"/>
@@ -59087,7 +59074,7 @@
           <w:rFonts w:ascii="Arial" w:hAnsi="Arial"/>
           <w:sz w:val="22"/>
         </w:rPr>
-        <w:t xml:space="preserve">Raudenbush, S.W.; Bryk, A.S. 2002. Hierarchical Linear Models: Applications and Data Analysis Methods. 2ed. Sage, Thousand Oaks, CA, EUA.</w:t>
+        <w:t>Raudenbush, S.W.; Bryk, A.S. 2002. Hierarchical Linear Models: Applications and data analysis methods. 2ed. Sage, Thousand Oaks, CA, EUA.</w:t>
       </w:r>
     </w:p>
     <w:bookmarkEnd w:id="168"/>
@@ -59138,7 +59125,7 @@
           <w:rFonts w:ascii="Arial" w:hAnsi="Arial"/>
           <w:sz w:val="22"/>
         </w:rPr>
-        <w:t xml:space="preserve">Telles, E.E. 2004. Race in Another America: The Significance of Skin Color in Brazil. Princeton University Press, Princeton, NJ, EUA.</w:t>
+        <w:t xml:space="preserve">Telles, E.E. 2004. Race in Another America: The significance of skin color in Brazil. Princeton University Press, Princeton, NJ, EUA.</w:t>
       </w:r>
     </w:p>
     <w:bookmarkEnd w:id="171"/>
@@ -59155,7 +59142,7 @@
           <w:rFonts w:ascii="Arial" w:hAnsi="Arial"/>
           <w:sz w:val="22"/>
         </w:rPr>
-        <w:t xml:space="preserve">VanderWeele, T.J.; Ding, P. 2017. Sensitivity analysis in observational research: introducing the</w:t>
+        <w:t>VanderWeele, T.J.; Ding, P. 2017. Sensitivity analysis in observational research: introducing the</w:t>
       </w:r>
       <w:r>
         <w:rPr>
@@ -59193,7 +59180,7 @@
           <w:rFonts w:ascii="Arial" w:hAnsi="Arial"/>
           <w:sz w:val="22"/>
         </w:rPr>
-        <w:t xml:space="preserve">Wilm, M.; Santos, D.; Coelho, L.; Marangoni, S.; Lima, R.C.; Gonçalves, G.; Verissimo, B. 2026. Índice de Progresso Social Brasil 2026: Resumo Executivo. Imazon, Belém, PA, Brasil. Disponível em: &lt;</w:t>
+        <w:t>Wilm, M.; Santos, D.; Coelho, L.; Marangoni, S.; Lima, R.C.; Gonçalves, G.; Verissimo, B. 2026. Índice de Progresso Social Brasil 2026: Resumo executivo. Imazon, Belém, PA, Brasil. Disponível em: &lt;</w:t>
       </w:r>
       <w:hyperlink r:id="rId173">
         <w:r>
@@ -59225,7 +59212,7 @@
           <w:rFonts w:ascii="Arial" w:hAnsi="Arial"/>
           <w:sz w:val="22"/>
         </w:rPr>
-        <w:t xml:space="preserve">Wilson, W.J. 1987. The Truly Disadvantaged: The Inner City, the Underclass, and Public Policy. University of Chicago Press, Chicago, IL, EUA.</w:t>
+        <w:t xml:space="preserve">Wilson, W.J. 1987. The Truly Disadvantaged: The inner city, the underclass, and public policy. University of Chicago Press, Chicago, IL, EUA.</w:t>
       </w:r>
     </w:p>
     <w:bookmarkEnd w:id="175"/>
@@ -59353,7 +59340,7 @@
       </w:r>
     </w:p>
   </w:footnote>
-  <w:footnote w:id="35">
+  <w:footnote w:id="36">
     <w:p>
       <w:pPr>
         <w:pStyle w:val="FootnoteText"/>
@@ -59630,7 +59617,7 @@
       </w:r>
     </w:p>
   </w:footnote>
-  <w:footnote w:id="36">
+  <w:footnote w:id="37">
     <w:p>
       <w:pPr>
         <w:pStyle w:val="FootnoteText"/>
@@ -59891,7 +59878,7 @@
       </w:r>
     </w:p>
   </w:footnote>
-  <w:footnote w:id="37">
+  <w:footnote w:id="38">
     <w:p>
       <w:pPr>
         <w:pStyle w:val="FootnoteText"/>
@@ -59979,7 +59966,7 @@
       </w:r>
     </w:p>
   </w:footnote>
-  <w:footnote w:id="38">
+  <w:footnote w:id="39">
     <w:p>
       <w:pPr>
         <w:pStyle w:val="FootnoteText"/>
@@ -60118,7 +60105,7 @@
       </w:r>
     </w:p>
   </w:footnote>
-  <w:footnote w:id="39">
+  <w:footnote w:id="40">
     <w:p>
       <w:pPr>
         <w:pStyle w:val="FootnoteText"/>

</xml_diff>

<commit_message>
data(resultados): entregáveis com notas enxutas (06/10/2026)
Norma 31/31, Word 49 páginas, fósseis 0, números sem fonte 0, validate consistente.

Co-Authored-By: Claude Opus 5.5 (1M context) <noreply@anthropic.com>
Claude-Session: https://claude.ai/code/session_01ATPBca6o9jxRv5wGBtSSkf
</commit_message>
<xml_diff>
--- a/entregaveis/TCC_Ricardo_Calheiros_MBA_USP_Esalq.docx
+++ b/entregaveis/TCC_Ricardo_Calheiros_MBA_USP_Esalq.docx
@@ -5189,28 +5189,7 @@
           <w:rFonts w:ascii="Arial" w:hAnsi="Arial"/>
           <w:sz w:val="22"/>
         </w:rPr>
-        <w:t xml:space="preserve">A tabela que mostra de que é feita a comparação (Angrist &amp; Pischke, cap. 3)</w:t>
-      </w:r>
-      <w:r>
-        <w:rPr>
-          <w:rFonts w:ascii="Arial" w:hAnsi="Arial"/>
-          <w:sz w:val="22"/>
-        </w:rPr>
-        <w:t xml:space="preserve">. </w:t>
-      </w:r>
-      <w:r>
-        <w:rPr>
-          <w:rFonts w:ascii="Arial" w:hAnsi="Arial"/>
-          <w:sz w:val="22"/>
-        </w:rPr>
-        <w:t xml:space="preserve"> </w:t>
-      </w:r>
-      <w:r>
-        <w:rPr>
-          <w:rFonts w:ascii="Arial" w:hAnsi="Arial"/>
-          <w:sz w:val="22"/>
-        </w:rPr>
-        <w:t xml:space="preserve">Diferença padronizada:</w:t>
+        <w:t>Diferença padronizada:</w:t>
       </w:r>
       <w:r>
         <w:rPr>
@@ -5401,21 +5380,21 @@
           <w:rFonts w:ascii="Arial" w:hAnsi="Arial"/>
           <w:sz w:val="22"/>
         </w:rPr>
-        <w:t xml:space="preserve">em módulo indicam desequilíbrio relevante. População completa da PEA com renda</w:t>
-      </w:r>
-      <w:r>
-        <w:rPr>
-          <w:rFonts w:ascii="Arial" w:hAnsi="Arial"/>
-          <w:sz w:val="22"/>
-        </w:rPr>
-        <w:t xml:space="preserve"> </w:t>
-      </w:r>
-      <w:r>
-        <w:rPr>
-          <w:rFonts w:ascii="Arial" w:hAnsi="Arial"/>
-          <w:sz w:val="22"/>
-        </w:rPr>
-        <w:t xml:space="preserve">positiva (</w:t>
+        <w:t>em módulo indicam desequilíbrio relevante. População completa da PEA com renda</w:t>
+      </w:r>
+      <w:r>
+        <w:rPr>
+          <w:rFonts w:ascii="Arial" w:hAnsi="Arial"/>
+          <w:sz w:val="22"/>
+        </w:rPr>
+        <w:t xml:space="preserve"> </w:t>
+      </w:r>
+      <w:r>
+        <w:rPr>
+          <w:rFonts w:ascii="Arial" w:hAnsi="Arial"/>
+          <w:sz w:val="22"/>
+        </w:rPr>
+        <w:t>positiva (</w:t>
       </w:r>
       <m:oMath>
         <m:r>
@@ -5467,21 +5446,21 @@
           <w:rFonts w:ascii="Arial" w:hAnsi="Arial"/>
           <w:sz w:val="22"/>
         </w:rPr>
-        <w:t xml:space="preserve">97,2% das UPAs têm</w:t>
-      </w:r>
-      <w:r>
-        <w:rPr>
-          <w:rFonts w:ascii="Arial" w:hAnsi="Arial"/>
-          <w:sz w:val="22"/>
-        </w:rPr>
-        <w:t xml:space="preserve"> </w:t>
-      </w:r>
-      <w:r>
-        <w:rPr>
-          <w:rFonts w:ascii="Arial" w:hAnsi="Arial"/>
-          <w:sz w:val="22"/>
-        </w:rPr>
-        <w:t xml:space="preserve">trabalhadores dos dois grupos, e 100,0% das células</w:t>
+        <w:t>97,2% das UPAs têm</w:t>
+      </w:r>
+      <w:r>
+        <w:rPr>
+          <w:rFonts w:ascii="Arial" w:hAnsi="Arial"/>
+          <w:sz w:val="22"/>
+        </w:rPr>
+        <w:t xml:space="preserve"> </w:t>
+      </w:r>
+      <w:r>
+        <w:rPr>
+          <w:rFonts w:ascii="Arial" w:hAnsi="Arial"/>
+          <w:sz w:val="22"/>
+        </w:rPr>
+        <w:t>trabalhadores dos dois grupos, e 100,0% das células</w:t>
       </w:r>
       <w:r>
         <w:rPr>
@@ -5524,21 +5503,21 @@
           <w:rFonts w:ascii="Arial" w:hAnsi="Arial"/>
           <w:sz w:val="22"/>
         </w:rPr>
-        <w:t xml:space="preserve">estão em células com os dois grupos) — a comparação não depende de extrapolar para</w:t>
-      </w:r>
-      <w:r>
-        <w:rPr>
-          <w:rFonts w:ascii="Arial" w:hAnsi="Arial"/>
-          <w:sz w:val="22"/>
-        </w:rPr>
-        <w:t xml:space="preserve"> </w:t>
-      </w:r>
-      <w:r>
-        <w:rPr>
-          <w:rFonts w:ascii="Arial" w:hAnsi="Arial"/>
-          <w:sz w:val="22"/>
-        </w:rPr>
-        <w:t xml:space="preserve">regiões da amostra onde só existe um dos grupos</w:t>
+        <w:t>estão em células com os dois grupos) — a comparação não depende de extrapolar para</w:t>
+      </w:r>
+      <w:r>
+        <w:rPr>
+          <w:rFonts w:ascii="Arial" w:hAnsi="Arial"/>
+          <w:sz w:val="22"/>
+        </w:rPr>
+        <w:t xml:space="preserve"> </w:t>
+      </w:r>
+      <w:r>
+        <w:rPr>
+          <w:rFonts w:ascii="Arial" w:hAnsi="Arial"/>
+          <w:sz w:val="22"/>
+        </w:rPr>
+        <w:t>regiões da amostra onde só existe um dos grupos</w:t>
       </w:r>
     </w:p>
     <w:bookmarkEnd w:id="24"/>
@@ -12157,35 +12136,21 @@
           <w:rFonts w:ascii="Arial" w:hAnsi="Arial"/>
           <w:sz w:val="22"/>
         </w:rPr>
-        <w:t xml:space="preserve">Cada linha traz o que foi</w:t>
-      </w:r>
-      <w:r>
-        <w:rPr>
-          <w:rFonts w:ascii="Arial" w:hAnsi="Arial"/>
-          <w:sz w:val="22"/>
-        </w:rPr>
-        <w:t xml:space="preserve"> </w:t>
-      </w:r>
-      <w:r>
-        <w:rPr>
-          <w:rFonts w:ascii="Arial" w:hAnsi="Arial"/>
-          <w:sz w:val="22"/>
-        </w:rPr>
-        <w:t xml:space="preserve">verificado, o resultado e a providência tomada. Valores extraídos dos</w:t>
-      </w:r>
-      <w:r>
-        <w:rPr>
-          <w:rFonts w:ascii="Arial" w:hAnsi="Arial"/>
-          <w:sz w:val="22"/>
-        </w:rPr>
-        <w:t xml:space="preserve"> </w:t>
-      </w:r>
-      <w:r>
-        <w:rPr>
-          <w:rFonts w:ascii="Arial" w:hAnsi="Arial"/>
-          <w:sz w:val="22"/>
-        </w:rPr>
-        <w:t xml:space="preserve">mesmos csv que alimentam as demais tabelas</w:t>
+        <w:t>Cada linha traz o que foi</w:t>
+      </w:r>
+      <w:r>
+        <w:rPr>
+          <w:rFonts w:ascii="Arial" w:hAnsi="Arial"/>
+          <w:sz w:val="22"/>
+        </w:rPr>
+        <w:t xml:space="preserve"> </w:t>
+      </w:r>
+      <w:r>
+        <w:rPr>
+          <w:rFonts w:ascii="Arial" w:hAnsi="Arial"/>
+          <w:sz w:val="22"/>
+        </w:rPr>
+        <w:t xml:space="preserve">verificado, o resultado e a providência tomada</w:t>
       </w:r>
     </w:p>
     <w:bookmarkEnd w:id="31"/>
@@ -19081,28 +19046,28 @@
           <w:rFonts w:ascii="Arial" w:hAnsi="Arial"/>
           <w:sz w:val="22"/>
         </w:rPr>
-        <w:t xml:space="preserve">Estratégia</w:t>
-      </w:r>
-      <w:r>
-        <w:rPr>
-          <w:rFonts w:ascii="Arial" w:hAnsi="Arial"/>
-          <w:sz w:val="22"/>
-        </w:rPr>
-        <w:t xml:space="preserve"> </w:t>
-      </w:r>
-      <w:r>
-        <w:rPr>
-          <w:rFonts w:ascii="Arial" w:hAnsi="Arial"/>
-          <w:sz w:val="22"/>
-        </w:rPr>
-        <w:t xml:space="preserve">step-up</w:t>
-      </w:r>
-      <w:r>
-        <w:rPr>
-          <w:rFonts w:ascii="Arial" w:hAnsi="Arial"/>
-          <w:sz w:val="22"/>
-        </w:rPr>
-        <w:t xml:space="preserve">, PNAD Contínua 2016–2025, população completa (</w:t>
+        <w:t>Estratégia</w:t>
+      </w:r>
+      <w:r>
+        <w:rPr>
+          <w:rFonts w:ascii="Arial" w:hAnsi="Arial"/>
+          <w:sz w:val="22"/>
+        </w:rPr>
+        <w:t xml:space="preserve"> </w:t>
+      </w:r>
+      <w:r>
+        <w:rPr>
+          <w:rFonts w:ascii="Arial" w:hAnsi="Arial"/>
+          <w:sz w:val="22"/>
+        </w:rPr>
+        <w:t>step-up</w:t>
+      </w:r>
+      <w:r>
+        <w:rPr>
+          <w:rFonts w:ascii="Arial" w:hAnsi="Arial"/>
+          <w:sz w:val="22"/>
+        </w:rPr>
+        <w:t>, PNAD Contínua 2016–2025, população completa (</w:t>
       </w:r>
       <m:oMath>
         <m:r>
@@ -19140,61 +19105,13 @@
           <w:rFonts w:ascii="Arial" w:hAnsi="Arial"/>
           <w:sz w:val="22"/>
         </w:rPr>
-        <w:t xml:space="preserve">Coeficientes com erro-padrão do modelo entre parênteses (a correlação intra-UPA já está no efeito aleatório). Estimação por máxima verossimilhança [ML], para os testes LR entre degraus; REML coincide. Com</w:t>
-      </w:r>
-      <w:r>
-        <w:rPr>
-          <w:rFonts w:ascii="Arial" w:hAnsi="Arial"/>
-          <w:sz w:val="22"/>
-        </w:rPr>
-        <w:t xml:space="preserve"> </w:t>
-      </w:r>
-      <m:oMath>
-        <m:r>
-          <m:t>N</m:t>
-        </m:r>
-      </m:oMath>
-      <w:r>
-        <w:rPr>
-          <w:rFonts w:ascii="Arial" w:hAnsi="Arial"/>
-          <w:sz w:val="22"/>
-        </w:rPr>
-        <w:t xml:space="preserve"> </w:t>
-      </w:r>
-      <w:r>
-        <w:rPr>
-          <w:rFonts w:ascii="Arial" w:hAnsi="Arial"/>
-          <w:sz w:val="22"/>
-        </w:rPr>
-        <w:t>desta ordem quase todo coeficiente é significante; a inferência relevante está nos intervalos de confiança, não nos asteriscos</w:t>
-      </w:r>
-      <w:r>
-        <w:rPr>
-          <w:rFonts w:ascii="Arial" w:hAnsi="Arial"/>
-          <w:sz w:val="22"/>
-        </w:rPr>
-        <w:t xml:space="preserve"> </w:t>
-      </w:r>
-      <w:r>
-        <w:rPr>
-          <w:rFonts w:ascii="Arial" w:hAnsi="Arial"/>
-          <w:sz w:val="22"/>
-        </w:rPr>
-        <w:t xml:space="preserve">(Angrist e Pischke, 2009, cap. 8)</w:t>
-      </w:r>
-      <w:r>
-        <w:rPr>
-          <w:rFonts w:ascii="Arial" w:hAnsi="Arial"/>
-          <w:sz w:val="22"/>
-        </w:rPr>
-        <w:t xml:space="preserve"/>
-      </w:r>
-      <w:r>
-        <w:rPr>
-          <w:rFonts w:ascii="Arial" w:hAnsi="Arial"/>
-          <w:sz w:val="22"/>
-        </w:rPr>
-        <w:t xml:space="preserve">. </w:t>
+        <w:t xml:space="preserve">Coeficientes com erro-padrão do modelo entre parênteses (a correlação intra-UPA já está no efeito aleatório). Estimação por máxima verossimilhança [ML], para os testes LR entre degraus; REML coincide. </w:t>
+      </w:r>
+      <w:r>
+        <w:rPr>
+          <w:rFonts w:ascii="Arial" w:hAnsi="Arial"/>
+          <w:sz w:val="22"/>
+        </w:rPr>
       </w:r>
       <w:r>
         <w:rPr>
@@ -19216,21 +19133,21 @@
           <w:rFonts w:ascii="Arial" w:hAnsi="Arial"/>
           <w:sz w:val="22"/>
         </w:rPr>
-        <w:t xml:space="preserve">negro</w:t>
-      </w:r>
-      <w:r>
-        <w:rPr>
-          <w:rFonts w:ascii="Arial" w:hAnsi="Arial"/>
-          <w:sz w:val="22"/>
-        </w:rPr>
-        <w:t xml:space="preserve"> </w:t>
-      </w:r>
-      <w:r>
-        <w:rPr>
-          <w:rFonts w:ascii="Arial" w:hAnsi="Arial"/>
-          <w:sz w:val="22"/>
-        </w:rPr>
-        <w:t xml:space="preserve">por UPA (M3 +</w:t>
+        <w:t>negro</w:t>
+      </w:r>
+      <w:r>
+        <w:rPr>
+          <w:rFonts w:ascii="Arial" w:hAnsi="Arial"/>
+          <w:sz w:val="22"/>
+        </w:rPr>
+        <w:t xml:space="preserve"> </w:t>
+      </w:r>
+      <w:r>
+        <w:rPr>
+          <w:rFonts w:ascii="Arial" w:hAnsi="Arial"/>
+          <w:sz w:val="22"/>
+        </w:rPr>
+        <w:t>por UPA (M3 +</w:t>
       </w:r>
       <w:r>
         <w:rPr>
@@ -19261,7 +19178,7 @@
           <w:rFonts w:ascii="Arial" w:hAnsi="Arial"/>
           <w:sz w:val="22"/>
         </w:rPr>
-        <w:t xml:space="preserve">):</w:t>
+        <w:t>):</w:t>
       </w:r>
       <w:r>
         <w:rPr>
@@ -19326,7 +19243,7 @@
           <w:rFonts w:ascii="Arial" w:hAnsi="Arial"/>
           <w:sz w:val="22"/>
         </w:rPr>
-        <w:t xml:space="preserve">(DP</w:t>
+        <w:t>(DP</w:t>
       </w:r>
       <w:r>
         <w:rPr>
@@ -19367,7 +19284,7 @@
           <w:rFonts w:ascii="Arial" w:hAnsi="Arial"/>
           <w:sz w:val="22"/>
         </w:rPr>
-        <w:t xml:space="preserve">em log-pontos), cov</w:t>
+        <w:t>em log-pontos), cov</w:t>
       </w:r>
       <m:oMath>
         <m:r>
@@ -19474,7 +19391,7 @@
           <w:rFonts w:ascii="Arial" w:hAnsi="Arial"/>
           <w:sz w:val="22"/>
         </w:rPr>
-        <w:t xml:space="preserve">(2 g.l.),</w:t>
+        <w:t>(2 g.l.),</w:t>
       </w:r>
       <w:r>
         <w:rPr>
@@ -19557,7 +19474,7 @@
           <w:rFonts w:ascii="Arial" w:hAnsi="Arial"/>
           <w:sz w:val="22"/>
         </w:rPr>
-        <w:t xml:space="preserve">médio</w:t>
+        <w:t>médio</w:t>
       </w:r>
       <w:r>
         <w:rPr>
@@ -19597,7 +19514,6 @@
           <w:rFonts w:ascii="Arial" w:hAnsi="Arial"/>
           <w:sz w:val="22"/>
         </w:rPr>
-        <w:t xml:space="preserve"/>
       </w:r>
     </w:p>
     <w:p>
@@ -24735,7 +24651,7 @@
           <w:rFonts w:ascii="Arial" w:hAnsi="Arial"/>
           <w:sz w:val="22"/>
         </w:rPr>
-        <w:t xml:space="preserve">2016–2025, população completa)</w:t>
+        <w:t>2016–2025, população completa)</w:t>
       </w:r>
       <w:r>
         <w:rPr>
@@ -24743,62 +24659,6 @@
           <w:sz w:val="22"/>
         </w:rPr>
         <w:t xml:space="preserve">. </w:t>
-      </w:r>
-      <w:r>
-        <w:rPr>
-          <w:rFonts w:ascii="Arial" w:hAnsi="Arial"/>
-          <w:sz w:val="22"/>
-        </w:rPr>
-        <w:t xml:space="preserve">Cada linha</w:t>
-      </w:r>
-      <w:r>
-        <w:rPr>
-          <w:rFonts w:ascii="Arial" w:hAnsi="Arial"/>
-          <w:sz w:val="22"/>
-        </w:rPr>
-        <w:t xml:space="preserve"> </w:t>
-      </w:r>
-      <w:r>
-        <w:rPr>
-          <w:rFonts w:ascii="Arial" w:hAnsi="Arial"/>
-          <w:sz w:val="22"/>
-        </w:rPr>
-        <w:t>acrescenta um bloco de controles ao anterior; à medida que se adiciona contexto e ocupação,</w:t>
-      </w:r>
-      <w:r>
-        <w:rPr>
-          <w:rFonts w:ascii="Arial" w:hAnsi="Arial"/>
-          <w:sz w:val="22"/>
-        </w:rPr>
-        <w:t xml:space="preserve"> </w:t>
-      </w:r>
-      <w:r>
-        <w:rPr>
-          <w:rFonts w:ascii="Arial" w:hAnsi="Arial"/>
-          <w:sz w:val="22"/>
-        </w:rPr>
-        <w:t xml:space="preserve">o gap encolhe e a mediação acumulada cresce</w:t>
-      </w:r>
-      <w:r>
-        <w:rPr>
-          <w:rFonts w:ascii="Arial" w:hAnsi="Arial"/>
-          <w:sz w:val="22"/>
-        </w:rPr>
-        <w:t xml:space="preserve">. </w:t>
-      </w:r>
-      <w:r>
-        <w:rPr>
-          <w:rFonts w:ascii="Arial" w:hAnsi="Arial"/>
-          <w:sz w:val="22"/>
-        </w:rPr>
-        <w:t xml:space="preserve">cada linha adiciona algo à anterior.</w:t>
-      </w:r>
-      <w:r>
-        <w:rPr>
-          <w:rFonts w:ascii="Arial" w:hAnsi="Arial"/>
-          <w:sz w:val="22"/>
-        </w:rPr>
-        <w:t xml:space="preserve"> </w:t>
       </w:r>
       <m:oMath>
         <m:sSub>
@@ -24844,21 +24704,21 @@
           <w:rFonts w:ascii="Arial" w:hAnsi="Arial"/>
           <w:sz w:val="22"/>
         </w:rPr>
-        <w:t xml:space="preserve">“Gap (%)”</w:t>
-      </w:r>
-      <w:r>
-        <w:rPr>
-          <w:rFonts w:ascii="Arial" w:hAnsi="Arial"/>
-          <w:sz w:val="22"/>
-        </w:rPr>
-        <w:t xml:space="preserve"> </w:t>
-      </w:r>
-      <w:r>
-        <w:rPr>
-          <w:rFonts w:ascii="Arial" w:hAnsi="Arial"/>
-          <w:sz w:val="22"/>
-        </w:rPr>
-        <w:t xml:space="preserve">é a</w:t>
+        <w:t>“Gap (%)”</w:t>
+      </w:r>
+      <w:r>
+        <w:rPr>
+          <w:rFonts w:ascii="Arial" w:hAnsi="Arial"/>
+          <w:sz w:val="22"/>
+        </w:rPr>
+        <w:t xml:space="preserve"> </w:t>
+      </w:r>
+      <w:r>
+        <w:rPr>
+          <w:rFonts w:ascii="Arial" w:hAnsi="Arial"/>
+          <w:sz w:val="22"/>
+        </w:rPr>
+        <w:t>é a</w:t>
       </w:r>
       <w:r>
         <w:rPr>
@@ -24886,7 +24746,7 @@
           <w:rFonts w:ascii="Arial" w:hAnsi="Arial"/>
           <w:sz w:val="22"/>
         </w:rPr>
-        <w:t xml:space="preserve">“Mediação acum.”</w:t>
+        <w:t>“Mediação acum.”</w:t>
       </w:r>
       <w:r>
         <w:rPr>
@@ -24907,91 +24767,14 @@
           <w:rFonts w:ascii="Arial" w:hAnsi="Arial"/>
           <w:sz w:val="22"/>
         </w:rPr>
-        <w:t xml:space="preserve">explicada. O salto da primeira para a segunda linha é a mediação pela segregação residencial:</w:t>
-      </w:r>
-      <w:r>
-        <w:rPr>
-          <w:rFonts w:ascii="Arial" w:hAnsi="Arial"/>
-          <w:sz w:val="22"/>
-        </w:rPr>
-        <w:t xml:space="preserve"> </w:t>
-      </w:r>
-      <w:r>
-        <w:rPr>
-          <w:rFonts w:ascii="Arial" w:hAnsi="Arial"/>
-          <w:sz w:val="22"/>
-        </w:rPr>
-        <w:t xml:space="preserve">comparar negros e brancos</w:t>
-      </w:r>
-      <w:r>
-        <w:rPr>
-          <w:rFonts w:ascii="Arial" w:hAnsi="Arial"/>
-          <w:sz w:val="22"/>
-        </w:rPr>
-        <w:t xml:space="preserve"> </w:t>
-      </w:r>
-      <w:r>
-        <w:rPr>
-          <w:rFonts w:ascii="Arial" w:hAnsi="Arial"/>
-          <w:sz w:val="22"/>
-        </w:rPr>
-        <w:t xml:space="preserve">do mesmo bairro</w:t>
-      </w:r>
-      <w:r>
-        <w:rPr>
-          <w:rFonts w:ascii="Arial" w:hAnsi="Arial"/>
-          <w:sz w:val="22"/>
-        </w:rPr>
-        <w:t xml:space="preserve"> </w:t>
-      </w:r>
-      <w:r>
-        <w:rPr>
-          <w:rFonts w:ascii="Arial" w:hAnsi="Arial"/>
-          <w:sz w:val="22"/>
-        </w:rPr>
-        <w:t xml:space="preserve">reduz o gap em 39,5%. Do modelo agregado</w:t>
-      </w:r>
-      <w:r>
-        <w:rPr>
-          <w:rFonts w:ascii="Arial" w:hAnsi="Arial"/>
-          <w:sz w:val="22"/>
-        </w:rPr>
-        <w:t xml:space="preserve"> </w:t>
-      </w:r>
-      <w:r>
-        <w:rPr>
-          <w:rFonts w:ascii="Arial" w:hAnsi="Arial"/>
-          <w:sz w:val="22"/>
-        </w:rPr>
-        <w:t xml:space="preserve">ao M4 o gap cai de 10,5% para 5,6%: 47,6% do gap é mediado por</w:t>
-      </w:r>
-      <w:r>
-        <w:rPr>
-          <w:rFonts w:ascii="Arial" w:hAnsi="Arial"/>
-          <w:sz w:val="22"/>
-        </w:rPr>
-        <w:t xml:space="preserve"> </w:t>
-      </w:r>
-      <w:r>
-        <w:rPr>
-          <w:rFonts w:ascii="Arial" w:hAnsi="Arial"/>
-          <w:sz w:val="22"/>
-        </w:rPr>
-        <w:t xml:space="preserve">onde a pessoa mora, o estado e a ocupação que acessa — e a penalidade de 5,6% persiste</w:t>
-      </w:r>
-      <w:r>
-        <w:rPr>
-          <w:rFonts w:ascii="Arial" w:hAnsi="Arial"/>
-          <w:sz w:val="22"/>
-        </w:rPr>
-        <w:t xml:space="preserve"> </w:t>
-      </w:r>
-      <w:r>
-        <w:rPr>
-          <w:rFonts w:ascii="Arial" w:hAnsi="Arial"/>
-          <w:sz w:val="22"/>
-        </w:rPr>
-        <w:t xml:space="preserve">dentro da mesma ocupação (limite inferior, pois a ocupação é ela própria resultado da barreira de acesso). O agregado inclui efeitos fixos de UF e o M1 e o M2 não (o M3 os reintroduz). Reestimado com UF, na mesma base, o M1 dá</w:t>
+        <w:t xml:space="preserve">explicada. </w:t>
+      </w:r>
+      <w:r>
+        <w:rPr>
+          <w:rFonts w:ascii="Arial" w:hAnsi="Arial"/>
+          <w:sz w:val="22"/>
+        </w:rPr>
+        <w:t>O agregado inclui efeitos fixos de UF e o M1 e o M2 não (o M3 os reintroduz). Reestimado com UF, na mesma base, o M1 dá</w:t>
       </w:r>
       <w:r>
         <w:rPr>
@@ -25054,7 +24837,7 @@
           <w:rFonts w:ascii="Arial" w:hAnsi="Arial"/>
           <w:sz w:val="22"/>
         </w:rPr>
-        <w:t xml:space="preserve">e uma mediação pelo bairro de 41,6% (contra 39,5% na tabela): com o estado mantido no modelo, a mediação pelo bairro é ainda maior — a leitura da tabela é conservadora. Sem os efeitos fixos de UF, o gap agregado seria de 20,1% — a diferença entre estados é, ela própria, parte do diferencial</w:t>
+        <w:t>e uma mediação pelo bairro de 41,6% (contra 39,5% na tabela): com o estado mantido no modelo, a mediação pelo bairro é ainda maior — a leitura da tabela é conservadora. Sem os efeitos fixos de UF, o gap agregado seria de 20,1% — a diferença entre estados é, ela própria, parte do diferencial</w:t>
       </w:r>
     </w:p>
     <w:p>
@@ -26419,28 +26202,28 @@
           <w:rFonts w:ascii="Arial" w:hAnsi="Arial"/>
           <w:sz w:val="22"/>
         </w:rPr>
-        <w:t xml:space="preserve">Capital humano +</w:t>
-      </w:r>
-      <w:r>
-        <w:rPr>
-          <w:rFonts w:ascii="Arial" w:hAnsi="Arial"/>
-          <w:sz w:val="22"/>
-        </w:rPr>
-        <w:t xml:space="preserve"> </w:t>
-      </w:r>
-      <w:r>
-        <w:rPr>
-          <w:rFonts w:ascii="Arial" w:hAnsi="Arial"/>
-          <w:sz w:val="22"/>
-        </w:rPr>
-        <w:t xml:space="preserve">contexto</w:t>
-      </w:r>
-      <w:r>
-        <w:rPr>
-          <w:rFonts w:ascii="Arial" w:hAnsi="Arial"/>
-          <w:sz w:val="22"/>
-        </w:rPr>
-        <w:t xml:space="preserve">: escolaridade, idade, sexo, jornada, área urbana, contexto de UPA e efeitos fixos</w:t>
+        <w:t>Capital humano +</w:t>
+      </w:r>
+      <w:r>
+        <w:rPr>
+          <w:rFonts w:ascii="Arial" w:hAnsi="Arial"/>
+          <w:sz w:val="22"/>
+        </w:rPr>
+        <w:t xml:space="preserve"> </w:t>
+      </w:r>
+      <w:r>
+        <w:rPr>
+          <w:rFonts w:ascii="Arial" w:hAnsi="Arial"/>
+          <w:sz w:val="22"/>
+        </w:rPr>
+        <w:t>contexto</w:t>
+      </w:r>
+      <w:r>
+        <w:rPr>
+          <w:rFonts w:ascii="Arial" w:hAnsi="Arial"/>
+          <w:sz w:val="22"/>
+        </w:rPr>
+        <w:t>: escolaridade, idade, sexo, jornada, área urbana, contexto de UPA e efeitos fixos</w:t>
       </w:r>
       <w:r>
         <w:rPr>
@@ -26475,98 +26258,98 @@
           <w:rFonts w:ascii="Arial" w:hAnsi="Arial"/>
           <w:sz w:val="22"/>
         </w:rPr>
-        <w:t xml:space="preserve">Acesso</w:t>
-      </w:r>
-      <w:r>
-        <w:rPr>
-          <w:rFonts w:ascii="Arial" w:hAnsi="Arial"/>
-          <w:sz w:val="22"/>
-        </w:rPr>
-        <w:t xml:space="preserve">: (A) + formalidade e grupo CBO tratados como dotações (os controles do M4) — a parcela não explicada é a discriminação</w:t>
-      </w:r>
-      <w:r>
-        <w:rPr>
-          <w:rFonts w:ascii="Arial" w:hAnsi="Arial"/>
-          <w:sz w:val="22"/>
-        </w:rPr>
-        <w:t xml:space="preserve"> </w:t>
-      </w:r>
-      <w:r>
-        <w:rPr>
-          <w:rFonts w:ascii="Arial" w:hAnsi="Arial"/>
-          <w:sz w:val="22"/>
-        </w:rPr>
-        <w:t xml:space="preserve">dentro</w:t>
-      </w:r>
-      <w:r>
-        <w:rPr>
-          <w:rFonts w:ascii="Arial" w:hAnsi="Arial"/>
-          <w:sz w:val="22"/>
-        </w:rPr>
-        <w:t xml:space="preserve"> </w:t>
-      </w:r>
-      <w:r>
-        <w:rPr>
-          <w:rFonts w:ascii="Arial" w:hAnsi="Arial"/>
-          <w:sz w:val="22"/>
-        </w:rPr>
-        <w:t xml:space="preserve">da ocupação, um limite inferior, pois a segregação ocupacional é ela própria</w:t>
-      </w:r>
-      <w:r>
-        <w:rPr>
-          <w:rFonts w:ascii="Arial" w:hAnsi="Arial"/>
-          <w:sz w:val="22"/>
-        </w:rPr>
-        <w:t xml:space="preserve"> </w:t>
-      </w:r>
-      <w:r>
-        <w:rPr>
-          <w:rFonts w:ascii="Arial" w:hAnsi="Arial"/>
-          <w:sz w:val="22"/>
-        </w:rPr>
-        <w:t xml:space="preserve">discriminatória</w:t>
-      </w:r>
-      <w:r>
-        <w:rPr>
-          <w:rFonts w:ascii="Arial" w:hAnsi="Arial"/>
-          <w:sz w:val="22"/>
-        </w:rPr>
-        <w:t xml:space="preserve"> </w:t>
-      </w:r>
-      <w:r>
-        <w:rPr>
-          <w:rFonts w:ascii="Arial" w:hAnsi="Arial"/>
-          <w:sz w:val="22"/>
-        </w:rPr>
-        <w:t xml:space="preserve">(Oaxaca e Ransom, 1999)</w:t>
-      </w:r>
-      <w:r>
-        <w:rPr>
-          <w:rFonts w:ascii="Arial" w:hAnsi="Arial"/>
-          <w:sz w:val="22"/>
-        </w:rPr>
-        <w:t xml:space="preserve"> </w:t>
-      </w:r>
-      <w:r>
-        <w:rPr>
-          <w:rFonts w:ascii="Arial" w:hAnsi="Arial"/>
-          <w:sz w:val="22"/>
-        </w:rPr>
-        <w:t xml:space="preserve">(ver o GLMM de acesso, Tabela 8).</w:t>
-      </w:r>
-      <w:r>
-        <w:rPr>
-          <w:rFonts w:ascii="Arial" w:hAnsi="Arial"/>
-          <w:sz w:val="22"/>
-        </w:rPr>
-        <w:t xml:space="preserve"> </w:t>
-      </w:r>
-      <w:r>
-        <w:rPr>
-          <w:rFonts w:ascii="Arial" w:hAnsi="Arial"/>
-          <w:sz w:val="22"/>
-        </w:rPr>
-        <w:t xml:space="preserve">População completa da PEA com renda positiva (</w:t>
+        <w:t>Acesso</w:t>
+      </w:r>
+      <w:r>
+        <w:rPr>
+          <w:rFonts w:ascii="Arial" w:hAnsi="Arial"/>
+          <w:sz w:val="22"/>
+        </w:rPr>
+        <w:t>: (A) + formalidade e grupo CBO tratados como dotações (os controles do M4) — a parcela não explicada é a discriminação</w:t>
+      </w:r>
+      <w:r>
+        <w:rPr>
+          <w:rFonts w:ascii="Arial" w:hAnsi="Arial"/>
+          <w:sz w:val="22"/>
+        </w:rPr>
+        <w:t xml:space="preserve"> </w:t>
+      </w:r>
+      <w:r>
+        <w:rPr>
+          <w:rFonts w:ascii="Arial" w:hAnsi="Arial"/>
+          <w:sz w:val="22"/>
+        </w:rPr>
+        <w:t>dentro</w:t>
+      </w:r>
+      <w:r>
+        <w:rPr>
+          <w:rFonts w:ascii="Arial" w:hAnsi="Arial"/>
+          <w:sz w:val="22"/>
+        </w:rPr>
+        <w:t xml:space="preserve"> </w:t>
+      </w:r>
+      <w:r>
+        <w:rPr>
+          <w:rFonts w:ascii="Arial" w:hAnsi="Arial"/>
+          <w:sz w:val="22"/>
+        </w:rPr>
+        <w:t>da ocupação, um limite inferior, pois a segregação ocupacional é ela própria</w:t>
+      </w:r>
+      <w:r>
+        <w:rPr>
+          <w:rFonts w:ascii="Arial" w:hAnsi="Arial"/>
+          <w:sz w:val="22"/>
+        </w:rPr>
+        <w:t xml:space="preserve"> </w:t>
+      </w:r>
+      <w:r>
+        <w:rPr>
+          <w:rFonts w:ascii="Arial" w:hAnsi="Arial"/>
+          <w:sz w:val="22"/>
+        </w:rPr>
+        <w:t>discriminatória</w:t>
+      </w:r>
+      <w:r>
+        <w:rPr>
+          <w:rFonts w:ascii="Arial" w:hAnsi="Arial"/>
+          <w:sz w:val="22"/>
+        </w:rPr>
+        <w:t xml:space="preserve"> </w:t>
+      </w:r>
+      <w:r>
+        <w:rPr>
+          <w:rFonts w:ascii="Arial" w:hAnsi="Arial"/>
+          <w:sz w:val="22"/>
+        </w:rPr>
+        <w:t>(Oaxaca e Ransom, 1999)</w:t>
+      </w:r>
+      <w:r>
+        <w:rPr>
+          <w:rFonts w:ascii="Arial" w:hAnsi="Arial"/>
+          <w:sz w:val="22"/>
+        </w:rPr>
+        <w:t xml:space="preserve"> </w:t>
+      </w:r>
+      <w:r>
+        <w:rPr>
+          <w:rFonts w:ascii="Arial" w:hAnsi="Arial"/>
+          <w:sz w:val="22"/>
+        </w:rPr>
+        <w:t>(ver o GLMM de acesso, Tabela 8).</w:t>
+      </w:r>
+      <w:r>
+        <w:rPr>
+          <w:rFonts w:ascii="Arial" w:hAnsi="Arial"/>
+          <w:sz w:val="22"/>
+        </w:rPr>
+        <w:t xml:space="preserve"> </w:t>
+      </w:r>
+      <w:r>
+        <w:rPr>
+          <w:rFonts w:ascii="Arial" w:hAnsi="Arial"/>
+          <w:sz w:val="22"/>
+        </w:rPr>
+        <w:t>População completa da PEA com renda positiva (</w:t>
       </w:r>
       <m:oMath>
         <m:r>
@@ -26604,184 +26387,14 @@
           <w:rFonts w:ascii="Arial" w:hAnsi="Arial"/>
           <w:sz w:val="22"/>
         </w:rPr>
-        <w:t xml:space="preserve">Erros-padrão entre parênteses: bootstrap em blocos por UPA (500 réplicas)</w:t>
-      </w:r>
-      <w:r>
-        <w:rPr>
-          <w:rFonts w:ascii="Arial" w:hAnsi="Arial"/>
-          <w:sz w:val="22"/>
-        </w:rPr>
-        <w:t xml:space="preserve">. </w:t>
-      </w:r>
-      <w:r>
-        <w:rPr>
-          <w:rFonts w:ascii="Arial" w:hAnsi="Arial"/>
-          <w:sz w:val="22"/>
-        </w:rPr>
-        <w:t xml:space="preserve">em cada especificação, Dotações</w:t>
-      </w:r>
-      <w:r>
-        <w:rPr>
-          <w:rFonts w:ascii="Arial" w:hAnsi="Arial"/>
-          <w:sz w:val="22"/>
-        </w:rPr>
-        <w:t xml:space="preserve"> </w:t>
-      </w:r>
-      <m:oMath>
-        <m:r>
-          <m:rPr>
-            <m:sty m:val="p"/>
-          </m:rPr>
-          <m:t>+</m:t>
-        </m:r>
-      </m:oMath>
-      <w:r>
-        <w:rPr>
-          <w:rFonts w:ascii="Arial" w:hAnsi="Arial"/>
-          <w:sz w:val="22"/>
-        </w:rPr>
-        <w:t xml:space="preserve"> </w:t>
-      </w:r>
-      <w:r>
-        <w:rPr>
-          <w:rFonts w:ascii="Arial" w:hAnsi="Arial"/>
-          <w:sz w:val="22"/>
-        </w:rPr>
-        <w:t xml:space="preserve">Não explicado</w:t>
-      </w:r>
-      <w:r>
-        <w:rPr>
-          <w:rFonts w:ascii="Arial" w:hAnsi="Arial"/>
-          <w:sz w:val="22"/>
-        </w:rPr>
-        <w:t xml:space="preserve"> </w:t>
-      </w:r>
-      <m:oMath>
-        <m:r>
-          <m:rPr>
-            <m:sty m:val="p"/>
-          </m:rPr>
-          <m:t>=</m:t>
-        </m:r>
-      </m:oMath>
-      <w:r>
-        <w:rPr>
-          <w:rFonts w:ascii="Arial" w:hAnsi="Arial"/>
-          <w:sz w:val="22"/>
-        </w:rPr>
-        <w:t xml:space="preserve"> </w:t>
-      </w:r>
-      <w:r>
-        <w:rPr>
-          <w:rFonts w:ascii="Arial" w:hAnsi="Arial"/>
-          <w:sz w:val="22"/>
-        </w:rPr>
-        <w:t xml:space="preserve">Gap total.</w:t>
-      </w:r>
-      <w:r>
-        <w:rPr>
-          <w:rFonts w:ascii="Arial" w:hAnsi="Arial"/>
-          <w:sz w:val="22"/>
-        </w:rPr>
-        <w:t xml:space="preserve"> </w:t>
-      </w:r>
-      <w:r>
-        <w:rPr>
-          <w:rFonts w:ascii="Arial" w:hAnsi="Arial"/>
-          <w:sz w:val="22"/>
-        </w:rPr>
-        <w:t xml:space="preserve">De (A) para (B), parte do</w:t>
-      </w:r>
-      <w:r>
-        <w:rPr>
-          <w:rFonts w:ascii="Arial" w:hAnsi="Arial"/>
-          <w:sz w:val="22"/>
-        </w:rPr>
-        <w:t xml:space="preserve"> </w:t>
-      </w:r>
-      <w:r>
-        <w:rPr>
-          <w:rFonts w:ascii="Arial" w:hAnsi="Arial"/>
-          <w:sz w:val="22"/>
-        </w:rPr>
-        <w:t xml:space="preserve">“não explicado”</w:t>
-      </w:r>
-      <w:r>
-        <w:rPr>
-          <w:rFonts w:ascii="Arial" w:hAnsi="Arial"/>
-          <w:sz w:val="22"/>
-        </w:rPr>
-        <w:t xml:space="preserve"> </w:t>
-      </w:r>
-      <w:r>
-        <w:rPr>
-          <w:rFonts w:ascii="Arial" w:hAnsi="Arial"/>
-          <w:sz w:val="22"/>
-        </w:rPr>
-        <w:t xml:space="preserve">migra para</w:t>
-      </w:r>
-      <w:r>
-        <w:rPr>
-          <w:rFonts w:ascii="Arial" w:hAnsi="Arial"/>
-          <w:sz w:val="22"/>
-        </w:rPr>
-        <w:t xml:space="preserve"> </w:t>
-      </w:r>
-      <w:r>
-        <w:rPr>
-          <w:rFonts w:ascii="Arial" w:hAnsi="Arial"/>
-          <w:sz w:val="22"/>
-        </w:rPr>
-        <w:t xml:space="preserve">“dotações”</w:t>
-      </w:r>
-      <w:r>
-        <w:rPr>
-          <w:rFonts w:ascii="Arial" w:hAnsi="Arial"/>
-          <w:sz w:val="22"/>
-        </w:rPr>
-        <w:t xml:space="preserve"> </w:t>
-      </w:r>
-      <w:r>
-        <w:rPr>
-          <w:rFonts w:ascii="Arial" w:hAnsi="Arial"/>
-          <w:sz w:val="22"/>
-        </w:rPr>
-        <w:t xml:space="preserve">porque a ocupação passa a</w:t>
-      </w:r>
-      <w:r>
-        <w:rPr>
-          <w:rFonts w:ascii="Arial" w:hAnsi="Arial"/>
-          <w:sz w:val="22"/>
-        </w:rPr>
-        <w:t xml:space="preserve"> </w:t>
-      </w:r>
-      <w:r>
-        <w:rPr>
-          <w:rFonts w:ascii="Arial" w:hAnsi="Arial"/>
-          <w:sz w:val="22"/>
-        </w:rPr>
-        <w:t xml:space="preserve">ser tratada como característica — é exatamente a parcela da discriminação que opera pela</w:t>
-      </w:r>
-      <w:r>
-        <w:rPr>
-          <w:rFonts w:ascii="Arial" w:hAnsi="Arial"/>
-          <w:sz w:val="22"/>
-        </w:rPr>
-        <w:t xml:space="preserve"> </w:t>
-      </w:r>
-      <w:r>
-        <w:rPr>
-          <w:rFonts w:ascii="Arial" w:hAnsi="Arial"/>
-          <w:sz w:val="22"/>
-        </w:rPr>
-        <w:t xml:space="preserve">porta de entrada</w:t>
-      </w:r>
-      <w:r>
-        <w:rPr>
-          <w:rFonts w:ascii="Arial" w:hAnsi="Arial"/>
-          <w:sz w:val="22"/>
-        </w:rPr>
-        <w:t xml:space="preserve">, e não pelo salário</w:t>
+        <w:t>Erros-padrão entre parênteses: bootstrap em blocos por UPA (500 réplicas)</w:t>
+      </w:r>
+      <w:r>
+        <w:rPr>
+          <w:rFonts w:ascii="Arial" w:hAnsi="Arial"/>
+          <w:sz w:val="22"/>
+        </w:rPr>
+        <w:t xml:space="preserve"/>
       </w:r>
     </w:p>
     <w:p>
@@ -30530,7 +30143,7 @@
           <w:rFonts w:ascii="Arial" w:hAnsi="Arial"/>
           <w:sz w:val="22"/>
         </w:rPr>
-        <w:t xml:space="preserve">LR vs. pooled: teste de razão de verossimilhança do A2 contra o logit sem efeito aleatório (fronteira,</w:t>
+        <w:t>LR vs. pooled: teste de razão de verossimilhança do A2 contra o logit sem efeito aleatório (fronteira,</w:t>
       </w:r>
       <w:r>
         <w:rPr>
@@ -30572,21 +30185,21 @@
           <w:rFonts w:ascii="Arial" w:hAnsi="Arial"/>
           <w:sz w:val="22"/>
         </w:rPr>
-        <w:t xml:space="preserve">cutoff</w:t>
-      </w:r>
-      <w:r>
-        <w:rPr>
-          <w:rFonts w:ascii="Arial" w:hAnsi="Arial"/>
-          <w:sz w:val="22"/>
-        </w:rPr>
-        <w:t xml:space="preserve"> </w:t>
-      </w:r>
-      <w:r>
-        <w:rPr>
-          <w:rFonts w:ascii="Arial" w:hAnsi="Arial"/>
-          <w:sz w:val="22"/>
-        </w:rPr>
-        <w:t xml:space="preserve">de Youden (maximiza sensibilidade</w:t>
+        <w:t>cutoff</w:t>
+      </w:r>
+      <w:r>
+        <w:rPr>
+          <w:rFonts w:ascii="Arial" w:hAnsi="Arial"/>
+          <w:sz w:val="22"/>
+        </w:rPr>
+        <w:t xml:space="preserve"> </w:t>
+      </w:r>
+      <w:r>
+        <w:rPr>
+          <w:rFonts w:ascii="Arial" w:hAnsi="Arial"/>
+          <w:sz w:val="22"/>
+        </w:rPr>
+        <w:t>de Youden (maximiza sensibilidade</w:t>
       </w:r>
       <w:r>
         <w:rPr>
@@ -30615,107 +30228,7 @@
           <w:rFonts w:ascii="Arial" w:hAnsi="Arial"/>
           <w:sz w:val="22"/>
         </w:rPr>
-        <w:t>especificidade) com as taxas correspondentes; Hosmer–Lemeshow em 10 decis. Modelos A1–A4 como na Tabela 8. Com</w:t>
-      </w:r>
-      <w:r>
-        <w:rPr>
-          <w:rFonts w:ascii="Arial" w:hAnsi="Arial"/>
-          <w:sz w:val="22"/>
-        </w:rPr>
-        <w:t xml:space="preserve"> </w:t>
-      </w:r>
-      <m:oMath>
-        <m:r>
-          <m:t>N</m:t>
-        </m:r>
-        <m:r>
-          <m:rPr>
-            <m:sty m:val="p"/>
-          </m:rPr>
-          <m:t>=</m:t>
-        </m:r>
-        <m:r>
-          <m:t>7</m:t>
-        </m:r>
-        <m:r>
-          <m:rPr>
-            <m:sty m:val="p"/>
-          </m:rPr>
-          <m:t>,</m:t>
-        </m:r>
-        <m:r>
-          <m:t>7</m:t>
-        </m:r>
-      </m:oMath>
-      <w:r>
-        <w:rPr>
-          <w:rFonts w:ascii="Arial" w:hAnsi="Arial"/>
-          <w:sz w:val="22"/>
-        </w:rPr>
-        <w:t xml:space="preserve"> milhões qualquer desvio de calibração é</w:t>
-      </w:r>
-      <w:r>
-        <w:rPr>
-          <w:rFonts w:ascii="Arial" w:hAnsi="Arial"/>
-          <w:sz w:val="22"/>
-        </w:rPr>
-        <w:t xml:space="preserve"> </w:t>
-      </w:r>
-      <w:r>
-        <w:rPr>
-          <w:rFonts w:ascii="Arial" w:hAnsi="Arial"/>
-          <w:sz w:val="22"/>
-        </w:rPr>
-        <w:t xml:space="preserve">“significativo”</w:t>
-      </w:r>
-      <w:r>
-        <w:rPr>
-          <w:rFonts w:ascii="Arial" w:hAnsi="Arial"/>
-          <w:sz w:val="22"/>
-        </w:rPr>
-        <w:t xml:space="preserve"> </w:t>
-      </w:r>
-      <w:r>
-        <w:rPr>
-          <w:rFonts w:ascii="Arial" w:hAnsi="Arial"/>
-          <w:sz w:val="22"/>
-        </w:rPr>
-        <w:t xml:space="preserve">— o</w:t>
-      </w:r>
-      <w:r>
-        <w:rPr>
-          <w:rFonts w:ascii="Arial" w:hAnsi="Arial"/>
-          <w:sz w:val="22"/>
-        </w:rPr>
-        <w:t xml:space="preserve"> </w:t>
-      </w:r>
-      <m:oMath>
-        <m:sSup>
-          <m:e>
-            <m:r>
-              <m:t>χ</m:t>
-            </m:r>
-          </m:e>
-          <m:sup>
-            <m:r>
-              <m:t>2</m:t>
-            </m:r>
-          </m:sup>
-        </m:sSup>
-      </m:oMath>
-      <w:r>
-        <w:rPr>
-          <w:rFonts w:ascii="Arial" w:hAnsi="Arial"/>
-          <w:sz w:val="22"/>
-        </w:rPr>
-        <w:t xml:space="preserve"> </w:t>
-      </w:r>
-      <w:r>
-        <w:rPr>
-          <w:rFonts w:ascii="Arial" w:hAnsi="Arial"/>
-          <w:sz w:val="22"/>
-        </w:rPr>
-        <w:t xml:space="preserve">deve ser lido como magnitude relativa entre degraus, não como teste (MHE, cap. 8)</w:t>
+        <w:t xml:space="preserve">especificidade) com as taxas correspondentes; Hosmer–Lemeshow em 10 decis. Modelos A1–A4 como na Tabela 8</w:t>
       </w:r>
     </w:p>
     <w:p>
@@ -34267,21 +33780,21 @@
           <w:rFonts w:ascii="Arial" w:hAnsi="Arial"/>
           <w:sz w:val="22"/>
         </w:rPr>
-        <w:t xml:space="preserve">Odds ratio</w:t>
-      </w:r>
-      <w:r>
-        <w:rPr>
-          <w:rFonts w:ascii="Arial" w:hAnsi="Arial"/>
-          <w:sz w:val="22"/>
-        </w:rPr>
-        <w:t xml:space="preserve"> </w:t>
-      </w:r>
-      <w:r>
-        <w:rPr>
-          <w:rFonts w:ascii="Arial" w:hAnsi="Arial"/>
-          <w:sz w:val="22"/>
-        </w:rPr>
-        <w:t xml:space="preserve">do coeficiente</w:t>
+        <w:t>Odds ratio</w:t>
+      </w:r>
+      <w:r>
+        <w:rPr>
+          <w:rFonts w:ascii="Arial" w:hAnsi="Arial"/>
+          <w:sz w:val="22"/>
+        </w:rPr>
+        <w:t xml:space="preserve"> </w:t>
+      </w:r>
+      <w:r>
+        <w:rPr>
+          <w:rFonts w:ascii="Arial" w:hAnsi="Arial"/>
+          <w:sz w:val="22"/>
+        </w:rPr>
+        <w:t>do coeficiente</w:t>
       </w:r>
       <w:r>
         <w:rPr>
@@ -34296,21 +33809,21 @@
           <w:rFonts w:ascii="Arial" w:hAnsi="Arial"/>
           <w:sz w:val="22"/>
         </w:rPr>
-        <w:t xml:space="preserve">negro</w:t>
-      </w:r>
-      <w:r>
-        <w:rPr>
-          <w:rFonts w:ascii="Arial" w:hAnsi="Arial"/>
-          <w:sz w:val="22"/>
-        </w:rPr>
-        <w:t xml:space="preserve"> </w:t>
-      </w:r>
-      <w:r>
-        <w:rPr>
-          <w:rFonts w:ascii="Arial" w:hAnsi="Arial"/>
-          <w:sz w:val="22"/>
-        </w:rPr>
-        <w:t xml:space="preserve">com IC 95%, efeito marginal médio (AME: diferença média de probabilidade predita, em pontos percentuais), ICC da UPA</w:t>
+        <w:t>negro</w:t>
+      </w:r>
+      <w:r>
+        <w:rPr>
+          <w:rFonts w:ascii="Arial" w:hAnsi="Arial"/>
+          <w:sz w:val="22"/>
+        </w:rPr>
+        <w:t xml:space="preserve"> </w:t>
+      </w:r>
+      <w:r>
+        <w:rPr>
+          <w:rFonts w:ascii="Arial" w:hAnsi="Arial"/>
+          <w:sz w:val="22"/>
+        </w:rPr>
+        <w:t>com IC 95%, efeito marginal médio (AME: diferença média de probabilidade predita, em pontos percentuais), ICC da UPA</w:t>
       </w:r>
       <w:r>
         <w:rPr>
@@ -34408,28 +33921,28 @@
           <w:rFonts w:ascii="Arial" w:hAnsi="Arial"/>
           <w:sz w:val="22"/>
         </w:rPr>
-        <w:t xml:space="preserve">e E-value</w:t>
-      </w:r>
-      <w:r>
-        <w:rPr>
-          <w:rFonts w:ascii="Arial" w:hAnsi="Arial"/>
-          <w:sz w:val="22"/>
-        </w:rPr>
-        <w:t xml:space="preserve"> </w:t>
-      </w:r>
-      <w:r>
-        <w:rPr>
-          <w:rFonts w:ascii="Arial" w:hAnsi="Arial"/>
-          <w:sz w:val="22"/>
-        </w:rPr>
-        <w:t xml:space="preserve">(VanderWeele e Ding, 2017)</w:t>
-      </w:r>
-      <w:r>
-        <w:rPr>
-          <w:rFonts w:ascii="Arial" w:hAnsi="Arial"/>
-          <w:sz w:val="22"/>
-        </w:rPr>
-        <w:t xml:space="preserve">. Coluna final: OR do logit com efeitos fixos de UF e erro-padrão agrupado por UPA (robustez). População completa da PEA com renda positiva (</w:t>
+        <w:t>e E-value</w:t>
+      </w:r>
+      <w:r>
+        <w:rPr>
+          <w:rFonts w:ascii="Arial" w:hAnsi="Arial"/>
+          <w:sz w:val="22"/>
+        </w:rPr>
+        <w:t xml:space="preserve"> </w:t>
+      </w:r>
+      <w:r>
+        <w:rPr>
+          <w:rFonts w:ascii="Arial" w:hAnsi="Arial"/>
+          <w:sz w:val="22"/>
+        </w:rPr>
+        <w:t>(VanderWeele e Ding, 2017)</w:t>
+      </w:r>
+      <w:r>
+        <w:rPr>
+          <w:rFonts w:ascii="Arial" w:hAnsi="Arial"/>
+          <w:sz w:val="22"/>
+        </w:rPr>
+        <w:t>. Coluna final: OR do logit com efeitos fixos de UF e erro-padrão agrupado por UPA (robustez). População completa da PEA com renda positiva (</w:t>
       </w:r>
       <m:oMath>
         <m:r>
@@ -34453,84 +33966,14 @@
           <w:rFonts w:ascii="Arial" w:hAnsi="Arial"/>
           <w:sz w:val="22"/>
         </w:rPr>
-        <w:t>; 41.454 UPAs). A3 acrescenta o vínculo (formalidade, setor público, conta própria, doméstico), que é desfecho da própria discriminação: limite inferior. Todos os OR com</w:t>
-      </w:r>
-      <w:r>
-        <w:rPr>
-          <w:rFonts w:ascii="Arial" w:hAnsi="Arial"/>
-          <w:sz w:val="22"/>
-        </w:rPr>
-        <w:t xml:space="preserve"> </w:t>
-      </w:r>
-      <m:oMath>
-        <m:r>
-          <m:t>p</m:t>
-        </m:r>
-        <m:r>
-          <m:rPr>
-            <m:sty m:val="p"/>
-          </m:rPr>
-          <m:t>&lt;</m:t>
-        </m:r>
-        <m:r>
-          <m:t>0</m:t>
-        </m:r>
-        <m:r>
-          <m:rPr>
-            <m:sty m:val="p"/>
-          </m:rPr>
-          <m:t>,</m:t>
-        </m:r>
-        <m:r>
-          <m:t>001</m:t>
-        </m:r>
-      </m:oMath>
-      <w:r>
-        <w:rPr>
-          <w:rFonts w:ascii="Arial" w:hAnsi="Arial"/>
-          <w:sz w:val="22"/>
-        </w:rPr>
-        <w:t>; com</w:t>
-      </w:r>
-      <w:r>
-        <w:rPr>
-          <w:rFonts w:ascii="Arial" w:hAnsi="Arial"/>
-          <w:sz w:val="22"/>
-        </w:rPr>
-        <w:t xml:space="preserve"> </w:t>
-      </w:r>
-      <m:oMath>
-        <m:r>
-          <m:t>N</m:t>
-        </m:r>
-      </m:oMath>
-      <w:r>
-        <w:rPr>
-          <w:rFonts w:ascii="Arial" w:hAnsi="Arial"/>
-          <w:sz w:val="22"/>
-        </w:rPr>
-        <w:t xml:space="preserve"> </w:t>
-      </w:r>
-      <w:r>
-        <w:rPr>
-          <w:rFonts w:ascii="Arial" w:hAnsi="Arial"/>
-          <w:sz w:val="22"/>
-        </w:rPr>
-        <w:t xml:space="preserve">desta ordem, a inferência relevante está nos IC e nos E-values</w:t>
-      </w:r>
-      <w:r>
-        <w:rPr>
-          <w:rFonts w:ascii="Arial" w:hAnsi="Arial"/>
-          <w:sz w:val="22"/>
-        </w:rPr>
-        <w:t xml:space="preserve">. </w:t>
-      </w:r>
-      <w:r>
-        <w:rPr>
-          <w:rFonts w:ascii="Arial" w:hAnsi="Arial"/>
-          <w:sz w:val="22"/>
-        </w:rPr>
-        <w:t xml:space="preserve">OR</w:t>
+        <w:t xml:space="preserve">; 41.454 UPAs). A3 acrescenta o vínculo (formalidade, setor público, conta própria, doméstico), que é desfecho da própria discriminação: limite inferior. </w:t>
+      </w:r>
+      <w:r>
+        <w:rPr>
+          <w:rFonts w:ascii="Arial" w:hAnsi="Arial"/>
+          <w:sz w:val="22"/>
+        </w:rPr>
+        <w:t>OR</w:t>
       </w:r>
       <w:r>
         <w:rPr>
@@ -34562,21 +34005,21 @@
           <w:rFonts w:ascii="Arial" w:hAnsi="Arial"/>
           <w:sz w:val="22"/>
         </w:rPr>
-        <w:t xml:space="preserve">= menor chance de acesso para trabalhadores negros do que para brancos de mesmo perfil</w:t>
-      </w:r>
-      <w:r>
-        <w:rPr>
-          <w:rFonts w:ascii="Arial" w:hAnsi="Arial"/>
-          <w:sz w:val="22"/>
-        </w:rPr>
-        <w:t xml:space="preserve"> </w:t>
-      </w:r>
-      <w:r>
-        <w:rPr>
-          <w:rFonts w:ascii="Arial" w:hAnsi="Arial"/>
-          <w:sz w:val="22"/>
-        </w:rPr>
-        <w:t xml:space="preserve">e do mesmo bairro</w:t>
+        <w:t>= menor chance de acesso para trabalhadores negros do que para brancos de mesmo perfil</w:t>
+      </w:r>
+      <w:r>
+        <w:rPr>
+          <w:rFonts w:ascii="Arial" w:hAnsi="Arial"/>
+          <w:sz w:val="22"/>
+        </w:rPr>
+        <w:t xml:space="preserve"> </w:t>
+      </w:r>
+      <w:r>
+        <w:rPr>
+          <w:rFonts w:ascii="Arial" w:hAnsi="Arial"/>
+          <w:sz w:val="22"/>
+        </w:rPr>
+        <w:t>e do mesmo bairro</w:t>
       </w:r>
       <w:r>
         <w:rPr>
@@ -34597,21 +34040,21 @@
           <w:rFonts w:ascii="Arial" w:hAnsi="Arial"/>
           <w:sz w:val="22"/>
         </w:rPr>
-        <w:t xml:space="preserve">e</w:t>
-      </w:r>
-      <w:r>
-        <w:rPr>
-          <w:rFonts w:ascii="Arial" w:hAnsi="Arial"/>
-          <w:sz w:val="22"/>
-        </w:rPr>
-        <w:t xml:space="preserve"> </w:t>
-      </w:r>
-      <w:r>
-        <w:rPr>
-          <w:rFonts w:ascii="Arial" w:hAnsi="Arial"/>
-          <w:sz w:val="22"/>
-        </w:rPr>
-        <w:t>com o desfecho para anular o OR; o E-value (IC) faz o mesmo para o limite do intervalo. A coluna logit-FE mostra que a conclusão não depende da hipótese de efeitos aleatórios</w:t>
+        <w:t>e</w:t>
+      </w:r>
+      <w:r>
+        <w:rPr>
+          <w:rFonts w:ascii="Arial" w:hAnsi="Arial"/>
+          <w:sz w:val="22"/>
+        </w:rPr>
+        <w:t xml:space="preserve"> </w:t>
+      </w:r>
+      <w:r>
+        <w:rPr>
+          <w:rFonts w:ascii="Arial" w:hAnsi="Arial"/>
+          <w:sz w:val="22"/>
+        </w:rPr>
+        <w:t xml:space="preserve">com o desfecho para anular o OR; o E-value (IC) faz o mesmo para o limite do intervalo</w:t>
       </w:r>
     </w:p>
     <w:bookmarkEnd w:id="76"/>
@@ -36440,21 +35883,21 @@
           <w:rFonts w:ascii="Arial" w:hAnsi="Arial"/>
           <w:sz w:val="22"/>
         </w:rPr>
-        <w:t xml:space="preserve">(Referência: estrutura de preços</w:t>
-      </w:r>
-      <w:r>
-        <w:rPr>
-          <w:rFonts w:ascii="Arial" w:hAnsi="Arial"/>
-          <w:sz w:val="22"/>
-        </w:rPr>
-        <w:t xml:space="preserve"> </w:t>
-      </w:r>
-      <w:r>
-        <w:rPr>
-          <w:rFonts w:ascii="Arial" w:hAnsi="Arial"/>
-          <w:sz w:val="22"/>
-        </w:rPr>
-        <w:t xml:space="preserve">dos brancos)</w:t>
+        <w:t>(Referência: estrutura de preços</w:t>
+      </w:r>
+      <w:r>
+        <w:rPr>
+          <w:rFonts w:ascii="Arial" w:hAnsi="Arial"/>
+          <w:sz w:val="22"/>
+        </w:rPr>
+        <w:t xml:space="preserve"> </w:t>
+      </w:r>
+      <w:r>
+        <w:rPr>
+          <w:rFonts w:ascii="Arial" w:hAnsi="Arial"/>
+          <w:sz w:val="22"/>
+        </w:rPr>
+        <w:t>dos brancos)</w:t>
       </w:r>
       <w:r>
         <w:rPr>
@@ -36468,7 +35911,7 @@
           <w:rFonts w:ascii="Arial" w:hAnsi="Arial"/>
           <w:sz w:val="22"/>
         </w:rPr>
-        <w:t xml:space="preserve">Mesmos controles da decomposição de Oaxaca–Blinder sem ocupação (escolaridade,</w:t>
+        <w:t>Mesmos controles da decomposição de Oaxaca–Blinder sem ocupação (escolaridade,</w:t>
       </w:r>
       <w:r>
         <w:rPr>
@@ -36496,49 +35939,49 @@
           <w:rFonts w:ascii="Arial" w:hAnsi="Arial"/>
           <w:sz w:val="22"/>
         </w:rPr>
-        <w:t xml:space="preserve">não</w:t>
-      </w:r>
-      <w:r>
-        <w:rPr>
-          <w:rFonts w:ascii="Arial" w:hAnsi="Arial"/>
-          <w:sz w:val="22"/>
-        </w:rPr>
-        <w:t xml:space="preserve"> </w:t>
-      </w:r>
-      <w:r>
-        <w:rPr>
-          <w:rFonts w:ascii="Arial" w:hAnsi="Arial"/>
-          <w:sz w:val="22"/>
-        </w:rPr>
-        <w:t xml:space="preserve">entra.</w:t>
-      </w:r>
-      <w:r>
-        <w:rPr>
-          <w:rFonts w:ascii="Arial" w:hAnsi="Arial"/>
-          <w:sz w:val="22"/>
-        </w:rPr>
-        <w:t xml:space="preserve"> </w:t>
-      </w:r>
-      <w:r>
-        <w:rPr>
-          <w:rFonts w:ascii="Arial" w:hAnsi="Arial"/>
-          <w:sz w:val="22"/>
-        </w:rPr>
-        <w:t xml:space="preserve">Dotações: diferença de características observáveis. Retornos: parcela não explicada, que</w:t>
-      </w:r>
-      <w:r>
-        <w:rPr>
-          <w:rFonts w:ascii="Arial" w:hAnsi="Arial"/>
-          <w:sz w:val="22"/>
-        </w:rPr>
-        <w:t xml:space="preserve"> </w:t>
-      </w:r>
-      <w:r>
-        <w:rPr>
-          <w:rFonts w:ascii="Arial" w:hAnsi="Arial"/>
-          <w:sz w:val="22"/>
-        </w:rPr>
-        <w:t xml:space="preserve">inclui a discriminação e o que não foi observado. Dotações + Retornos</w:t>
+        <w:t>não</w:t>
+      </w:r>
+      <w:r>
+        <w:rPr>
+          <w:rFonts w:ascii="Arial" w:hAnsi="Arial"/>
+          <w:sz w:val="22"/>
+        </w:rPr>
+        <w:t xml:space="preserve"> </w:t>
+      </w:r>
+      <w:r>
+        <w:rPr>
+          <w:rFonts w:ascii="Arial" w:hAnsi="Arial"/>
+          <w:sz w:val="22"/>
+        </w:rPr>
+        <w:t>entra.</w:t>
+      </w:r>
+      <w:r>
+        <w:rPr>
+          <w:rFonts w:ascii="Arial" w:hAnsi="Arial"/>
+          <w:sz w:val="22"/>
+        </w:rPr>
+        <w:t xml:space="preserve"> </w:t>
+      </w:r>
+      <w:r>
+        <w:rPr>
+          <w:rFonts w:ascii="Arial" w:hAnsi="Arial"/>
+          <w:sz w:val="22"/>
+        </w:rPr>
+        <w:t>Dotações: diferença de características observáveis. Retornos: parcela não explicada, que</w:t>
+      </w:r>
+      <w:r>
+        <w:rPr>
+          <w:rFonts w:ascii="Arial" w:hAnsi="Arial"/>
+          <w:sz w:val="22"/>
+        </w:rPr>
+        <w:t xml:space="preserve"> </w:t>
+      </w:r>
+      <w:r>
+        <w:rPr>
+          <w:rFonts w:ascii="Arial" w:hAnsi="Arial"/>
+          <w:sz w:val="22"/>
+        </w:rPr>
+        <w:t>inclui a discriminação e o que não foi observado. Dotações + Retornos</w:t>
       </w:r>
       <w:r>
         <w:rPr>
@@ -36576,21 +36019,21 @@
           <w:rFonts w:ascii="Arial" w:hAnsi="Arial"/>
           <w:sz w:val="22"/>
         </w:rPr>
-        <w:t xml:space="preserve">do gap RIF</w:t>
-      </w:r>
-      <w:r>
-        <w:rPr>
-          <w:rFonts w:ascii="Arial" w:hAnsi="Arial"/>
-          <w:sz w:val="22"/>
-        </w:rPr>
-        <w:t xml:space="preserve"> </w:t>
-      </w:r>
-      <w:r>
-        <w:rPr>
-          <w:rFonts w:ascii="Arial" w:hAnsi="Arial"/>
-          <w:sz w:val="22"/>
-        </w:rPr>
-        <w:t xml:space="preserve">— que é o gap decomposto pelo</w:t>
+        <w:t>do gap RIF</w:t>
+      </w:r>
+      <w:r>
+        <w:rPr>
+          <w:rFonts w:ascii="Arial" w:hAnsi="Arial"/>
+          <w:sz w:val="22"/>
+        </w:rPr>
+        <w:t xml:space="preserve"> </w:t>
+      </w:r>
+      <w:r>
+        <w:rPr>
+          <w:rFonts w:ascii="Arial" w:hAnsi="Arial"/>
+          <w:sz w:val="22"/>
+        </w:rPr>
+        <w:t>— que é o gap decomposto pelo</w:t>
       </w:r>
       <w:r>
         <w:rPr>
@@ -36618,56 +36061,28 @@
           <w:rFonts w:ascii="Arial" w:hAnsi="Arial"/>
           <w:sz w:val="22"/>
         </w:rPr>
-        <w:t xml:space="preserve">são fração daquele, não deste. Padrão</w:t>
-      </w:r>
-      <w:r>
-        <w:rPr>
-          <w:rFonts w:ascii="Arial" w:hAnsi="Arial"/>
-          <w:sz w:val="22"/>
-        </w:rPr>
-        <w:t xml:space="preserve"> </w:t>
-      </w:r>
-      <w:r>
-        <w:rPr>
-          <w:rFonts w:ascii="Arial" w:hAnsi="Arial"/>
-          <w:sz w:val="22"/>
-        </w:rPr>
-        <w:t xml:space="preserve">sticky floor</w:t>
-      </w:r>
-      <w:r>
-        <w:rPr>
-          <w:rFonts w:ascii="Arial" w:hAnsi="Arial"/>
-          <w:sz w:val="22"/>
-        </w:rPr>
-        <w:t xml:space="preserve">: a parcela de retornos</w:t>
-      </w:r>
-      <w:r>
-        <w:rPr>
-          <w:rFonts w:ascii="Arial" w:hAnsi="Arial"/>
-          <w:sz w:val="22"/>
-        </w:rPr>
-        <w:t xml:space="preserve"> </w:t>
-      </w:r>
-      <w:r>
-        <w:rPr>
-          <w:rFonts w:ascii="Arial" w:hAnsi="Arial"/>
-          <w:sz w:val="22"/>
-        </w:rPr>
-        <w:t xml:space="preserve">é maior na base e decresce rumo ao topo. PNAD Contínua 2016–2025,</w:t>
-      </w:r>
-      <w:r>
-        <w:rPr>
-          <w:rFonts w:ascii="Arial" w:hAnsi="Arial"/>
-          <w:sz w:val="22"/>
-        </w:rPr>
-        <w:t xml:space="preserve"> </w:t>
-      </w:r>
-      <w:r>
-        <w:rPr>
-          <w:rFonts w:ascii="Arial" w:hAnsi="Arial"/>
-          <w:sz w:val="22"/>
-        </w:rPr>
-        <w:t xml:space="preserve">população completa. Entre parênteses: erro-padrão por bootstrap em blocos por UPA</w:t>
+        <w:t xml:space="preserve">são fração daquele, não deste. </w:t>
+      </w:r>
+      <w:r>
+        <w:rPr>
+          <w:rFonts w:ascii="Arial" w:hAnsi="Arial"/>
+          <w:sz w:val="22"/>
+        </w:rPr>
+        <w:t>PNAD Contínua 2016–2025,</w:t>
+      </w:r>
+      <w:r>
+        <w:rPr>
+          <w:rFonts w:ascii="Arial" w:hAnsi="Arial"/>
+          <w:sz w:val="22"/>
+        </w:rPr>
+        <w:t xml:space="preserve"> </w:t>
+      </w:r>
+      <w:r>
+        <w:rPr>
+          <w:rFonts w:ascii="Arial" w:hAnsi="Arial"/>
+          <w:sz w:val="22"/>
+        </w:rPr>
+        <w:t>população completa. Entre parênteses: erro-padrão por bootstrap em blocos por UPA</w:t>
       </w:r>
     </w:p>
     <w:p>
@@ -40572,7 +39987,7 @@
           <w:rFonts w:ascii="Arial" w:hAnsi="Arial"/>
           <w:sz w:val="22"/>
         </w:rPr>
-        <w:t xml:space="preserve">Dotações: parcela explicada por</w:t>
+        <w:t>Dotações: parcela explicada por</w:t>
       </w:r>
       <w:r>
         <w:rPr>
@@ -40600,42 +40015,42 @@
           <w:rFonts w:ascii="Arial" w:hAnsi="Arial"/>
           <w:sz w:val="22"/>
         </w:rPr>
-        <w:t xml:space="preserve">a mesma desvantagem em log-pontos, a escala em que os efeitos de raça e de gênero se somam</w:t>
-      </w:r>
-      <w:r>
-        <w:rPr>
-          <w:rFonts w:ascii="Arial" w:hAnsi="Arial"/>
-          <w:sz w:val="22"/>
-        </w:rPr>
-        <w:t xml:space="preserve"> </w:t>
-      </w:r>
-      <w:r>
-        <w:rPr>
-          <w:rFonts w:ascii="Arial" w:hAnsi="Arial"/>
-          <w:sz w:val="22"/>
-        </w:rPr>
-        <w:t xml:space="preserve">(Crenshaw, 1989)</w:t>
-      </w:r>
-      <w:r>
-        <w:rPr>
-          <w:rFonts w:ascii="Arial" w:hAnsi="Arial"/>
-          <w:sz w:val="22"/>
-        </w:rPr>
-        <w:t xml:space="preserve">. PNAD Contínua, população completa</w:t>
-      </w:r>
-      <w:r>
-        <w:rPr>
-          <w:rFonts w:ascii="Arial" w:hAnsi="Arial"/>
-          <w:sz w:val="22"/>
-        </w:rPr>
-        <w:t xml:space="preserve"> </w:t>
-      </w:r>
-      <w:r>
-        <w:rPr>
-          <w:rFonts w:ascii="Arial" w:hAnsi="Arial"/>
-          <w:sz w:val="22"/>
-        </w:rPr>
-        <w:t xml:space="preserve">(</w:t>
+        <w:t>a mesma desvantagem em log-pontos, a escala em que os efeitos de raça e de gênero se somam</w:t>
+      </w:r>
+      <w:r>
+        <w:rPr>
+          <w:rFonts w:ascii="Arial" w:hAnsi="Arial"/>
+          <w:sz w:val="22"/>
+        </w:rPr>
+        <w:t xml:space="preserve"> </w:t>
+      </w:r>
+      <w:r>
+        <w:rPr>
+          <w:rFonts w:ascii="Arial" w:hAnsi="Arial"/>
+          <w:sz w:val="22"/>
+        </w:rPr>
+        <w:t>(Crenshaw, 1989)</w:t>
+      </w:r>
+      <w:r>
+        <w:rPr>
+          <w:rFonts w:ascii="Arial" w:hAnsi="Arial"/>
+          <w:sz w:val="22"/>
+        </w:rPr>
+        <w:t>. PNAD Contínua, população completa</w:t>
+      </w:r>
+      <w:r>
+        <w:rPr>
+          <w:rFonts w:ascii="Arial" w:hAnsi="Arial"/>
+          <w:sz w:val="22"/>
+        </w:rPr>
+        <w:t xml:space="preserve"> </w:t>
+      </w:r>
+      <w:r>
+        <w:rPr>
+          <w:rFonts w:ascii="Arial" w:hAnsi="Arial"/>
+          <w:sz w:val="22"/>
+        </w:rPr>
+        <w:t>(</w:t>
       </w:r>
       <m:oMath>
         <m:r>
@@ -40654,21 +40069,21 @@
           <w:rFonts w:ascii="Arial" w:hAnsi="Arial"/>
           <w:sz w:val="22"/>
         </w:rPr>
-        <w:t xml:space="preserve">do grupo de referência — homens brancos — na última linha da nota). Entre</w:t>
-      </w:r>
-      <w:r>
-        <w:rPr>
-          <w:rFonts w:ascii="Arial" w:hAnsi="Arial"/>
-          <w:sz w:val="22"/>
-        </w:rPr>
-        <w:t xml:space="preserve"> </w:t>
-      </w:r>
-      <w:r>
-        <w:rPr>
-          <w:rFonts w:ascii="Arial" w:hAnsi="Arial"/>
-          <w:sz w:val="22"/>
-        </w:rPr>
-        <w:t xml:space="preserve">parênteses: erro-padrão por bootstrap em blocos por UPA</w:t>
+        <w:t>do grupo de referência — homens brancos — na última linha da nota). Entre</w:t>
+      </w:r>
+      <w:r>
+        <w:rPr>
+          <w:rFonts w:ascii="Arial" w:hAnsi="Arial"/>
+          <w:sz w:val="22"/>
+        </w:rPr>
+        <w:t xml:space="preserve"> </w:t>
+      </w:r>
+      <w:r>
+        <w:rPr>
+          <w:rFonts w:ascii="Arial" w:hAnsi="Arial"/>
+          <w:sz w:val="22"/>
+        </w:rPr>
+        <w:t>parênteses: erro-padrão por bootstrap em blocos por UPA</w:t>
       </w:r>
       <w:r>
         <w:rPr>
@@ -40682,49 +40097,48 @@
           <w:rFonts w:ascii="Arial" w:hAnsi="Arial"/>
           <w:sz w:val="22"/>
         </w:rPr>
-        <w:t xml:space="preserve"/>
-      </w:r>
-      <w:r>
-        <w:rPr>
-          <w:rFonts w:ascii="Arial" w:hAnsi="Arial"/>
-          <w:sz w:val="22"/>
-        </w:rPr>
-        <w:t xml:space="preserve"> </w:t>
-      </w:r>
-      <w:r>
-        <w:rPr>
-          <w:rFonts w:ascii="Arial" w:hAnsi="Arial"/>
-          <w:sz w:val="22"/>
-        </w:rPr>
-        <w:t xml:space="preserve">“Gap vs HB”</w:t>
-      </w:r>
-      <w:r>
-        <w:rPr>
-          <w:rFonts w:ascii="Arial" w:hAnsi="Arial"/>
-          <w:sz w:val="22"/>
-        </w:rPr>
-        <w:t xml:space="preserve"> </w:t>
-      </w:r>
-      <w:r>
-        <w:rPr>
-          <w:rFonts w:ascii="Arial" w:hAnsi="Arial"/>
-          <w:sz w:val="22"/>
-        </w:rPr>
-        <w:t xml:space="preserve">é a desvantagem de renda de cada grupo</w:t>
-      </w:r>
-      <w:r>
-        <w:rPr>
-          <w:rFonts w:ascii="Arial" w:hAnsi="Arial"/>
-          <w:sz w:val="22"/>
-        </w:rPr>
-        <w:t xml:space="preserve"> </w:t>
-      </w:r>
-      <w:r>
-        <w:rPr>
-          <w:rFonts w:ascii="Arial" w:hAnsi="Arial"/>
-          <w:sz w:val="22"/>
-        </w:rPr>
-        <w:t xml:space="preserve">vs.</w:t>
+      </w:r>
+      <w:r>
+        <w:rPr>
+          <w:rFonts w:ascii="Arial" w:hAnsi="Arial"/>
+          <w:sz w:val="22"/>
+        </w:rPr>
+        <w:t xml:space="preserve"> </w:t>
+      </w:r>
+      <w:r>
+        <w:rPr>
+          <w:rFonts w:ascii="Arial" w:hAnsi="Arial"/>
+          <w:sz w:val="22"/>
+        </w:rPr>
+        <w:t>“Gap vs HB”</w:t>
+      </w:r>
+      <w:r>
+        <w:rPr>
+          <w:rFonts w:ascii="Arial" w:hAnsi="Arial"/>
+          <w:sz w:val="22"/>
+        </w:rPr>
+        <w:t xml:space="preserve"> </w:t>
+      </w:r>
+      <w:r>
+        <w:rPr>
+          <w:rFonts w:ascii="Arial" w:hAnsi="Arial"/>
+          <w:sz w:val="22"/>
+        </w:rPr>
+        <w:t>é a desvantagem de renda de cada grupo</w:t>
+      </w:r>
+      <w:r>
+        <w:rPr>
+          <w:rFonts w:ascii="Arial" w:hAnsi="Arial"/>
+          <w:sz w:val="22"/>
+        </w:rPr>
+        <w:t xml:space="preserve"> </w:t>
+      </w:r>
+      <w:r>
+        <w:rPr>
+          <w:rFonts w:ascii="Arial" w:hAnsi="Arial"/>
+          <w:sz w:val="22"/>
+        </w:rPr>
+        <w:t>vs.</w:t>
       </w:r>
       <w:r>
         <w:rPr>
@@ -40760,7 +40174,7 @@
           <w:rFonts w:ascii="Arial" w:hAnsi="Arial"/>
           <w:sz w:val="22"/>
         </w:rPr>
-        <w:t xml:space="preserve">Retornos</w:t>
+        <w:t>Retornos</w:t>
       </w:r>
       <w:r>
         <w:rPr>
@@ -40798,77 +40212,14 @@
           <w:rFonts w:ascii="Arial" w:hAnsi="Arial"/>
           <w:sz w:val="22"/>
         </w:rPr>
-        <w:t xml:space="preserve">do gap. A Mulher Negra tem o</w:t>
-      </w:r>
-      <w:r>
-        <w:rPr>
-          <w:rFonts w:ascii="Arial" w:hAnsi="Arial"/>
-          <w:sz w:val="22"/>
-        </w:rPr>
-        <w:t xml:space="preserve"> </w:t>
-      </w:r>
-      <w:r>
-        <w:rPr>
-          <w:rFonts w:ascii="Arial" w:hAnsi="Arial"/>
-          <w:sz w:val="22"/>
-        </w:rPr>
-        <w:t xml:space="preserve">maior gap. Em log-pontos, o gap da Mulher Negra (0,592) fica abaixo da soma dos gaps da Mulher Branca e do Homem Negro (0,629): as desvantagens de raça e de gênero se acumulam sem se multiplicar — a interação é sub-aditiva, como no modelo de acesso. Somar os percentuais daria a impressão contrária, porque a escala percentual é convexa. O sinal negativo das dotações da Mulher</w:t>
-      </w:r>
-      <w:r>
-        <w:rPr>
-          <w:rFonts w:ascii="Arial" w:hAnsi="Arial"/>
-          <w:sz w:val="22"/>
-        </w:rPr>
-        <w:t xml:space="preserve"> </w:t>
-      </w:r>
-      <w:r>
-        <w:rPr>
-          <w:rFonts w:ascii="Arial" w:hAnsi="Arial"/>
-          <w:sz w:val="22"/>
-        </w:rPr>
-        <w:t xml:space="preserve">Branca indica que suas características observáveis</w:t>
-      </w:r>
-      <w:r>
-        <w:rPr>
-          <w:rFonts w:ascii="Arial" w:hAnsi="Arial"/>
-          <w:sz w:val="22"/>
-        </w:rPr>
-        <w:t xml:space="preserve"> </w:t>
-      </w:r>
-      <w:r>
-        <w:rPr>
-          <w:rFonts w:ascii="Arial" w:hAnsi="Arial"/>
-          <w:sz w:val="22"/>
-        </w:rPr>
-        <w:t xml:space="preserve">superam</w:t>
-      </w:r>
-      <w:r>
-        <w:rPr>
-          <w:rFonts w:ascii="Arial" w:hAnsi="Arial"/>
-          <w:sz w:val="22"/>
-        </w:rPr>
-        <w:t xml:space="preserve"> </w:t>
-      </w:r>
-      <w:r>
-        <w:rPr>
-          <w:rFonts w:ascii="Arial" w:hAnsi="Arial"/>
-          <w:sz w:val="22"/>
-        </w:rPr>
-        <w:t xml:space="preserve">as do homem branco: todo</w:t>
-      </w:r>
-      <w:r>
-        <w:rPr>
-          <w:rFonts w:ascii="Arial" w:hAnsi="Arial"/>
-          <w:sz w:val="22"/>
-        </w:rPr>
-        <w:t xml:space="preserve"> </w:t>
-      </w:r>
-      <w:r>
-        <w:rPr>
-          <w:rFonts w:ascii="Arial" w:hAnsi="Arial"/>
-          <w:sz w:val="22"/>
-        </w:rPr>
-        <w:t xml:space="preserve">o gap vem de retornos diferenciais. Grupo de referência: 1.842.088 homens brancos</w:t>
+        <w:t xml:space="preserve">do gap. </w:t>
+      </w:r>
+      <w:r>
+        <w:rPr>
+          <w:rFonts w:ascii="Arial" w:hAnsi="Arial"/>
+          <w:sz w:val="22"/>
+        </w:rPr>
+        <w:t>Grupo de referência: 1.842.088 homens brancos</w:t>
       </w:r>
     </w:p>
     <w:bookmarkStart w:id="91" w:name="fig:interseccional"/>
@@ -43701,7 +43052,7 @@
           <w:rFonts w:ascii="Arial" w:hAnsi="Arial"/>
           <w:sz w:val="22"/>
         </w:rPr>
-        <w:t>A penalidade cresce com a idade: 1,7% entre 14 e 29 anos, 8,8% entre 50 e 64 e 14,7% a partir dos 65. Dados transversais não separam as duas leituras possíveis: a de ciclo de vida (a desigualdade se acumula ao longo da carreira) é compatível com o teto de vidro; a de coorte, com melhora entre gerações. Acima dos 65 anos, o grupo é selecionado — só quem ainda trabalha — e menor, o que pede cautela com essa estimativa.</w:t>
+        <w:t>A penalidade cresce com a idade: 1,7% entre 14 e 29 anos, 8,8% entre 50 e 64 e 14,7% a partir dos 65. Dados transversais não separam as duas leituras possíveis: a de ciclo de vida (a desigualdade se acumula ao longo da carreira) é compatível com o teto de vidro; a de geração (quem chegou ao mercado mais recentemente encontraria menos discriminação), com melhora ao longo do tempo. Acima dos 65 anos, o grupo é selecionado — só quem ainda trabalha — e menor, o que pede cautela com essa estimativa.</w:t>
       </w:r>
     </w:p>
     <w:bookmarkEnd w:id="95"/>
@@ -55730,7 +55081,7 @@
           <w:rFonts w:ascii="Arial" w:hAnsi="Arial"/>
           <w:sz w:val="22"/>
         </w:rPr>
-        <w:t xml:space="preserve">no privado): a reserva opera na admissão ao serviço público, não no nível da ocupação, e os ocupados incluem coortes anteriores a ela. O que o setor público tem é um teto que pesa bem menos — no décimo mais rico,</w:t>
+        <w:t xml:space="preserve">no privado): a reserva opera na admissão ao serviço público, não no nível da ocupação, e boa parte dos servidores ocupados entrou antes dela. O que o setor público tem é um teto que pesa bem menos — no décimo mais rico,</w:t>
       </w:r>
       <w:r>
         <w:rPr>

</xml_diff>

<commit_message>
data(resultados): entregáveis após o terceiro Relatório de Formatação (06/10/2026)
Norma 31/31, Word 49 páginas, fósseis 0, números sem fonte 0, validate consistente.

Co-Authored-By: Claude Opus 5.5 (1M context) <noreply@anthropic.com>
Claude-Session: https://claude.ai/code/session_01ATPBca6o9jxRv5wGBtSSkf
</commit_message>
<xml_diff>
--- a/entregaveis/TCC_Ricardo_Calheiros_MBA_USP_Esalq.docx
+++ b/entregaveis/TCC_Ricardo_Calheiros_MBA_USP_Esalq.docx
@@ -5173,6 +5173,7 @@
       <w:pPr>
         <w:pStyle w:val="BodyText"/>
         <w:keepNext w:val="0"/>
+        <w:keepLines/>
         <w:spacing w:line="240" w:lineRule="auto" w:before="0" w:after="240"/>
         <w:ind w:firstLine="0"/>
         <w:jc w:val="both"/>
@@ -7782,15 +7783,15 @@
           <w:rFonts w:ascii="Arial" w:hAnsi="Arial"/>
           <w:sz w:val="22"/>
         </w:rPr>
-        <w:t xml:space="preserve">referência não discriminatória:</w:t>
-      </w:r>
-      <w:r>
-        <w:rPr>
-          <w:rFonts w:ascii="Arial" w:hAnsi="Arial"/>
-          <w:sz w:val="22"/>
-        </w:rPr>
-        <w:t xml:space="preserve"> </w:t>
-      </w:r>
+        <w:t xml:space="preserve">referência não discriminatória, conforme a eq. (3):</w:t>
+      </w:r>
+    </w:p>
+    <w:p>
+      <w:pPr>
+        <w:pStyle w:val="BodyText"/>
+        <w:ind w:firstLine="0"/>
+        <w:jc w:val="right"/>
+      </w:pPr>
       <m:oMath>
         <m:r>
           <m:rPr>
@@ -8030,13 +8031,37 @@
           </m:rPr>
           <m:t>)</m:t>
         </m:r>
+        <m:r>
+          <m:t>  </m:t>
+        </m:r>
+        <m:r>
+          <m:rPr>
+            <m:nor/>
+            <m:sty m:val="p"/>
+          </m:rPr>
+          <m:t/>
+        </m:r>
       </m:oMath>
       <w:r>
         <w:rPr>
           <w:rFonts w:ascii="Arial" w:hAnsi="Arial"/>
-          <w:sz w:val="22"/>
-        </w:rPr>
-        <w:t xml:space="preserve">, em que o primeiro termo é a parcela de</w:t>
+        </w:rPr>
+        <w:t xml:space="preserve">   (3)</w:t>
+      </w:r>
+    </w:p>
+    <w:p>
+      <w:pPr>
+        <w:pStyle w:val="FirstParagraph"/>
+        <w:spacing w:line="360" w:lineRule="auto" w:after="0"/>
+        <w:ind w:firstLine="709"/>
+        <w:jc w:val="both"/>
+      </w:pPr>
+      <w:r>
+        <w:rPr>
+          <w:rFonts w:ascii="Arial" w:hAnsi="Arial"/>
+          <w:sz w:val="22"/>
+        </w:rPr>
+        <w:t xml:space="preserve">em que o primeiro termo é a parcela de</w:t>
       </w:r>
       <w:r>
         <w:rPr>
@@ -12120,6 +12145,7 @@
       <w:pPr>
         <w:pStyle w:val="BodyText"/>
         <w:keepNext w:val="0"/>
+        <w:keepLines/>
         <w:spacing w:line="240" w:lineRule="auto" w:before="0" w:after="240"/>
         <w:ind w:firstLine="0"/>
         <w:jc w:val="both"/>
@@ -19030,6 +19056,7 @@
       <w:pPr>
         <w:pStyle w:val="BodyText"/>
         <w:keepNext w:val="0"/>
+        <w:keepLines/>
         <w:spacing w:line="240" w:lineRule="auto" w:before="0" w:after="240"/>
         <w:ind w:firstLine="0"/>
         <w:jc w:val="both"/>
@@ -22376,6 +22403,7 @@
       <w:pPr>
         <w:pStyle w:val="BodyText"/>
         <w:keepNext w:val="0"/>
+        <w:keepLines/>
         <w:spacing w:line="240" w:lineRule="auto" w:before="0" w:after="240"/>
         <w:ind w:firstLine="0"/>
         <w:jc w:val="both"/>
@@ -22862,6 +22890,7 @@
     <w:p>
       <w:pPr>
         <w:pStyle w:val="BodyText"/>
+        <w:keepLines/>
         <w:spacing w:line="240" w:lineRule="auto" w:before="0" w:after="240"/>
         <w:ind w:firstLine="0"/>
         <w:jc w:val="both"/>
@@ -23168,6 +23197,7 @@
     <w:p>
       <w:pPr>
         <w:pStyle w:val="BodyText"/>
+        <w:keepLines/>
         <w:spacing w:line="240" w:lineRule="auto" w:before="0" w:after="240"/>
         <w:ind w:firstLine="0"/>
         <w:jc w:val="both"/>
@@ -24621,6 +24651,7 @@
       <w:pPr>
         <w:pStyle w:val="BodyText"/>
         <w:keepNext w:val="0"/>
+        <w:keepLines/>
         <w:spacing w:line="240" w:lineRule="auto" w:before="0" w:after="240"/>
         <w:ind w:firstLine="0"/>
         <w:jc w:val="both"/>
@@ -25046,6 +25077,7 @@
     <w:p>
       <w:pPr>
         <w:pStyle w:val="BodyText"/>
+        <w:keepLines/>
         <w:spacing w:line="240" w:lineRule="auto" w:before="0" w:after="240"/>
         <w:ind w:firstLine="0"/>
         <w:jc w:val="both"/>
@@ -26179,6 +26211,7 @@
       <w:pPr>
         <w:pStyle w:val="BodyText"/>
         <w:keepNext w:val="0"/>
+        <w:keepLines/>
         <w:spacing w:line="240" w:lineRule="auto" w:before="0" w:after="240"/>
         <w:ind w:firstLine="0"/>
         <w:jc w:val="both"/>
@@ -26845,6 +26878,7 @@
     <w:p>
       <w:pPr>
         <w:pStyle w:val="BodyText"/>
+        <w:keepLines/>
         <w:spacing w:line="240" w:lineRule="auto" w:before="0" w:after="240"/>
         <w:ind w:firstLine="0"/>
         <w:jc w:val="both"/>
@@ -27100,7 +27134,7 @@
         <w:tblW w:type="auto" w:w="0"/>
         <w:tblLayout w:type="fixed"/>
         <w:tblLook w:firstRow="1" w:lastRow="0" w:firstColumn="0" w:lastColumn="0" w:noHBand="0" w:noVBand="0" w:val="0020"/>
-        <w:tblCaption w:val="Tabela 7. GLMM logístico — ajuste e desempenho de classificação por degrau. LR vs. pooled: teste de razão de verossimilhança do A2 contra o logit sem efeito aleatório (fronteira, p/2); AUC com efeitos aleatórios (ajuste na amostra) e só com efeitos fixos; cutoff de Youden (maximiza sensibilidade + especificidade) com as taxas correspondentes; Hosmer–Lemeshow em 10 decis. Modelos A1–A4 como na Tabela 8. Com N = 7{,}7 milhões qualquer desvio de calibração é “significativo” — o \chi^2 deve ser lido como magnitude relativa entre degraus, não como teste (MHE, cap. 8)."/>
+        <w:tblCaption w:val="Tabela 7. GLMM logístico — ajuste e desempenho de classificação por degrau. LR vs. pooled: teste de razão de verossimilhança do A2 contra o logit sem efeito aleatório (fronteira, p/2); AUC com efeitos aleatórios (ajuste na amostra) e só com efeitos fixos; cutoff de Youden (maximiza sensibilidade + especificidade) com as taxas correspondentes; Hosmer–Lemeshow em dez decis. Modelos A1–A4 como na Tabela 8. Com N = 7{,}7 milhões qualquer desvio de calibração é “significativo” — o \chi^2 deve ser lido como magnitude relativa entre degraus, não como teste (MHE, cap. 8)."/>
         <w:tblBorders>
           <w:top w:val="nil"/>
           <w:left w:val="nil"/>
@@ -30127,6 +30161,7 @@
       <w:pPr>
         <w:pStyle w:val="BodyText"/>
         <w:keepNext w:val="0"/>
+        <w:keepLines/>
         <w:spacing w:line="240" w:lineRule="auto" w:before="0" w:after="240"/>
         <w:ind w:firstLine="0"/>
         <w:jc w:val="both"/>
@@ -30228,7 +30263,7 @@
           <w:rFonts w:ascii="Arial" w:hAnsi="Arial"/>
           <w:sz w:val="22"/>
         </w:rPr>
-        <w:t xml:space="preserve">especificidade) com as taxas correspondentes; Hosmer–Lemeshow em 10 decis. Modelos A1–A4 como na Tabela 8</w:t>
+        <w:t xml:space="preserve">especificidade) com as taxas correspondentes; Hosmer–Lemeshow em dez decis. Modelos A1–A4 como na Tabela 8</w:t>
       </w:r>
     </w:p>
     <w:p>
@@ -31044,6 +31079,7 @@
     <w:p>
       <w:pPr>
         <w:pStyle w:val="BodyText"/>
+        <w:keepLines/>
         <w:spacing w:line="240" w:lineRule="auto" w:before="0" w:after="240"/>
         <w:ind w:firstLine="0"/>
         <w:jc w:val="both"/>
@@ -33757,6 +33793,7 @@
       <w:pPr>
         <w:pStyle w:val="BodyText"/>
         <w:keepNext w:val="0"/>
+        <w:keepLines/>
         <w:spacing w:line="240" w:lineRule="auto" w:before="0" w:after="240"/>
         <w:ind w:firstLine="0"/>
         <w:jc w:val="both"/>
@@ -35867,6 +35904,7 @@
       <w:pPr>
         <w:pStyle w:val="BodyText"/>
         <w:keepNext w:val="0"/>
+        <w:keepLines/>
         <w:spacing w:line="240" w:lineRule="auto" w:before="0" w:after="240"/>
         <w:ind w:firstLine="0"/>
         <w:jc w:val="both"/>
@@ -37945,6 +37983,7 @@
       <w:pPr>
         <w:pStyle w:val="BodyText"/>
         <w:keepNext w:val="0"/>
+        <w:keepLines/>
         <w:spacing w:line="240" w:lineRule="auto" w:before="0" w:after="240"/>
         <w:ind w:firstLine="0"/>
         <w:jc w:val="both"/>
@@ -38921,6 +38960,7 @@
     <w:p>
       <w:pPr>
         <w:pStyle w:val="BodyText"/>
+        <w:keepLines/>
         <w:spacing w:line="240" w:lineRule="auto" w:before="0" w:after="240"/>
         <w:ind w:firstLine="0"/>
         <w:jc w:val="both"/>
@@ -39971,6 +40011,7 @@
       <w:pPr>
         <w:pStyle w:val="BodyText"/>
         <w:keepNext w:val="0"/>
+        <w:keepLines/>
         <w:spacing w:line="240" w:lineRule="auto" w:before="0" w:after="240"/>
         <w:ind w:firstLine="0"/>
         <w:jc w:val="both"/>
@@ -40391,6 +40432,7 @@
     <w:p>
       <w:pPr>
         <w:pStyle w:val="BodyText"/>
+        <w:keepLines/>
         <w:spacing w:line="240" w:lineRule="auto" w:before="0" w:after="240"/>
         <w:ind w:firstLine="0"/>
         <w:jc w:val="both"/>
@@ -42671,6 +42713,7 @@
       <w:pPr>
         <w:pStyle w:val="BodyText"/>
         <w:keepNext w:val="0"/>
+        <w:keepLines/>
         <w:spacing w:line="240" w:lineRule="auto" w:before="0" w:after="240"/>
         <w:ind w:firstLine="0"/>
         <w:jc w:val="both"/>
@@ -43828,6 +43871,7 @@
       <w:pPr>
         <w:pStyle w:val="BodyText"/>
         <w:keepNext w:val="0"/>
+        <w:keepLines/>
         <w:spacing w:line="240" w:lineRule="auto" w:before="0" w:after="240"/>
         <w:ind w:firstLine="0"/>
         <w:jc w:val="both"/>
@@ -45492,6 +45536,7 @@
       <w:pPr>
         <w:pStyle w:val="BodyText"/>
         <w:keepNext w:val="0"/>
+        <w:keepLines/>
         <w:spacing w:line="240" w:lineRule="auto" w:before="0" w:after="240"/>
         <w:ind w:firstLine="0"/>
         <w:jc w:val="both"/>
@@ -46170,6 +46215,7 @@
     <w:p>
       <w:pPr>
         <w:pStyle w:val="BodyText"/>
+        <w:keepLines/>
         <w:spacing w:line="240" w:lineRule="auto" w:before="0" w:after="240"/>
         <w:ind w:firstLine="0"/>
         <w:jc w:val="both"/>
@@ -50438,6 +50484,7 @@
       <w:pPr>
         <w:pStyle w:val="BodyText"/>
         <w:keepNext w:val="0"/>
+        <w:keepLines/>
         <w:spacing w:line="240" w:lineRule="auto" w:before="0" w:after="240"/>
         <w:ind w:firstLine="0"/>
         <w:jc w:val="both"/>
@@ -50743,6 +50790,7 @@
     <w:p>
       <w:pPr>
         <w:pStyle w:val="BodyText"/>
+        <w:keepLines/>
         <w:spacing w:line="240" w:lineRule="auto" w:before="0" w:after="240"/>
         <w:ind w:firstLine="0"/>
         <w:jc w:val="both"/>
@@ -52006,6 +52054,7 @@
     <w:p>
       <w:pPr>
         <w:pStyle w:val="BodyText"/>
+        <w:keepLines/>
         <w:spacing w:line="240" w:lineRule="auto" w:before="0" w:after="240"/>
         <w:ind w:firstLine="0"/>
         <w:jc w:val="both"/>
@@ -52181,7 +52230,7 @@
           <w:rFonts w:ascii="Arial" w:hAnsi="Arial"/>
           <w:sz w:val="22"/>
         </w:rPr>
-        <w:t>Nenhum preditor do M4 tem VIF acima de 10; o maior é o de</w:t>
+        <w:t>Nenhum preditor do M4 tem VIF acima de dez; o maior é o de</w:t>
       </w:r>
       <w:r>
         <w:rPr>
@@ -54023,6 +54072,7 @@
     <w:p>
       <w:pPr>
         <w:pStyle w:val="BodyText"/>
+        <w:keepLines/>
         <w:spacing w:line="240" w:lineRule="auto" w:before="0" w:after="240"/>
         <w:ind w:firstLine="0"/>
         <w:jc w:val="both"/>
@@ -55410,28 +55460,63 @@
           <w:rFonts w:ascii="Arial" w:hAnsi="Arial"/>
           <w:sz w:val="22"/>
         </w:rPr>
-        <w:t xml:space="preserve">, com fiscalização dirigida à diferença que persiste dentro da mesma ocupação (5,6%), base que a proibição de práticas discriminatórias e o Estatuto da Igualdade Racial já oferecem</w:t>
-      </w:r>
-      <w:r>
-        <w:rPr>
-          <w:rFonts w:ascii="Arial" w:hAnsi="Arial"/>
-          <w:sz w:val="22"/>
-        </w:rPr>
-        <w:t xml:space="preserve"> </w:t>
-      </w:r>
-      <w:r>
-        <w:rPr>
-          <w:rFonts w:ascii="Arial" w:hAnsi="Arial"/>
-          <w:sz w:val="22"/>
-        </w:rPr>
-        <w:t xml:space="preserve">(Brasil, 1995, 2010)</w:t>
-      </w:r>
-      <w:r>
-        <w:rPr>
-          <w:rFonts w:ascii="Arial" w:hAnsi="Arial"/>
-          <w:sz w:val="22"/>
-        </w:rPr>
-        <w:t xml:space="preserve">.</w:t>
+        <w:t xml:space="preserve">, com fiscalização dirigida à diferença que persiste dentro da mesma ocupação (5,6%), base que a proibição de práticas discriminatórias</w:t>
+      </w:r>
+      <w:r>
+        <w:rPr>
+          <w:rFonts w:ascii="Arial" w:hAnsi="Arial"/>
+          <w:sz w:val="22"/>
+        </w:rPr>
+        <w:t xml:space="preserve"> </w:t>
+      </w:r>
+      <w:r>
+        <w:rPr>
+          <w:rFonts w:ascii="Arial" w:hAnsi="Arial"/>
+          <w:sz w:val="22"/>
+        </w:rPr>
+        <w:t xml:space="preserve">(Brasil, 1995)</w:t>
+      </w:r>
+      <w:r>
+        <w:rPr>
+          <w:rFonts w:ascii="Arial" w:hAnsi="Arial"/>
+          <w:sz w:val="22"/>
+        </w:rPr>
+        <w:t xml:space="preserve"> </w:t>
+      </w:r>
+      <w:r>
+        <w:rPr>
+          <w:rFonts w:ascii="Arial" w:hAnsi="Arial"/>
+          <w:sz w:val="22"/>
+        </w:rPr>
+        <w:t xml:space="preserve">e o Estatuto da Igualdade Racial</w:t>
+      </w:r>
+      <w:r>
+        <w:rPr>
+          <w:rFonts w:ascii="Arial" w:hAnsi="Arial"/>
+          <w:sz w:val="22"/>
+        </w:rPr>
+        <w:t xml:space="preserve"> </w:t>
+      </w:r>
+      <w:r>
+        <w:rPr>
+          <w:rFonts w:ascii="Arial" w:hAnsi="Arial"/>
+          <w:sz w:val="22"/>
+        </w:rPr>
+        <w:t xml:space="preserve">(Brasil, 2010)</w:t>
+      </w:r>
+      <w:r>
+        <w:rPr>
+          <w:rFonts w:ascii="Arial" w:hAnsi="Arial"/>
+          <w:sz w:val="22"/>
+        </w:rPr>
+        <w:t xml:space="preserve"> </w:t>
+      </w:r>
+      <w:r>
+        <w:rPr>
+          <w:rFonts w:ascii="Arial" w:hAnsi="Arial"/>
+          <w:sz w:val="22"/>
+        </w:rPr>
+        <w:t xml:space="preserve">já oferecem.</w:t>
       </w:r>
       <w:r>
         <w:rPr>

</xml_diff>